<commit_message>
Add controlled local package corrections to shared and CSE SOPs
</commit_message>
<xml_diff>
--- a/docs/word-documents/cse_software_stack_sop_v1.docx
+++ b/docs/word-documents/cse_software_stack_sop_v1.docx
@@ -719,6 +719,78 @@
                 <w:sz w:val="20"/>
               </w:rPr>
               <w:t>Sections 6 and 7</w:t>
+            </w:r>
+          </w:p>
+        </w:tc>
+      </w:tr>
+      <w:tr>
+        <w:trPr>
+          <w:cantSplit/>
+        </w:trPr>
+        <w:tc>
+          <w:tcPr>
+            <w:tcW w:type="dxa" w:w="3672"/>
+            <w:vAlign w:val="center"/>
+          </w:tcPr>
+          <w:p>
+            <w:pPr>
+              <w:keepNext w:val="0"/>
+              <w:widowControl w:val="0"/>
+              <w:spacing w:after="0" w:before="0" w:line="250" w:lineRule="auto"/>
+            </w:pPr>
+            <w:r>
+              <w:rPr>
+                <w:b w:val="0"/>
+                <w:i w:val="0"/>
+                <w:sz w:val="20"/>
+              </w:rPr>
+              <w:t>Maintain local package corrections</w:t>
+            </w:r>
+          </w:p>
+        </w:tc>
+        <w:tc>
+          <w:tcPr>
+            <w:tcW w:type="dxa" w:w="4032"/>
+            <w:vAlign w:val="center"/>
+          </w:tcPr>
+          <w:p>
+            <w:pPr>
+              <w:keepNext w:val="0"/>
+              <w:widowControl w:val="0"/>
+              <w:spacing w:after="0" w:before="0" w:line="250" w:lineRule="auto"/>
+            </w:pPr>
+            <w:hyperlink r:id="rId10" w:history="1" w:anchor="procedure_local_corrections">
+              <w:r>
+                <w:rPr>
+                  <w:b w:val="0"/>
+                  <w:i w:val="0"/>
+                  <w:sz w:val="20"/>
+                  <w:color w:val="245A81"/>
+                  <w:u w:val="single"/>
+                </w:rPr>
+                <w:t>Local correction procedure</w:t>
+              </w:r>
+            </w:hyperlink>
+          </w:p>
+        </w:tc>
+        <w:tc>
+          <w:tcPr>
+            <w:tcW w:type="dxa" w:w="2448"/>
+            <w:vAlign w:val="center"/>
+          </w:tcPr>
+          <w:p>
+            <w:pPr>
+              <w:keepNext w:val="0"/>
+              <w:widowControl w:val="0"/>
+              <w:spacing w:after="0" w:before="0" w:line="250" w:lineRule="auto"/>
+            </w:pPr>
+            <w:r>
+              <w:rPr>
+                <w:b w:val="0"/>
+                <w:i w:val="0"/>
+                <w:sz w:val="20"/>
+              </w:rPr>
+              <w:t>Section 7.3</w:t>
             </w:r>
           </w:p>
         </w:tc>
@@ -3730,6 +3802,76 @@
     </w:p>
     <w:p>
       <w:pPr>
+        <w:pStyle w:val="Heading2"/>
+      </w:pPr>
+      <w:r>
+        <w:rPr>
+          <w:b w:val="0"/>
+          <w:i w:val="0"/>
+        </w:rPr>
+        <w:t>7.3 CSE local package corrections</w:t>
+      </w:r>
+    </w:p>
+    <w:p>
+      <w:pPr/>
+      <w:r>
+        <w:rPr>
+          <w:b w:val="0"/>
+          <w:i w:val="0"/>
+        </w:rPr>
+        <w:t xml:space="preserve">CSE may maintain a local recipe or source correction when the approved package and platform combination needs behavior that the pinned upstream recipe set does not provide correctly. Keep the upstream repository at its approved pin; record the correction in a separately versioned local package repository with an explicit namespace and search order. Follow the shared </w:t>
+      </w:r>
+      <w:hyperlink r:id="rId10" w:history="1" w:anchor="procedure_local_corrections">
+        <w:r>
+          <w:rPr>
+            <w:b w:val="0"/>
+            <w:i w:val="0"/>
+            <w:color w:val="245A81"/>
+            <w:u w:val="single"/>
+          </w:rPr>
+          <w:t>local correction procedure</w:t>
+        </w:r>
+      </w:hyperlink>
+      <w:r>
+        <w:rPr>
+          <w:b w:val="0"/>
+          <w:i w:val="0"/>
+        </w:rPr>
+        <w:t>. Package selections and deployment settings remain in their owning configuration under shared procedure Section 4.2.</w:t>
+      </w:r>
+    </w:p>
+    <w:p>
+      <w:pPr/>
+      <w:r>
+        <w:rPr>
+          <w:b w:val="0"/>
+          <w:i w:val="0"/>
+        </w:rPr>
+        <w:t>The build owner retains the original failure, correction rationale, complete recipe and supporting files, applicable versions/compilers/variants, upstream reference or disposition, and affected environment graphs. The independent reviewer examines the local changes and validation evidence under Sections 2.1 and 8.1. This targeted review is part of the candidate's release assessment. Security involvement follows the existing triggers in Section 2.2.</w:t>
+      </w:r>
+    </w:p>
+    <w:p>
+      <w:pPr/>
+      <w:r>
+        <w:rPr>
+          <w:b w:val="0"/>
+          <w:i w:val="0"/>
+        </w:rPr>
+        <w:t>Coordinate changes across every CSE environment that uses the local repository, including shared dependencies and other compiler surfaces. A condition limited to one compiler is not sufficient evidence that every other concrete identity is unchanged. Preserve accepted releases; retain a new candidate input revision, review affected locks, and rebuild and retest the affected dependency closure. Keep the validated repository revision available to another authorized builder and include it in applicable transfer and retention records.</w:t>
+      </w:r>
+    </w:p>
+    <w:p>
+      <w:pPr/>
+      <w:r>
+        <w:rPr>
+          <w:b w:val="0"/>
+          <w:i w:val="0"/>
+        </w:rPr>
+        <w:t>If a supported public catalog selection requires a correction, provide the approved audience with the exact immutable local repository through an authorized accessible source, together with its identity and selection instructions. A restricted internal path is not a usable public dependency. When a later approved upstream baseline includes the correction, assess its equivalence and retire the redundant local change through the same candidate review and validation process.</w:t>
+      </w:r>
+    </w:p>
+    <w:p>
+      <w:pPr>
         <w:pStyle w:val="Heading1"/>
       </w:pPr>
       <w:r>

</xml_diff>

<commit_message>
Add SOP review annotations for applicability and operating effort
</commit_message>
<xml_diff>
--- a/docs/word-documents/cse_software_stack_sop_v1.docx
+++ b/docs/word-documents/cse_software_stack_sop_v1.docx
@@ -337,6 +337,398 @@
         <w:rPr>
           <w:sz w:val="4"/>
         </w:rPr>
+      </w:r>
+    </w:p>
+    <w:p>
+      <w:pPr>
+        <w:pStyle w:val="Heading1"/>
+      </w:pPr>
+      <w:r>
+        <w:rPr>
+          <w:b w:val="0"/>
+          <w:i w:val="0"/>
+        </w:rPr>
+        <w:t>Reviewer guide</w:t>
+      </w:r>
+    </w:p>
+    <w:p>
+      <w:pPr/>
+      <w:r>
+        <w:rPr>
+          <w:b w:val="0"/>
+          <w:i w:val="0"/>
+        </w:rPr>
+        <w:t>The colored labels identify review recommendations about applicability and operating effort. Their text carries the same meaning in black-and-white copies. A note applies only to the controls it names; a section can contain more than one category.</w:t>
+      </w:r>
+    </w:p>
+    <w:tbl>
+      <w:tblPr>
+        <w:tblW w:type="auto" w:w="0"/>
+        <w:jc w:val="center"/>
+        <w:tblLayout w:type="fixed"/>
+        <w:tblLook w:firstColumn="1" w:firstRow="1" w:lastColumn="0" w:lastRow="0" w:noHBand="0" w:noVBand="1" w:val="04A0"/>
+        <w:tblBorders>
+          <w:top w:val="single" w:sz="4" w:color="D9D9D9"/>
+          <w:left w:val="single" w:sz="4" w:color="D9D9D9"/>
+          <w:bottom w:val="single" w:sz="4" w:color="D9D9D9"/>
+          <w:right w:val="single" w:sz="4" w:color="D9D9D9"/>
+          <w:insideH w:val="single" w:sz="4" w:color="D9D9D9"/>
+          <w:insideV w:val="single" w:sz="4" w:color="D9D9D9"/>
+        </w:tblBorders>
+        <w:tblCellMar>
+          <w:top w:w="95" w:type="dxa"/>
+          <w:bottom w:w="95" w:type="dxa"/>
+          <w:left w:w="115" w:type="dxa"/>
+          <w:right w:w="115" w:type="dxa"/>
+        </w:tblCellMar>
+      </w:tblPr>
+      <w:tblGrid>
+        <w:gridCol w:w="3046"/>
+        <w:gridCol w:w="1015"/>
+        <w:gridCol w:w="6091"/>
+      </w:tblGrid>
+      <w:tr>
+        <w:trPr>
+          <w:cantSplit/>
+          <w:tblHeader/>
+        </w:trPr>
+        <w:tc>
+          <w:tcPr>
+            <w:tcW w:type="dxa" w:w="3046"/>
+            <w:vAlign w:val="center"/>
+            <w:shd w:fill="DCE6F1"/>
+          </w:tcPr>
+          <w:p>
+            <w:pPr>
+              <w:keepNext w:val="0"/>
+              <w:widowControl w:val="0"/>
+              <w:spacing w:after="0" w:before="0" w:line="250" w:lineRule="auto"/>
+            </w:pPr>
+            <w:r>
+              <w:rPr>
+                <w:b/>
+                <w:i w:val="0"/>
+                <w:sz w:val="20"/>
+              </w:rPr>
+              <w:t>Review label</w:t>
+            </w:r>
+          </w:p>
+        </w:tc>
+        <w:tc>
+          <w:tcPr>
+            <w:tcW w:type="dxa" w:w="1015"/>
+            <w:vAlign w:val="center"/>
+            <w:shd w:fill="DCE6F1"/>
+          </w:tcPr>
+          <w:p>
+            <w:pPr>
+              <w:keepNext w:val="0"/>
+              <w:widowControl w:val="0"/>
+              <w:spacing w:after="0" w:before="0" w:line="250" w:lineRule="auto"/>
+              <w:jc w:val="center"/>
+            </w:pPr>
+            <w:r>
+              <w:rPr>
+                <w:b/>
+                <w:i w:val="0"/>
+                <w:sz w:val="20"/>
+              </w:rPr>
+              <w:t>Color</w:t>
+            </w:r>
+          </w:p>
+        </w:tc>
+        <w:tc>
+          <w:tcPr>
+            <w:tcW w:type="dxa" w:w="6091"/>
+            <w:vAlign w:val="center"/>
+            <w:shd w:fill="DCE6F1"/>
+          </w:tcPr>
+          <w:p>
+            <w:pPr>
+              <w:keepNext w:val="0"/>
+              <w:widowControl w:val="0"/>
+              <w:spacing w:after="0" w:before="0" w:line="250" w:lineRule="auto"/>
+            </w:pPr>
+            <w:r>
+              <w:rPr>
+                <w:b/>
+                <w:i w:val="0"/>
+                <w:sz w:val="20"/>
+              </w:rPr>
+              <w:t>Meaning for reviewers</w:t>
+            </w:r>
+          </w:p>
+        </w:tc>
+      </w:tr>
+      <w:tr>
+        <w:trPr>
+          <w:cantSplit/>
+        </w:trPr>
+        <w:tc>
+          <w:tcPr>
+            <w:tcW w:type="dxa" w:w="3046"/>
+            <w:vAlign w:val="center"/>
+          </w:tcPr>
+          <w:p>
+            <w:pPr>
+              <w:keepNext w:val="0"/>
+              <w:keepLines/>
+              <w:widowControl w:val="0"/>
+              <w:spacing w:after="0" w:before="0" w:line="250" w:lineRule="auto"/>
+            </w:pPr>
+            <w:r>
+              <w:rPr>
+                <w:b/>
+                <w:i w:val="0"/>
+                <w:color w:val="1D4E89"/>
+                <w:sz w:val="20"/>
+              </w:rPr>
+              <w:t>CORE PRACTICE:</w:t>
+            </w:r>
+            <w:r>
+              <w:rPr>
+                <w:b w:val="0"/>
+                <w:i w:val="0"/>
+                <w:color w:val="000000"/>
+                <w:sz w:val="20"/>
+              </w:rPr>
+              <w:t xml:space="preserve"> retain</w:t>
+            </w:r>
+          </w:p>
+        </w:tc>
+        <w:tc>
+          <w:tcPr>
+            <w:tcW w:type="dxa" w:w="1015"/>
+            <w:vAlign w:val="center"/>
+          </w:tcPr>
+          <w:p>
+            <w:pPr>
+              <w:keepNext w:val="0"/>
+              <w:widowControl w:val="0"/>
+              <w:spacing w:after="0" w:before="0" w:line="250" w:lineRule="auto"/>
+              <w:jc w:val="center"/>
+            </w:pPr>
+            <w:r>
+              <w:rPr>
+                <w:b w:val="0"/>
+                <w:i w:val="0"/>
+                <w:sz w:val="20"/>
+              </w:rPr>
+              <w:t>Blue</w:t>
+            </w:r>
+          </w:p>
+        </w:tc>
+        <w:tc>
+          <w:tcPr>
+            <w:tcW w:type="dxa" w:w="6091"/>
+            <w:vAlign w:val="center"/>
+          </w:tcPr>
+          <w:p>
+            <w:pPr>
+              <w:keepNext w:val="0"/>
+              <w:widowControl w:val="0"/>
+              <w:spacing w:after="0" w:before="0" w:line="250" w:lineRule="auto"/>
+            </w:pPr>
+            <w:r>
+              <w:rPr>
+                <w:b w:val="0"/>
+                <w:i w:val="0"/>
+                <w:sz w:val="20"/>
+              </w:rPr>
+              <w:t>Recommend retaining as the routine build and release baseline, including reproducibility, basic security, technical review, validation, and recovery.</w:t>
+            </w:r>
+          </w:p>
+        </w:tc>
+      </w:tr>
+      <w:tr>
+        <w:trPr>
+          <w:cantSplit/>
+        </w:trPr>
+        <w:tc>
+          <w:tcPr>
+            <w:tcW w:type="dxa" w:w="3046"/>
+            <w:vAlign w:val="center"/>
+          </w:tcPr>
+          <w:p>
+            <w:pPr>
+              <w:keepNext w:val="0"/>
+              <w:keepLines/>
+              <w:widowControl w:val="0"/>
+              <w:spacing w:after="0" w:before="0" w:line="250" w:lineRule="auto"/>
+            </w:pPr>
+            <w:r>
+              <w:rPr>
+                <w:b/>
+                <w:i w:val="0"/>
+                <w:color w:val="8A5200"/>
+                <w:sz w:val="20"/>
+              </w:rPr>
+              <w:t>APPLICABILITY:</w:t>
+            </w:r>
+            <w:r>
+              <w:rPr>
+                <w:b w:val="0"/>
+                <w:i w:val="0"/>
+                <w:color w:val="000000"/>
+                <w:sz w:val="20"/>
+              </w:rPr>
+              <w:t xml:space="preserve"> confirm the trigger</w:t>
+            </w:r>
+          </w:p>
+        </w:tc>
+        <w:tc>
+          <w:tcPr>
+            <w:tcW w:type="dxa" w:w="1015"/>
+            <w:vAlign w:val="center"/>
+          </w:tcPr>
+          <w:p>
+            <w:pPr>
+              <w:keepNext w:val="0"/>
+              <w:widowControl w:val="0"/>
+              <w:spacing w:after="0" w:before="0" w:line="250" w:lineRule="auto"/>
+              <w:jc w:val="center"/>
+            </w:pPr>
+            <w:r>
+              <w:rPr>
+                <w:b w:val="0"/>
+                <w:i w:val="0"/>
+                <w:sz w:val="20"/>
+              </w:rPr>
+              <w:t>Amber</w:t>
+            </w:r>
+          </w:p>
+        </w:tc>
+        <w:tc>
+          <w:tcPr>
+            <w:tcW w:type="dxa" w:w="6091"/>
+            <w:vAlign w:val="center"/>
+          </w:tcPr>
+          <w:p>
+            <w:pPr>
+              <w:keepNext w:val="0"/>
+              <w:widowControl w:val="0"/>
+              <w:spacing w:after="0" w:before="0" w:line="250" w:lineRule="auto"/>
+            </w:pPr>
+            <w:r>
+              <w:rPr>
+                <w:b w:val="0"/>
+                <w:i w:val="0"/>
+                <w:sz w:val="20"/>
+              </w:rPr>
+              <w:t>Apply the named branch when its system, role, transfer, or software condition holds; record when it does not apply. This is not an effort rating.</w:t>
+            </w:r>
+          </w:p>
+        </w:tc>
+      </w:tr>
+      <w:tr>
+        <w:trPr>
+          <w:cantSplit/>
+        </w:trPr>
+        <w:tc>
+          <w:tcPr>
+            <w:tcW w:type="dxa" w:w="3046"/>
+            <w:vAlign w:val="center"/>
+          </w:tcPr>
+          <w:p>
+            <w:pPr>
+              <w:keepNext w:val="0"/>
+              <w:keepLines/>
+              <w:widowControl w:val="0"/>
+              <w:spacing w:after="0" w:before="0" w:line="250" w:lineRule="auto"/>
+            </w:pPr>
+            <w:r>
+              <w:rPr>
+                <w:b/>
+                <w:i w:val="0"/>
+                <w:color w:val="6D3991"/>
+                <w:sz w:val="20"/>
+              </w:rPr>
+              <w:t>ADDED EFFORT:</w:t>
+            </w:r>
+            <w:r>
+              <w:rPr>
+                <w:b w:val="0"/>
+                <w:i w:val="0"/>
+                <w:color w:val="000000"/>
+                <w:sz w:val="20"/>
+              </w:rPr>
+              <w:t xml:space="preserve"> decide scope and ownership</w:t>
+            </w:r>
+          </w:p>
+        </w:tc>
+        <w:tc>
+          <w:tcPr>
+            <w:tcW w:type="dxa" w:w="1015"/>
+            <w:vAlign w:val="center"/>
+          </w:tcPr>
+          <w:p>
+            <w:pPr>
+              <w:keepNext w:val="0"/>
+              <w:widowControl w:val="0"/>
+              <w:spacing w:after="0" w:before="0" w:line="250" w:lineRule="auto"/>
+              <w:jc w:val="center"/>
+            </w:pPr>
+            <w:r>
+              <w:rPr>
+                <w:b w:val="0"/>
+                <w:i w:val="0"/>
+                <w:sz w:val="20"/>
+              </w:rPr>
+              <w:t>Purple</w:t>
+            </w:r>
+          </w:p>
+        </w:tc>
+        <w:tc>
+          <w:tcPr>
+            <w:tcW w:type="dxa" w:w="6091"/>
+            <w:vAlign w:val="center"/>
+          </w:tcPr>
+          <w:p>
+            <w:pPr>
+              <w:keepNext w:val="0"/>
+              <w:widowControl w:val="0"/>
+              <w:spacing w:after="0" w:before="0" w:line="250" w:lineRule="auto"/>
+            </w:pPr>
+            <w:r>
+              <w:rPr>
+                <w:b w:val="0"/>
+                <w:i w:val="0"/>
+                <w:sz w:val="20"/>
+              </w:rPr>
+              <w:t>Examine the named control's infrastructure, specialist support, recurring work, and evidence needs; propose retaining it or revising its scope.</w:t>
+            </w:r>
+          </w:p>
+        </w:tc>
+      </w:tr>
+    </w:tbl>
+    <w:p>
+      <w:pPr>
+        <w:spacing w:after="0" w:before="0" w:line="80" w:lineRule="exact"/>
+      </w:pPr>
+      <w:r>
+        <w:rPr>
+          <w:sz w:val="4"/>
+        </w:rPr>
+      </w:r>
+    </w:p>
+    <w:p>
+      <w:pPr/>
+      <w:r>
+        <w:rPr>
+          <w:b w:val="0"/>
+          <w:i w:val="0"/>
+        </w:rPr>
+        <w:t>These labels do not certify that a control is implemented or approved, change the requirements below, or authorize skipping a required step. Core practices still take staff time; added effort does not mean lower importance. Actual workload depends on available infrastructure, automation, and required coverage.</w:t>
+      </w:r>
+    </w:p>
+    <w:p>
+      <w:pPr/>
+      <w:r>
+        <w:rPr>
+          <w:b w:val="0"/>
+          <w:i w:val="0"/>
+        </w:rPr>
+        <w:t>For a proposed change, record the exact clause, retain/revise/omit recommendation, applicable circumstances, reason, responsible owner, and needed resources. Resolve mandatory site requirements with the responsible authority. Before adopting a changed process, reconcile its requirements, gates, commands, and release records across the shared procedure and applicable team policy. Keep the review decision with the operating baseline; do not leave color as the only record of what was agreed.</w:t>
       </w:r>
     </w:p>
     <w:p>
@@ -1650,6 +2042,27 @@
       </w:r>
     </w:p>
     <w:p>
+      <w:pPr>
+        <w:keepLines/>
+      </w:pPr>
+      <w:r>
+        <w:rPr>
+          <w:b/>
+          <w:i w:val="0"/>
+          <w:color w:val="1D4E89"/>
+        </w:rPr>
+        <w:t>Review note - CORE PRACTICE:</w:t>
+      </w:r>
+      <w:r>
+        <w:rPr>
+          <w:b w:val="0"/>
+          <w:i w:val="0"/>
+          <w:color w:val="000000"/>
+        </w:rPr>
+        <w:t xml:space="preserve"> Retain the builder/reviewer handoff and exact candidate evidence. Allocate review time within the two-person team and name alternate coverage; review need not duplicate the full build.</w:t>
+      </w:r>
+    </w:p>
+    <w:p>
       <w:pPr/>
       <w:r>
         <w:rPr>
@@ -1689,6 +2102,27 @@
           <w:i w:val="0"/>
         </w:rPr>
         <w:t>2.2 Security review and decisions</w:t>
+      </w:r>
+    </w:p>
+    <w:p>
+      <w:pPr>
+        <w:keepLines/>
+      </w:pPr>
+      <w:r>
+        <w:rPr>
+          <w:b/>
+          <w:i w:val="0"/>
+          <w:color w:val="8A5200"/>
+        </w:rPr>
+        <w:t>Review note - APPLICABILITY:</w:t>
+      </w:r>
+      <w:r>
+        <w:rPr>
+          <w:b w:val="0"/>
+          <w:i w:val="0"/>
+          <w:color w:val="000000"/>
+        </w:rPr>
+        <w:t xml:space="preserve"> Involve the responsible security or platform authority for the triggers below. Confirm each trigger and owner without adding a routine security approval for every unchanged package.</w:t>
       </w:r>
     </w:p>
     <w:p>
@@ -2102,6 +2536,27 @@
           <w:i w:val="0"/>
         </w:rPr>
         <w:t>3. Required inputs</w:t>
+      </w:r>
+    </w:p>
+    <w:p>
+      <w:pPr>
+        <w:keepLines/>
+      </w:pPr>
+      <w:r>
+        <w:rPr>
+          <w:b/>
+          <w:i w:val="0"/>
+          <w:color w:val="1D4E89"/>
+        </w:rPr>
+        <w:t>Review note - CORE PRACTICE:</w:t>
+      </w:r>
+      <w:r>
+        <w:rPr>
+          <w:b w:val="0"/>
+          <w:i w:val="0"/>
+          <w:color w:val="000000"/>
+        </w:rPr>
+        <w:t xml:space="preserve"> Retain the actual CSE package, platform, repository, deployment, and release selections. Record security control choices explicitly so the review pair describes the operating baseline consistently.</w:t>
       </w:r>
     </w:p>
     <w:p>
@@ -2596,6 +3051,27 @@
           <w:i w:val="0"/>
         </w:rPr>
         <w:t>4. Storage, access, and Spack runtime</w:t>
+      </w:r>
+    </w:p>
+    <w:p>
+      <w:pPr>
+        <w:keepLines/>
+      </w:pPr>
+      <w:r>
+        <w:rPr>
+          <w:b/>
+          <w:i w:val="0"/>
+          <w:color w:val="1D4E89"/>
+        </w:rPr>
+        <w:t>Review note - CORE PRACTICE:</w:t>
+      </w:r>
+      <w:r>
+        <w:rPr>
+          <w:b w:val="0"/>
+          <w:i w:val="0"/>
+          <w:color w:val="000000"/>
+        </w:rPr>
+        <w:t xml:space="preserve"> Retain controlled shared access, private builder state, pinned tools, and protection of accepted releases. Signing infrastructure has a separate resource decision in Section 10.1.</w:t>
       </w:r>
     </w:p>
     <w:p>
@@ -3344,6 +3820,27 @@
       </w:r>
     </w:p>
     <w:p>
+      <w:pPr>
+        <w:keepLines/>
+      </w:pPr>
+      <w:r>
+        <w:rPr>
+          <w:b/>
+          <w:i w:val="0"/>
+          <w:color w:val="1D4E89"/>
+        </w:rPr>
+        <w:t>Review note - CORE PRACTICE:</w:t>
+      </w:r>
+      <w:r>
+        <w:rPr>
+          <w:b w:val="0"/>
+          <w:i w:val="0"/>
+          <w:color w:val="000000"/>
+        </w:rPr>
+        <w:t xml:space="preserve"> Retain complete environment/configuration inputs and exact locks, including compiler, provider, and deployment choices. Another authorized builder must be able to inspect and use the retained inputs.</w:t>
+      </w:r>
+    </w:p>
+    <w:p>
       <w:pPr/>
       <w:r>
         <w:rPr>
@@ -3813,6 +4310,27 @@
       </w:r>
     </w:p>
     <w:p>
+      <w:pPr>
+        <w:keepLines/>
+      </w:pPr>
+      <w:r>
+        <w:rPr>
+          <w:b/>
+          <w:i w:val="0"/>
+          <w:color w:val="1D4E89"/>
+        </w:rPr>
+        <w:t>Review note - CORE PRACTICE:</w:t>
+      </w:r>
+      <w:r>
+        <w:rPr>
+          <w:b w:val="0"/>
+          <w:i w:val="0"/>
+          <w:color w:val="000000"/>
+        </w:rPr>
+        <w:t xml:space="preserve"> Retain targeted correction records, separately versioned overlays, affected-environment review, and validation. Keeping the upstream pin does not remove the need to record local input changes.</w:t>
+      </w:r>
+    </w:p>
+    <w:p>
       <w:pPr/>
       <w:r>
         <w:rPr>
@@ -3923,6 +4441,48 @@
       </w:r>
     </w:p>
     <w:p>
+      <w:pPr>
+        <w:keepLines/>
+      </w:pPr>
+      <w:r>
+        <w:rPr>
+          <w:b/>
+          <w:i w:val="0"/>
+          <w:color w:val="1D4E89"/>
+        </w:rPr>
+        <w:t>Review note - CORE PRACTICE:</w:t>
+      </w:r>
+      <w:r>
+        <w:rPr>
+          <w:b w:val="0"/>
+          <w:i w:val="0"/>
+          <w:color w:val="000000"/>
+        </w:rPr>
+        <w:t xml:space="preserve"> Retain the dependency inventory, baseline comparison, local recipe review, and independent candidate decision. Keep manual effort focused on changed or risk-relevant inputs.</w:t>
+      </w:r>
+    </w:p>
+    <w:p>
+      <w:pPr>
+        <w:keepLines/>
+      </w:pPr>
+      <w:r>
+        <w:rPr>
+          <w:b/>
+          <w:i w:val="0"/>
+          <w:color w:val="6D3991"/>
+        </w:rPr>
+        <w:t>Review note - ADDED EFFORT:</w:t>
+      </w:r>
+      <w:r>
+        <w:rPr>
+          <w:b w:val="0"/>
+          <w:i w:val="0"/>
+          <w:color w:val="000000"/>
+        </w:rPr>
+        <w:t xml:space="preserve"> Decide scanner/feed ownership, required coverage, findings triage, and any specialist review capacity. These decisions do not replace the technical baseline and change review.</w:t>
+      </w:r>
+    </w:p>
+    <w:p>
       <w:pPr/>
       <w:r>
         <w:rPr>
@@ -3987,6 +4547,27 @@
       </w:r>
     </w:p>
     <w:p>
+      <w:pPr>
+        <w:keepLines/>
+      </w:pPr>
+      <w:r>
+        <w:rPr>
+          <w:b/>
+          <w:i w:val="0"/>
+          <w:color w:val="1D4E89"/>
+        </w:rPr>
+        <w:t>Review note - CORE PRACTICE:</w:t>
+      </w:r>
+      <w:r>
+        <w:rPr>
+          <w:b w:val="0"/>
+          <w:i w:val="0"/>
+          <w:color w:val="000000"/>
+        </w:rPr>
+        <w:t xml:space="preserve"> Retain verified source inputs and their identity so a build can be repeated or handed off. Reuse unchanged content and acquire only missing or changed inputs.</w:t>
+      </w:r>
+    </w:p>
+    <w:p>
       <w:pPr/>
       <w:r>
         <w:rPr>
@@ -4034,6 +4615,27 @@
           <w:i w:val="0"/>
         </w:rPr>
         <w:t>9.2 Systems with limited or no external network access</w:t>
+      </w:r>
+    </w:p>
+    <w:p>
+      <w:pPr>
+        <w:keepLines/>
+      </w:pPr>
+      <w:r>
+        <w:rPr>
+          <w:b/>
+          <w:i w:val="0"/>
+          <w:color w:val="8A5200"/>
+        </w:rPr>
+        <w:t>Review note - APPLICABILITY:</w:t>
+      </w:r>
+      <w:r>
+        <w:rPr>
+          <w:b w:val="0"/>
+          <w:i w:val="0"/>
+          <w:color w:val="000000"/>
+        </w:rPr>
+        <w:t xml:space="preserve"> Use the transfer procedure when the destination cannot retrieve the full input set directly, including partially connected systems. Destination restrictions and any applicable handling rules still govern that transfer.</w:t>
       </w:r>
     </w:p>
     <w:p>
@@ -4307,6 +4909,48 @@
       </w:r>
     </w:p>
     <w:p>
+      <w:pPr>
+        <w:keepLines/>
+      </w:pPr>
+      <w:r>
+        <w:rPr>
+          <w:b/>
+          <w:i w:val="0"/>
+          <w:color w:val="1D4E89"/>
+        </w:rPr>
+        <w:t>Review note - CORE PRACTICE:</w:t>
+      </w:r>
+      <w:r>
+        <w:rPr>
+          <w:b w:val="0"/>
+          <w:i w:val="0"/>
+          <w:color w:val="000000"/>
+        </w:rPr>
+        <w:t xml:space="preserve"> Retain nonprivileged builds, exact candidate inputs, safe concurrency, and software/module/runtime acceptance. The network and security-tool resource decisions below concern specific controls within this section.</w:t>
+      </w:r>
+    </w:p>
+    <w:p>
+      <w:pPr>
+        <w:keepLines/>
+      </w:pPr>
+      <w:r>
+        <w:rPr>
+          <w:b/>
+          <w:i w:val="0"/>
+          <w:color w:val="6D3991"/>
+        </w:rPr>
+        <w:t>Review note - ADDED EFFORT:</w:t>
+      </w:r>
+      <w:r>
+        <w:rPr>
+          <w:b w:val="0"/>
+          <w:i w:val="0"/>
+          <w:color w:val="000000"/>
+        </w:rPr>
+        <w:t xml:space="preserve"> Confirm whether enforced outbound-network denial remains the selected production control, how the system owner implements it, and who verifies it. The current draft requires it until that baseline is revised.</w:t>
+      </w:r>
+    </w:p>
+    <w:p>
       <w:pPr/>
       <w:r>
         <w:rPr>
@@ -4345,13 +4989,65 @@
       </w:r>
     </w:p>
     <w:p>
+      <w:pPr>
+        <w:keepLines/>
+      </w:pPr>
+      <w:r>
+        <w:rPr>
+          <w:b/>
+          <w:i w:val="0"/>
+          <w:color w:val="8A5200"/>
+        </w:rPr>
+        <w:t>Review note - APPLICABILITY:</w:t>
+      </w:r>
+      <w:r>
+        <w:rPr>
+          <w:b w:val="0"/>
+          <w:i w:val="0"/>
+          <w:color w:val="000000"/>
+        </w:rPr>
+        <w:t xml:space="preserve"> Run the tests for each supported language, lane, MPI/fabric/launcher, and GPU combination. Plan native multi-node access when required; omit a branch only when the supported release does not include it.</w:t>
+      </w:r>
+    </w:p>
+    <w:p>
       <w:pPr/>
       <w:r>
         <w:rPr>
           <w:b w:val="0"/>
           <w:i w:val="0"/>
         </w:rPr>
-        <w:t>CSE acceptance covers applicable C/C++/Fortran compile/link/run checks, package runtime behavior, headers/libraries/linkage, numerical correctness and representative performance, clean Serial execution, native multi-node MPI and fabric/launcher behavior, and GPU tests when approved. Select checks and any reused baseline evidence under shared procedure Section 9.3. Apply the recorded security scans and qualified compiler-hardening settings; record failures and exceptions together with functional and performance evidence where relevant. Scans, SBOMs, and successful tests answer different questions.</w:t>
+        <w:t>CSE acceptance covers applicable C/C++/Fortran compile/link/run checks, package runtime behavior, headers/libraries/linkage, numerical correctness and representative performance, clean Serial execution, native multi-node MPI and fabric/launcher behavior, and GPU tests when approved. Select checks and any reused baseline evidence under shared procedure Section 9.3.</w:t>
+      </w:r>
+    </w:p>
+    <w:p>
+      <w:pPr>
+        <w:keepLines/>
+      </w:pPr>
+      <w:r>
+        <w:rPr>
+          <w:b/>
+          <w:i w:val="0"/>
+          <w:color w:val="6D3991"/>
+        </w:rPr>
+        <w:t>Review note - ADDED EFFORT:</w:t>
+      </w:r>
+      <w:r>
+        <w:rPr>
+          <w:b w:val="0"/>
+          <w:i w:val="0"/>
+          <w:color w:val="000000"/>
+        </w:rPr>
+        <w:t xml:space="preserve"> Confirm the scan and hardening scope, test resources, and authority to disposition findings. Functional, numerical, performance, and module evidence remain part of technical acceptance.</w:t>
+      </w:r>
+    </w:p>
+    <w:p>
+      <w:pPr/>
+      <w:r>
+        <w:rPr>
+          <w:b w:val="0"/>
+          <w:i w:val="0"/>
+        </w:rPr>
+        <w:t>Apply the recorded security scans and qualified compiler-hardening settings; record failures and exceptions together with functional and performance evidence where relevant. Scans, SBOMs, and successful tests answer different questions.</w:t>
       </w:r>
     </w:p>
     <w:p>
@@ -4463,6 +5159,48 @@
       </w:r>
     </w:p>
     <w:p>
+      <w:pPr>
+        <w:keepLines/>
+      </w:pPr>
+      <w:r>
+        <w:rPr>
+          <w:b/>
+          <w:i w:val="0"/>
+          <w:color w:val="6D3991"/>
+        </w:rPr>
+        <w:t>Review note - ADDED EFFORT:</w:t>
+      </w:r>
+      <w:r>
+        <w:rPr>
+          <w:b w:val="0"/>
+          <w:i w:val="0"/>
+          <w:color w:val="000000"/>
+        </w:rPr>
+        <w:t xml:space="preserve"> CSE currently selects signed-cache publication. Confirm key custody, signing infrastructure, trust distribution, rotation/recovery, and staff ownership. Any proposed change needs corresponding edits to Sections 9, 10, 12, and 14 and the shared procedure.</w:t>
+      </w:r>
+    </w:p>
+    <w:p>
+      <w:pPr>
+        <w:keepLines/>
+      </w:pPr>
+      <w:r>
+        <w:rPr>
+          <w:b/>
+          <w:i w:val="0"/>
+          <w:color w:val="1D4E89"/>
+        </w:rPr>
+        <w:t>Review note - CORE PRACTICE:</w:t>
+      </w:r>
+      <w:r>
+        <w:rPr>
+          <w:b w:val="0"/>
+          <w:i w:val="0"/>
+          <w:color w:val="000000"/>
+        </w:rPr>
+        <w:t xml:space="preserve"> For the adopted signing method, retain protected private keys, verified public-key fingerprints, and binding of approval to the exact artifacts. Preserve those protections while reviewing infrastructure cost.</w:t>
+      </w:r>
+    </w:p>
+    <w:p>
       <w:pPr/>
       <w:r>
         <w:rPr>
@@ -4523,6 +5261,27 @@
       </w:r>
     </w:p>
     <w:p>
+      <w:pPr>
+        <w:keepLines/>
+      </w:pPr>
+      <w:r>
+        <w:rPr>
+          <w:b/>
+          <w:i w:val="0"/>
+          <w:color w:val="8A5200"/>
+        </w:rPr>
+        <w:t>Review note - APPLICABILITY:</w:t>
+      </w:r>
+      <w:r>
+        <w:rPr>
+          <w:b w:val="0"/>
+          <w:i w:val="0"/>
+          <w:color w:val="000000"/>
+        </w:rPr>
+        <w:t xml:space="preserve"> CSE currently requires catalog publication. Confirm which audience, supported selections, and accessible input locations apply; changing the required release sequence needs a policy revision.</w:t>
+      </w:r>
+    </w:p>
+    <w:p>
       <w:pPr/>
       <w:r>
         <w:rPr>
@@ -4570,6 +5329,27 @@
           <w:i w:val="0"/>
         </w:rPr>
         <w:t>10.3 CSE stack publication</w:t>
+      </w:r>
+    </w:p>
+    <w:p>
+      <w:pPr>
+        <w:keepLines/>
+      </w:pPr>
+      <w:r>
+        <w:rPr>
+          <w:b/>
+          <w:i w:val="0"/>
+          <w:color w:val="1D4E89"/>
+        </w:rPr>
+        <w:t>Review note - CORE PRACTICE:</w:t>
+      </w:r>
+      <w:r>
+        <w:rPr>
+          <w:b w:val="0"/>
+          <w:i w:val="0"/>
+          <w:color w:val="000000"/>
+        </w:rPr>
+        <w:t xml:space="preserve"> Retain exact accepted package identities, a protected publication area, destination validation, and controlled user exposure. The current cache-only method depends on the signing decision in Section 10.1; this note does not change that method.</w:t>
       </w:r>
     </w:p>
     <w:p>
@@ -4675,6 +5455,27 @@
       </w:r>
     </w:p>
     <w:p>
+      <w:pPr>
+        <w:keepLines/>
+      </w:pPr>
+      <w:r>
+        <w:rPr>
+          <w:b/>
+          <w:i w:val="0"/>
+          <w:color w:val="1D4E89"/>
+        </w:rPr>
+        <w:t>Review note - CORE PRACTICE:</w:t>
+      </w:r>
+      <w:r>
+        <w:rPr>
+          <w:b w:val="0"/>
+          <w:i w:val="0"/>
+          <w:color w:val="000000"/>
+        </w:rPr>
+        <w:t xml:space="preserve"> Retain package/dependency and external-component records for support, change impact, and recovery. Distinguish inventory capture from scanner operation and vulnerability findings triage.</w:t>
+      </w:r>
+    </w:p>
+    <w:p>
       <w:pPr/>
       <w:r>
         <w:rPr>
@@ -4694,6 +5495,27 @@
           <w:i w:val="0"/>
         </w:rPr>
         <w:t>11. User access</w:t>
+      </w:r>
+    </w:p>
+    <w:p>
+      <w:pPr>
+        <w:keepLines/>
+      </w:pPr>
+      <w:r>
+        <w:rPr>
+          <w:b/>
+          <w:i w:val="0"/>
+          <w:color w:val="1D4E89"/>
+        </w:rPr>
+        <w:t>Review note - CORE PRACTICE:</w:t>
+      </w:r>
+      <w:r>
+        <w:rPr>
+          <w:b w:val="0"/>
+          <w:i w:val="0"/>
+          <w:color w:val="000000"/>
+        </w:rPr>
+        <w:t xml:space="preserve"> Retain acceptance of the actual compiler, vendor/MPI, lane, and package environment users load. Test supported combinations, conflicts, clean-session behavior, and access from the intended node types.</w:t>
       </w:r>
     </w:p>
     <w:p>
@@ -5078,6 +5900,27 @@
       </w:r>
     </w:p>
     <w:p>
+      <w:pPr>
+        <w:keepLines/>
+      </w:pPr>
+      <w:r>
+        <w:rPr>
+          <w:b/>
+          <w:i w:val="0"/>
+          <w:color w:val="1D4E89"/>
+        </w:rPr>
+        <w:t>Review note - CORE PRACTICE:</w:t>
+      </w:r>
+      <w:r>
+        <w:rPr>
+          <w:b w:val="0"/>
+          <w:i w:val="0"/>
+          <w:color w:val="000000"/>
+        </w:rPr>
+        <w:t xml:space="preserve"> Retain versioned changes, advisory ownership, platform-update impact checks, and replacement/withdrawal capability. Keep the release record current as work happens.</w:t>
+      </w:r>
+    </w:p>
+    <w:p>
       <w:pPr/>
       <w:r>
         <w:rPr>
@@ -5095,6 +5938,27 @@
           <w:i w:val="0"/>
         </w:rPr>
         <w:t>CSE uses the approved support queue as its system of record. Assign advisory ownership to one team member; the other reviews the affected-release assessment and remediation evidence. Include transferred destination releases and their local contacts. Refresh vulnerability/scan intelligence on systems with limited or no external access through the approved update route and record its currency. A missed update or newly discovered finding requires a recorded disposition.</w:t>
+      </w:r>
+    </w:p>
+    <w:p>
+      <w:pPr>
+        <w:keepLines/>
+      </w:pPr>
+      <w:r>
+        <w:rPr>
+          <w:b/>
+          <w:i w:val="0"/>
+          <w:color w:val="6D3991"/>
+        </w:rPr>
+        <w:t>Review note - ADDED EFFORT:</w:t>
+      </w:r>
+      <w:r>
+        <w:rPr>
+          <w:b w:val="0"/>
+          <w:i w:val="0"/>
+          <w:color w:val="000000"/>
+        </w:rPr>
+        <w:t xml:space="preserve"> Review staffing and coverage for the stated response times, recurring advisory/scan updates, and remediation workload. Confirm achievable commitments and applicable site deadlines before adopting revised service targets.</w:t>
       </w:r>
     </w:p>
     <w:p>
@@ -5453,6 +6317,27 @@
       </w:r>
     </w:p>
     <w:p>
+      <w:pPr>
+        <w:keepLines/>
+      </w:pPr>
+      <w:r>
+        <w:rPr>
+          <w:b/>
+          <w:i w:val="0"/>
+          <w:color w:val="1D4E89"/>
+        </w:rPr>
+        <w:t>Review note - CORE PRACTICE:</w:t>
+      </w:r>
+      <w:r>
+        <w:rPr>
+          <w:b w:val="0"/>
+          <w:i w:val="0"/>
+          <w:color w:val="000000"/>
+        </w:rPr>
+        <w:t xml:space="preserve"> Retain recoverable inputs, reviewed evidence, and a usable prior release. Confirm that the stated retention periods, storage capacity, and notification responsibilities are sustainable and meet site requirements.</w:t>
+      </w:r>
+    </w:p>
+    <w:p>
       <w:pPr/>
       <w:r>
         <w:rPr>
@@ -5577,6 +6462,27 @@
           <w:i w:val="0"/>
         </w:rPr>
         <w:t>14. Required release record</w:t>
+      </w:r>
+    </w:p>
+    <w:p>
+      <w:pPr>
+        <w:keepLines/>
+      </w:pPr>
+      <w:r>
+        <w:rPr>
+          <w:b/>
+          <w:i w:val="0"/>
+          <w:color w:val="1D4E89"/>
+        </w:rPr>
+        <w:t>Review note - CORE PRACTICE:</w:t>
+      </w:r>
+      <w:r>
+        <w:rPr>
+          <w:b w:val="0"/>
+          <w:i w:val="0"/>
+          <w:color w:val="000000"/>
+        </w:rPr>
+        <w:t xml:space="preserve"> Retain one auditable CSE release record with exact inputs, corrections, tests, reviewer decision, and published identity. Capture available outputs automatically and keep baseline-specific security evidence with the same record.</w:t>
       </w:r>
     </w:p>
     <w:p>

</xml_diff>

<commit_message>
Refine SOP review layout and add illustrated process figures
</commit_message>
<xml_diff>
--- a/docs/word-documents/cse_software_stack_sop_v1.docx
+++ b/docs/word-documents/cse_software_stack_sop_v1.docx
@@ -37,7 +37,7 @@
       </w:tblPr>
       <w:tblGrid>
         <w:gridCol w:w="2333"/>
-        <w:gridCol w:w="7819"/>
+        <w:gridCol w:w="7603"/>
       </w:tblGrid>
       <w:tr>
         <w:trPr>
@@ -48,7 +48,7 @@
           <w:tcPr>
             <w:tcW w:type="dxa" w:w="2333"/>
             <w:vAlign w:val="center"/>
-            <w:shd w:fill="DCE6F1"/>
+            <w:shd w:fill="EDF2F6"/>
           </w:tcPr>
           <w:p>
             <w:pPr>
@@ -68,9 +68,9 @@
         </w:tc>
         <w:tc>
           <w:tcPr>
-            <w:tcW w:type="dxa" w:w="7819"/>
+            <w:tcW w:type="dxa" w:w="7603"/>
             <w:vAlign w:val="center"/>
-            <w:shd w:fill="DCE6F1"/>
+            <w:shd w:fill="EDF2F6"/>
           </w:tcPr>
           <w:p>
             <w:pPr>
@@ -116,7 +116,7 @@
         </w:tc>
         <w:tc>
           <w:tcPr>
-            <w:tcW w:type="dxa" w:w="7819"/>
+            <w:tcW w:type="dxa" w:w="7603"/>
             <w:vAlign w:val="center"/>
           </w:tcPr>
           <w:p>
@@ -163,7 +163,7 @@
         </w:tc>
         <w:tc>
           <w:tcPr>
-            <w:tcW w:type="dxa" w:w="7819"/>
+            <w:tcW w:type="dxa" w:w="7603"/>
             <w:vAlign w:val="center"/>
           </w:tcPr>
           <w:p>
@@ -210,7 +210,7 @@
         </w:tc>
         <w:tc>
           <w:tcPr>
-            <w:tcW w:type="dxa" w:w="7819"/>
+            <w:tcW w:type="dxa" w:w="7603"/>
             <w:vAlign w:val="center"/>
           </w:tcPr>
           <w:p>
@@ -257,7 +257,7 @@
         </w:tc>
         <w:tc>
           <w:tcPr>
-            <w:tcW w:type="dxa" w:w="7819"/>
+            <w:tcW w:type="dxa" w:w="7603"/>
             <w:vAlign w:val="center"/>
           </w:tcPr>
           <w:p>
@@ -304,7 +304,7 @@
         </w:tc>
         <w:tc>
           <w:tcPr>
-            <w:tcW w:type="dxa" w:w="7819"/>
+            <w:tcW w:type="dxa" w:w="7603"/>
             <w:vAlign w:val="center"/>
           </w:tcPr>
           <w:p>
@@ -348,7 +348,41 @@
           <w:b w:val="0"/>
           <w:i w:val="0"/>
         </w:rPr>
-        <w:t>Reviewer guide</w:t>
+        <w:t>Review priorities</w:t>
+      </w:r>
+    </w:p>
+    <w:p>
+      <w:pPr/>
+      <w:r>
+        <w:rPr>
+          <w:b/>
+          <w:i w:val="0"/>
+        </w:rPr>
+        <w:t>Baseline to retain.</w:t>
+      </w:r>
+      <w:r>
+        <w:rPr>
+          <w:b w:val="0"/>
+          <w:i w:val="0"/>
+        </w:rPr>
+        <w:t xml:space="preserve"> Keep exact CSE input and change records, separately versioned local corrections, verified sources, controlled access, and tested software and modules. Retain the two-person release review and evidence needed for support, rebuilding, and recovery. Review can reuse unchanged baseline evidence without repeating the full build or manually inspecting every package.</w:t>
+      </w:r>
+    </w:p>
+    <w:p>
+      <w:pPr/>
+      <w:r>
+        <w:rPr>
+          <w:b/>
+          <w:i w:val="0"/>
+        </w:rPr>
+        <w:t>Applicability to confirm.</w:t>
+      </w:r>
+      <w:r>
+        <w:rPr>
+          <w:b w:val="0"/>
+          <w:i w:val="0"/>
+        </w:rPr>
+        <w:t xml:space="preserve"> Match transfer procedures and platform tests to the supported systems. Confirm the catalog audience and supported selections; CSE catalog publication remains required. Security involvement follows Section 2.2.</w:t>
       </w:r>
     </w:p>
     <w:p>
@@ -358,7 +392,7 @@
           <w:b w:val="0"/>
           <w:i w:val="0"/>
         </w:rPr>
-        <w:t>The colored labels identify review recommendations about applicability and operating effort. Their text carries the same meaning in black-and-white copies. A note applies only to the controls it names; a section can contain more than one category.</w:t>
+        <w:t>The following controls need explicit scope, ownership, and resource decisions.</w:t>
       </w:r>
     </w:p>
     <w:tbl>
@@ -383,9 +417,9 @@
         </w:tblCellMar>
       </w:tblPr>
       <w:tblGrid>
-        <w:gridCol w:w="3046"/>
-        <w:gridCol w:w="1015"/>
-        <w:gridCol w:w="6091"/>
+        <w:gridCol w:w="2385"/>
+        <w:gridCol w:w="5962"/>
+        <w:gridCol w:w="1590"/>
       </w:tblGrid>
       <w:tr>
         <w:trPr>
@@ -394,9 +428,9 @@
         </w:trPr>
         <w:tc>
           <w:tcPr>
-            <w:tcW w:type="dxa" w:w="3046"/>
+            <w:tcW w:type="dxa" w:w="2385"/>
             <w:vAlign w:val="center"/>
-            <w:shd w:fill="DCE6F1"/>
+            <w:shd w:fill="EDF2F6"/>
           </w:tcPr>
           <w:p>
             <w:pPr>
@@ -410,38 +444,15 @@
                 <w:i w:val="0"/>
                 <w:sz w:val="20"/>
               </w:rPr>
-              <w:t>Review label</w:t>
+              <w:t>Review topic</w:t>
             </w:r>
           </w:p>
         </w:tc>
         <w:tc>
           <w:tcPr>
-            <w:tcW w:type="dxa" w:w="1015"/>
+            <w:tcW w:type="dxa" w:w="5962"/>
             <w:vAlign w:val="center"/>
-            <w:shd w:fill="DCE6F1"/>
-          </w:tcPr>
-          <w:p>
-            <w:pPr>
-              <w:keepNext w:val="0"/>
-              <w:widowControl w:val="0"/>
-              <w:spacing w:after="0" w:before="0" w:line="250" w:lineRule="auto"/>
-              <w:jc w:val="center"/>
-            </w:pPr>
-            <w:r>
-              <w:rPr>
-                <w:b/>
-                <w:i w:val="0"/>
-                <w:sz w:val="20"/>
-              </w:rPr>
-              <w:t>Color</w:t>
-            </w:r>
-          </w:p>
-        </w:tc>
-        <w:tc>
-          <w:tcPr>
-            <w:tcW w:type="dxa" w:w="6091"/>
-            <w:vAlign w:val="center"/>
-            <w:shd w:fill="DCE6F1"/>
+            <w:shd w:fill="EDF2F6"/>
           </w:tcPr>
           <w:p>
             <w:pPr>
@@ -455,7 +466,29 @@
                 <w:i w:val="0"/>
                 <w:sz w:val="20"/>
               </w:rPr>
-              <w:t>Meaning for reviewers</w:t>
+              <w:t>Decision for reviewers</w:t>
+            </w:r>
+          </w:p>
+        </w:tc>
+        <w:tc>
+          <w:tcPr>
+            <w:tcW w:type="dxa" w:w="1590"/>
+            <w:vAlign w:val="center"/>
+            <w:shd w:fill="EDF2F6"/>
+          </w:tcPr>
+          <w:p>
+            <w:pPr>
+              <w:keepNext w:val="0"/>
+              <w:widowControl w:val="0"/>
+              <w:spacing w:after="0" w:before="0" w:line="250" w:lineRule="auto"/>
+            </w:pPr>
+            <w:r>
+              <w:rPr>
+                <w:b/>
+                <w:i w:val="0"/>
+                <w:sz w:val="20"/>
+              </w:rPr>
+              <w:t>CSE sections</w:t>
             </w:r>
           </w:p>
         </w:tc>
@@ -466,61 +499,7 @@
         </w:trPr>
         <w:tc>
           <w:tcPr>
-            <w:tcW w:type="dxa" w:w="3046"/>
-            <w:vAlign w:val="center"/>
-          </w:tcPr>
-          <w:p>
-            <w:pPr>
-              <w:keepNext w:val="0"/>
-              <w:keepLines/>
-              <w:widowControl w:val="0"/>
-              <w:spacing w:after="0" w:before="0" w:line="250" w:lineRule="auto"/>
-            </w:pPr>
-            <w:r>
-              <w:rPr>
-                <w:b/>
-                <w:i w:val="0"/>
-                <w:color w:val="1D4E89"/>
-                <w:sz w:val="20"/>
-              </w:rPr>
-              <w:t>CORE PRACTICE:</w:t>
-            </w:r>
-            <w:r>
-              <w:rPr>
-                <w:b w:val="0"/>
-                <w:i w:val="0"/>
-                <w:color w:val="000000"/>
-                <w:sz w:val="20"/>
-              </w:rPr>
-              <w:t xml:space="preserve"> retain</w:t>
-            </w:r>
-          </w:p>
-        </w:tc>
-        <w:tc>
-          <w:tcPr>
-            <w:tcW w:type="dxa" w:w="1015"/>
-            <w:vAlign w:val="center"/>
-          </w:tcPr>
-          <w:p>
-            <w:pPr>
-              <w:keepNext w:val="0"/>
-              <w:widowControl w:val="0"/>
-              <w:spacing w:after="0" w:before="0" w:line="250" w:lineRule="auto"/>
-              <w:jc w:val="center"/>
-            </w:pPr>
-            <w:r>
-              <w:rPr>
-                <w:b w:val="0"/>
-                <w:i w:val="0"/>
-                <w:sz w:val="20"/>
-              </w:rPr>
-              <w:t>Blue</w:t>
-            </w:r>
-          </w:p>
-        </w:tc>
-        <w:tc>
-          <w:tcPr>
-            <w:tcW w:type="dxa" w:w="6091"/>
+            <w:tcW w:type="dxa" w:w="2385"/>
             <w:vAlign w:val="center"/>
           </w:tcPr>
           <w:p>
@@ -535,72 +514,13 @@
                 <w:i w:val="0"/>
                 <w:sz w:val="20"/>
               </w:rPr>
-              <w:t>Recommend retaining as the routine build and release baseline, including reproducibility, basic security, technical review, validation, and recovery.</w:t>
-            </w:r>
-          </w:p>
-        </w:tc>
-      </w:tr>
-      <w:tr>
-        <w:trPr>
-          <w:cantSplit/>
-        </w:trPr>
-        <w:tc>
-          <w:tcPr>
-            <w:tcW w:type="dxa" w:w="3046"/>
-            <w:vAlign w:val="center"/>
-          </w:tcPr>
-          <w:p>
-            <w:pPr>
-              <w:keepNext w:val="0"/>
-              <w:keepLines/>
-              <w:widowControl w:val="0"/>
-              <w:spacing w:after="0" w:before="0" w:line="250" w:lineRule="auto"/>
-            </w:pPr>
-            <w:r>
-              <w:rPr>
-                <w:b/>
-                <w:i w:val="0"/>
-                <w:color w:val="8A5200"/>
-                <w:sz w:val="20"/>
-              </w:rPr>
-              <w:t>APPLICABILITY:</w:t>
-            </w:r>
-            <w:r>
-              <w:rPr>
-                <w:b w:val="0"/>
-                <w:i w:val="0"/>
-                <w:color w:val="000000"/>
-                <w:sz w:val="20"/>
-              </w:rPr>
-              <w:t xml:space="preserve"> confirm the trigger</w:t>
+              <w:t>Build network boundary</w:t>
             </w:r>
           </w:p>
         </w:tc>
         <w:tc>
           <w:tcPr>
-            <w:tcW w:type="dxa" w:w="1015"/>
-            <w:vAlign w:val="center"/>
-          </w:tcPr>
-          <w:p>
-            <w:pPr>
-              <w:keepNext w:val="0"/>
-              <w:widowControl w:val="0"/>
-              <w:spacing w:after="0" w:before="0" w:line="250" w:lineRule="auto"/>
-              <w:jc w:val="center"/>
-            </w:pPr>
-            <w:r>
-              <w:rPr>
-                <w:b w:val="0"/>
-                <w:i w:val="0"/>
-                <w:sz w:val="20"/>
-              </w:rPr>
-              <w:t>Amber</w:t>
-            </w:r>
-          </w:p>
-        </w:tc>
-        <w:tc>
-          <w:tcPr>
-            <w:tcW w:type="dxa" w:w="6091"/>
+            <w:tcW w:type="dxa" w:w="5962"/>
             <w:vAlign w:val="center"/>
           </w:tcPr>
           <w:p>
@@ -615,72 +535,13 @@
                 <w:i w:val="0"/>
                 <w:sz w:val="20"/>
               </w:rPr>
-              <w:t>Apply the named branch when its system, role, transfer, or software condition holds; record when it does not apply. This is not an effort rating.</w:t>
-            </w:r>
-          </w:p>
-        </w:tc>
-      </w:tr>
-      <w:tr>
-        <w:trPr>
-          <w:cantSplit/>
-        </w:trPr>
-        <w:tc>
-          <w:tcPr>
-            <w:tcW w:type="dxa" w:w="3046"/>
-            <w:vAlign w:val="center"/>
-          </w:tcPr>
-          <w:p>
-            <w:pPr>
-              <w:keepNext w:val="0"/>
-              <w:keepLines/>
-              <w:widowControl w:val="0"/>
-              <w:spacing w:after="0" w:before="0" w:line="250" w:lineRule="auto"/>
-            </w:pPr>
-            <w:r>
-              <w:rPr>
-                <w:b/>
-                <w:i w:val="0"/>
-                <w:color w:val="6D3991"/>
-                <w:sz w:val="20"/>
-              </w:rPr>
-              <w:t>ADDED EFFORT:</w:t>
-            </w:r>
-            <w:r>
-              <w:rPr>
-                <w:b w:val="0"/>
-                <w:i w:val="0"/>
-                <w:color w:val="000000"/>
-                <w:sz w:val="20"/>
-              </w:rPr>
-              <w:t xml:space="preserve"> decide scope and ownership</w:t>
+              <w:t>Platform enforcement, responsible owner, and verification of outbound-network denial</w:t>
             </w:r>
           </w:p>
         </w:tc>
         <w:tc>
           <w:tcPr>
-            <w:tcW w:type="dxa" w:w="1015"/>
-            <w:vAlign w:val="center"/>
-          </w:tcPr>
-          <w:p>
-            <w:pPr>
-              <w:keepNext w:val="0"/>
-              <w:widowControl w:val="0"/>
-              <w:spacing w:after="0" w:before="0" w:line="250" w:lineRule="auto"/>
-              <w:jc w:val="center"/>
-            </w:pPr>
-            <w:r>
-              <w:rPr>
-                <w:b w:val="0"/>
-                <w:i w:val="0"/>
-                <w:sz w:val="20"/>
-              </w:rPr>
-              <w:t>Purple</w:t>
-            </w:r>
-          </w:p>
-        </w:tc>
-        <w:tc>
-          <w:tcPr>
-            <w:tcW w:type="dxa" w:w="6091"/>
+            <w:tcW w:type="dxa" w:w="1590"/>
             <w:vAlign w:val="center"/>
           </w:tcPr>
           <w:p>
@@ -695,7 +556,211 @@
                 <w:i w:val="0"/>
                 <w:sz w:val="20"/>
               </w:rPr>
-              <w:t>Examine the named control's infrastructure, specialist support, recurring work, and evidence needs; propose retaining it or revising its scope.</w:t>
+              <w:t>9.3</w:t>
+            </w:r>
+          </w:p>
+        </w:tc>
+      </w:tr>
+      <w:tr>
+        <w:trPr>
+          <w:cantSplit/>
+        </w:trPr>
+        <w:tc>
+          <w:tcPr>
+            <w:tcW w:type="dxa" w:w="2385"/>
+            <w:vAlign w:val="center"/>
+          </w:tcPr>
+          <w:p>
+            <w:pPr>
+              <w:keepNext w:val="0"/>
+              <w:widowControl w:val="0"/>
+              <w:spacing w:after="0" w:before="0" w:line="250" w:lineRule="auto"/>
+            </w:pPr>
+            <w:r>
+              <w:rPr>
+                <w:b w:val="0"/>
+                <w:i w:val="0"/>
+                <w:sz w:val="20"/>
+              </w:rPr>
+              <w:t>Scanning and hardening</w:t>
+            </w:r>
+          </w:p>
+        </w:tc>
+        <w:tc>
+          <w:tcPr>
+            <w:tcW w:type="dxa" w:w="5962"/>
+            <w:vAlign w:val="center"/>
+          </w:tcPr>
+          <w:p>
+            <w:pPr>
+              <w:keepNext w:val="0"/>
+              <w:widowControl w:val="0"/>
+              <w:spacing w:after="0" w:before="0" w:line="250" w:lineRule="auto"/>
+            </w:pPr>
+            <w:r>
+              <w:rPr>
+                <w:b w:val="0"/>
+                <w:i w:val="0"/>
+                <w:sz w:val="20"/>
+              </w:rPr>
+              <w:t>Tools and feeds, coverage, findings handling, and numerical and performance testing capacity</w:t>
+            </w:r>
+          </w:p>
+        </w:tc>
+        <w:tc>
+          <w:tcPr>
+            <w:tcW w:type="dxa" w:w="1590"/>
+            <w:vAlign w:val="center"/>
+          </w:tcPr>
+          <w:p>
+            <w:pPr>
+              <w:keepNext w:val="0"/>
+              <w:widowControl w:val="0"/>
+              <w:spacing w:after="0" w:before="0" w:line="250" w:lineRule="auto"/>
+            </w:pPr>
+            <w:r>
+              <w:rPr>
+                <w:b w:val="0"/>
+                <w:i w:val="0"/>
+                <w:sz w:val="20"/>
+              </w:rPr>
+              <w:t>8.1, 9.3</w:t>
+            </w:r>
+          </w:p>
+        </w:tc>
+      </w:tr>
+      <w:tr>
+        <w:trPr>
+          <w:cantSplit/>
+        </w:trPr>
+        <w:tc>
+          <w:tcPr>
+            <w:tcW w:type="dxa" w:w="2385"/>
+            <w:vAlign w:val="center"/>
+          </w:tcPr>
+          <w:p>
+            <w:pPr>
+              <w:keepNext w:val="0"/>
+              <w:widowControl w:val="0"/>
+              <w:spacing w:after="0" w:before="0" w:line="250" w:lineRule="auto"/>
+            </w:pPr>
+            <w:r>
+              <w:rPr>
+                <w:b w:val="0"/>
+                <w:i w:val="0"/>
+                <w:sz w:val="20"/>
+              </w:rPr>
+              <w:t>Signing and cache publication</w:t>
+            </w:r>
+          </w:p>
+        </w:tc>
+        <w:tc>
+          <w:tcPr>
+            <w:tcW w:type="dxa" w:w="5962"/>
+            <w:vAlign w:val="center"/>
+          </w:tcPr>
+          <w:p>
+            <w:pPr>
+              <w:keepNext w:val="0"/>
+              <w:widowControl w:val="0"/>
+              <w:spacing w:after="0" w:before="0" w:line="250" w:lineRule="auto"/>
+            </w:pPr>
+            <w:r>
+              <w:rPr>
+                <w:b w:val="0"/>
+                <w:i w:val="0"/>
+                <w:sz w:val="20"/>
+              </w:rPr>
+              <w:t>Key custody, signing context, trust distribution, rotation, and recovery support</w:t>
+            </w:r>
+          </w:p>
+        </w:tc>
+        <w:tc>
+          <w:tcPr>
+            <w:tcW w:type="dxa" w:w="1590"/>
+            <w:vAlign w:val="center"/>
+          </w:tcPr>
+          <w:p>
+            <w:pPr>
+              <w:keepNext w:val="0"/>
+              <w:widowControl w:val="0"/>
+              <w:spacing w:after="0" w:before="0" w:line="250" w:lineRule="auto"/>
+            </w:pPr>
+            <w:r>
+              <w:rPr>
+                <w:b w:val="0"/>
+                <w:i w:val="0"/>
+                <w:sz w:val="20"/>
+              </w:rPr>
+              <w:t>10.1–10.3</w:t>
+            </w:r>
+          </w:p>
+        </w:tc>
+      </w:tr>
+      <w:tr>
+        <w:trPr>
+          <w:cantSplit/>
+        </w:trPr>
+        <w:tc>
+          <w:tcPr>
+            <w:tcW w:type="dxa" w:w="2385"/>
+            <w:vAlign w:val="center"/>
+          </w:tcPr>
+          <w:p>
+            <w:pPr>
+              <w:keepNext w:val="0"/>
+              <w:widowControl w:val="0"/>
+              <w:spacing w:after="0" w:before="0" w:line="250" w:lineRule="auto"/>
+            </w:pPr>
+            <w:r>
+              <w:rPr>
+                <w:b w:val="0"/>
+                <w:i w:val="0"/>
+                <w:sz w:val="20"/>
+              </w:rPr>
+              <w:t>Continuing support</w:t>
+            </w:r>
+          </w:p>
+        </w:tc>
+        <w:tc>
+          <w:tcPr>
+            <w:tcW w:type="dxa" w:w="5962"/>
+            <w:vAlign w:val="center"/>
+          </w:tcPr>
+          <w:p>
+            <w:pPr>
+              <w:keepNext w:val="0"/>
+              <w:widowControl w:val="0"/>
+              <w:spacing w:after="0" w:before="0" w:line="250" w:lineRule="auto"/>
+            </w:pPr>
+            <w:r>
+              <w:rPr>
+                <w:b w:val="0"/>
+                <w:i w:val="0"/>
+                <w:sz w:val="20"/>
+              </w:rPr>
+              <w:t>Staffing for response targets, advisory updates, retention, and recovery</w:t>
+            </w:r>
+          </w:p>
+        </w:tc>
+        <w:tc>
+          <w:tcPr>
+            <w:tcW w:type="dxa" w:w="1590"/>
+            <w:vAlign w:val="center"/>
+          </w:tcPr>
+          <w:p>
+            <w:pPr>
+              <w:keepNext w:val="0"/>
+              <w:widowControl w:val="0"/>
+              <w:spacing w:after="0" w:before="0" w:line="250" w:lineRule="auto"/>
+            </w:pPr>
+            <w:r>
+              <w:rPr>
+                <w:b w:val="0"/>
+                <w:i w:val="0"/>
+                <w:sz w:val="20"/>
+              </w:rPr>
+              <w:t>12–14</w:t>
             </w:r>
           </w:p>
         </w:tc>
@@ -718,17 +783,7 @@
           <w:b w:val="0"/>
           <w:i w:val="0"/>
         </w:rPr>
-        <w:t>These labels do not certify that a control is implemented or approved, change the requirements below, or authorize skipping a required step. Core practices still take staff time; added effort does not mean lower importance. Actual workload depends on available infrastructure, automation, and required coverage.</w:t>
-      </w:r>
-    </w:p>
-    <w:p>
-      <w:pPr/>
-      <w:r>
-        <w:rPr>
-          <w:b w:val="0"/>
-          <w:i w:val="0"/>
-        </w:rPr>
-        <w:t>For a proposed change, record the exact clause, retain/revise/omit recommendation, applicable circumstances, reason, responsible owner, and needed resources. Resolve mandatory site requirements with the responsible authority. Before adopting a changed process, reconcile its requirements, gates, commands, and release records across the shared procedure and applicable team policy. Keep the review decision with the operating baseline; do not leave color as the only record of what was agreed.</w:t>
+        <w:t>The current draft requires restricted builds and signed, cache-only publication. For a proposed change, record the clause, rationale, owner, and resources, then align this SOP and the shared procedure before adoption. Applicable site requirements still govern. Inclusion in this draft does not certify that a control has been implemented.</w:t>
       </w:r>
     </w:p>
     <w:p>
@@ -835,9 +890,9 @@
         </w:tblCellMar>
       </w:tblPr>
       <w:tblGrid>
-        <w:gridCol w:w="3672"/>
-        <w:gridCol w:w="4032"/>
-        <w:gridCol w:w="2448"/>
+        <w:gridCol w:w="3594"/>
+        <w:gridCol w:w="3946"/>
+        <w:gridCol w:w="2396"/>
       </w:tblGrid>
       <w:tr>
         <w:trPr>
@@ -846,9 +901,9 @@
         </w:trPr>
         <w:tc>
           <w:tcPr>
-            <w:tcW w:type="dxa" w:w="3672"/>
+            <w:tcW w:type="dxa" w:w="3594"/>
             <w:vAlign w:val="center"/>
-            <w:shd w:fill="DCE6F1"/>
+            <w:shd w:fill="EDF2F6"/>
           </w:tcPr>
           <w:p>
             <w:pPr>
@@ -868,9 +923,9 @@
         </w:tc>
         <w:tc>
           <w:tcPr>
-            <w:tcW w:type="dxa" w:w="4032"/>
+            <w:tcW w:type="dxa" w:w="3946"/>
             <w:vAlign w:val="center"/>
-            <w:shd w:fill="DCE6F1"/>
+            <w:shd w:fill="EDF2F6"/>
           </w:tcPr>
           <w:p>
             <w:pPr>
@@ -890,9 +945,9 @@
         </w:tc>
         <w:tc>
           <w:tcPr>
-            <w:tcW w:type="dxa" w:w="2448"/>
+            <w:tcW w:type="dxa" w:w="2396"/>
             <w:vAlign w:val="center"/>
-            <w:shd w:fill="DCE6F1"/>
+            <w:shd w:fill="EDF2F6"/>
           </w:tcPr>
           <w:p>
             <w:pPr>
@@ -917,7 +972,7 @@
         </w:trPr>
         <w:tc>
           <w:tcPr>
-            <w:tcW w:type="dxa" w:w="3672"/>
+            <w:tcW w:type="dxa" w:w="3594"/>
             <w:vAlign w:val="center"/>
           </w:tcPr>
           <w:p>
@@ -938,7 +993,7 @@
         </w:tc>
         <w:tc>
           <w:tcPr>
-            <w:tcW w:type="dxa" w:w="4032"/>
+            <w:tcW w:type="dxa" w:w="3946"/>
             <w:vAlign w:val="center"/>
           </w:tcPr>
           <w:p>
@@ -959,7 +1014,7 @@
         </w:tc>
         <w:tc>
           <w:tcPr>
-            <w:tcW w:type="dxa" w:w="2448"/>
+            <w:tcW w:type="dxa" w:w="2396"/>
             <w:vAlign w:val="center"/>
           </w:tcPr>
           <w:p>
@@ -985,7 +1040,7 @@
         </w:trPr>
         <w:tc>
           <w:tcPr>
-            <w:tcW w:type="dxa" w:w="3672"/>
+            <w:tcW w:type="dxa" w:w="3594"/>
             <w:vAlign w:val="center"/>
           </w:tcPr>
           <w:p>
@@ -1006,7 +1061,7 @@
         </w:tc>
         <w:tc>
           <w:tcPr>
-            <w:tcW w:type="dxa" w:w="4032"/>
+            <w:tcW w:type="dxa" w:w="3946"/>
             <w:vAlign w:val="center"/>
           </w:tcPr>
           <w:p>
@@ -1027,7 +1082,7 @@
         </w:tc>
         <w:tc>
           <w:tcPr>
-            <w:tcW w:type="dxa" w:w="2448"/>
+            <w:tcW w:type="dxa" w:w="2396"/>
             <w:vAlign w:val="center"/>
           </w:tcPr>
           <w:p>
@@ -1053,7 +1108,7 @@
         </w:trPr>
         <w:tc>
           <w:tcPr>
-            <w:tcW w:type="dxa" w:w="3672"/>
+            <w:tcW w:type="dxa" w:w="3594"/>
             <w:vAlign w:val="center"/>
           </w:tcPr>
           <w:p>
@@ -1074,7 +1129,7 @@
         </w:tc>
         <w:tc>
           <w:tcPr>
-            <w:tcW w:type="dxa" w:w="4032"/>
+            <w:tcW w:type="dxa" w:w="3946"/>
             <w:vAlign w:val="center"/>
           </w:tcPr>
           <w:p>
@@ -1095,7 +1150,7 @@
         </w:tc>
         <w:tc>
           <w:tcPr>
-            <w:tcW w:type="dxa" w:w="2448"/>
+            <w:tcW w:type="dxa" w:w="2396"/>
             <w:vAlign w:val="center"/>
           </w:tcPr>
           <w:p>
@@ -1121,7 +1176,7 @@
         </w:trPr>
         <w:tc>
           <w:tcPr>
-            <w:tcW w:type="dxa" w:w="3672"/>
+            <w:tcW w:type="dxa" w:w="3594"/>
             <w:vAlign w:val="center"/>
           </w:tcPr>
           <w:p>
@@ -1142,7 +1197,7 @@
         </w:tc>
         <w:tc>
           <w:tcPr>
-            <w:tcW w:type="dxa" w:w="4032"/>
+            <w:tcW w:type="dxa" w:w="3946"/>
             <w:vAlign w:val="center"/>
           </w:tcPr>
           <w:p>
@@ -1167,7 +1222,7 @@
         </w:tc>
         <w:tc>
           <w:tcPr>
-            <w:tcW w:type="dxa" w:w="2448"/>
+            <w:tcW w:type="dxa" w:w="2396"/>
             <w:vAlign w:val="center"/>
           </w:tcPr>
           <w:p>
@@ -1193,7 +1248,7 @@
         </w:trPr>
         <w:tc>
           <w:tcPr>
-            <w:tcW w:type="dxa" w:w="3672"/>
+            <w:tcW w:type="dxa" w:w="3594"/>
             <w:vAlign w:val="center"/>
           </w:tcPr>
           <w:p>
@@ -1214,7 +1269,7 @@
         </w:tc>
         <w:tc>
           <w:tcPr>
-            <w:tcW w:type="dxa" w:w="4032"/>
+            <w:tcW w:type="dxa" w:w="3946"/>
             <w:vAlign w:val="center"/>
           </w:tcPr>
           <w:p>
@@ -1239,7 +1294,7 @@
         </w:tc>
         <w:tc>
           <w:tcPr>
-            <w:tcW w:type="dxa" w:w="2448"/>
+            <w:tcW w:type="dxa" w:w="2396"/>
             <w:vAlign w:val="center"/>
           </w:tcPr>
           <w:p>
@@ -1265,7 +1320,7 @@
         </w:trPr>
         <w:tc>
           <w:tcPr>
-            <w:tcW w:type="dxa" w:w="3672"/>
+            <w:tcW w:type="dxa" w:w="3594"/>
             <w:vAlign w:val="center"/>
           </w:tcPr>
           <w:p>
@@ -1286,7 +1341,7 @@
         </w:tc>
         <w:tc>
           <w:tcPr>
-            <w:tcW w:type="dxa" w:w="4032"/>
+            <w:tcW w:type="dxa" w:w="3946"/>
             <w:vAlign w:val="center"/>
           </w:tcPr>
           <w:p>
@@ -1311,7 +1366,7 @@
         </w:tc>
         <w:tc>
           <w:tcPr>
-            <w:tcW w:type="dxa" w:w="2448"/>
+            <w:tcW w:type="dxa" w:w="2396"/>
             <w:vAlign w:val="center"/>
           </w:tcPr>
           <w:p>
@@ -1337,7 +1392,7 @@
         </w:trPr>
         <w:tc>
           <w:tcPr>
-            <w:tcW w:type="dxa" w:w="3672"/>
+            <w:tcW w:type="dxa" w:w="3594"/>
             <w:vAlign w:val="center"/>
           </w:tcPr>
           <w:p>
@@ -1358,7 +1413,7 @@
         </w:tc>
         <w:tc>
           <w:tcPr>
-            <w:tcW w:type="dxa" w:w="4032"/>
+            <w:tcW w:type="dxa" w:w="3946"/>
             <w:vAlign w:val="center"/>
           </w:tcPr>
           <w:p>
@@ -1383,7 +1438,7 @@
         </w:tc>
         <w:tc>
           <w:tcPr>
-            <w:tcW w:type="dxa" w:w="2448"/>
+            <w:tcW w:type="dxa" w:w="2396"/>
             <w:vAlign w:val="center"/>
           </w:tcPr>
           <w:p>
@@ -1409,7 +1464,7 @@
         </w:trPr>
         <w:tc>
           <w:tcPr>
-            <w:tcW w:type="dxa" w:w="3672"/>
+            <w:tcW w:type="dxa" w:w="3594"/>
             <w:vAlign w:val="center"/>
           </w:tcPr>
           <w:p>
@@ -1430,7 +1485,7 @@
         </w:tc>
         <w:tc>
           <w:tcPr>
-            <w:tcW w:type="dxa" w:w="4032"/>
+            <w:tcW w:type="dxa" w:w="3946"/>
             <w:vAlign w:val="center"/>
           </w:tcPr>
           <w:p>
@@ -1455,7 +1510,7 @@
         </w:tc>
         <w:tc>
           <w:tcPr>
-            <w:tcW w:type="dxa" w:w="2448"/>
+            <w:tcW w:type="dxa" w:w="2396"/>
             <w:vAlign w:val="center"/>
           </w:tcPr>
           <w:p>
@@ -1481,7 +1536,7 @@
         </w:trPr>
         <w:tc>
           <w:tcPr>
-            <w:tcW w:type="dxa" w:w="3672"/>
+            <w:tcW w:type="dxa" w:w="3594"/>
             <w:vAlign w:val="center"/>
           </w:tcPr>
           <w:p>
@@ -1502,7 +1557,7 @@
         </w:tc>
         <w:tc>
           <w:tcPr>
-            <w:tcW w:type="dxa" w:w="4032"/>
+            <w:tcW w:type="dxa" w:w="3946"/>
             <w:vAlign w:val="center"/>
           </w:tcPr>
           <w:p>
@@ -1567,7 +1622,7 @@
         </w:tc>
         <w:tc>
           <w:tcPr>
-            <w:tcW w:type="dxa" w:w="2448"/>
+            <w:tcW w:type="dxa" w:w="2396"/>
             <w:vAlign w:val="center"/>
           </w:tcPr>
           <w:p>
@@ -1593,7 +1648,7 @@
         </w:trPr>
         <w:tc>
           <w:tcPr>
-            <w:tcW w:type="dxa" w:w="3672"/>
+            <w:tcW w:type="dxa" w:w="3594"/>
             <w:vAlign w:val="center"/>
           </w:tcPr>
           <w:p>
@@ -1614,7 +1669,7 @@
         </w:tc>
         <w:tc>
           <w:tcPr>
-            <w:tcW w:type="dxa" w:w="4032"/>
+            <w:tcW w:type="dxa" w:w="3946"/>
             <w:vAlign w:val="center"/>
           </w:tcPr>
           <w:p>
@@ -1635,7 +1690,7 @@
         </w:tc>
         <w:tc>
           <w:tcPr>
-            <w:tcW w:type="dxa" w:w="2448"/>
+            <w:tcW w:type="dxa" w:w="2396"/>
             <w:vAlign w:val="center"/>
           </w:tcPr>
           <w:p>
@@ -1721,7 +1776,7 @@
       </w:tblPr>
       <w:tblGrid>
         <w:gridCol w:w="2333"/>
-        <w:gridCol w:w="7819"/>
+        <w:gridCol w:w="7603"/>
       </w:tblGrid>
       <w:tr>
         <w:trPr>
@@ -1732,7 +1787,7 @@
           <w:tcPr>
             <w:tcW w:type="dxa" w:w="2333"/>
             <w:vAlign w:val="center"/>
-            <w:shd w:fill="DCE6F1"/>
+            <w:shd w:fill="EDF2F6"/>
           </w:tcPr>
           <w:p>
             <w:pPr>
@@ -1752,9 +1807,9 @@
         </w:tc>
         <w:tc>
           <w:tcPr>
-            <w:tcW w:type="dxa" w:w="7819"/>
+            <w:tcW w:type="dxa" w:w="7603"/>
             <w:vAlign w:val="center"/>
-            <w:shd w:fill="DCE6F1"/>
+            <w:shd w:fill="EDF2F6"/>
           </w:tcPr>
           <w:p>
             <w:pPr>
@@ -1800,7 +1855,7 @@
         </w:tc>
         <w:tc>
           <w:tcPr>
-            <w:tcW w:type="dxa" w:w="7819"/>
+            <w:tcW w:type="dxa" w:w="7603"/>
             <w:vAlign w:val="center"/>
           </w:tcPr>
           <w:p>
@@ -1847,7 +1902,7 @@
         </w:tc>
         <w:tc>
           <w:tcPr>
-            <w:tcW w:type="dxa" w:w="7819"/>
+            <w:tcW w:type="dxa" w:w="7603"/>
             <w:vAlign w:val="center"/>
           </w:tcPr>
           <w:p>
@@ -1894,7 +1949,7 @@
         </w:tc>
         <w:tc>
           <w:tcPr>
-            <w:tcW w:type="dxa" w:w="7819"/>
+            <w:tcW w:type="dxa" w:w="7603"/>
             <w:vAlign w:val="center"/>
           </w:tcPr>
           <w:p>
@@ -1941,7 +1996,7 @@
         </w:tc>
         <w:tc>
           <w:tcPr>
-            <w:tcW w:type="dxa" w:w="7819"/>
+            <w:tcW w:type="dxa" w:w="7603"/>
             <w:vAlign w:val="center"/>
           </w:tcPr>
           <w:p>
@@ -1988,7 +2043,7 @@
         </w:tc>
         <w:tc>
           <w:tcPr>
-            <w:tcW w:type="dxa" w:w="7819"/>
+            <w:tcW w:type="dxa" w:w="7603"/>
             <w:vAlign w:val="center"/>
           </w:tcPr>
           <w:p>
@@ -2043,23 +2098,56 @@
     </w:p>
     <w:p>
       <w:pPr>
+        <w:keepNext/>
         <w:keepLines/>
+        <w:spacing w:before="140" w:after="0"/>
+        <w:jc w:val="center"/>
       </w:pPr>
       <w:r>
-        <w:rPr>
-          <w:b/>
-          <w:i w:val="0"/>
-          <w:color w:val="1D4E89"/>
-        </w:rPr>
-        <w:t>Review note - CORE PRACTICE:</w:t>
+        <w:drawing>
+          <wp:inline xmlns:a="http://schemas.openxmlformats.org/drawingml/2006/main" xmlns:pic="http://schemas.openxmlformats.org/drawingml/2006/picture">
+            <wp:extent cx="6309360" cy="3154680"/>
+            <wp:docPr id="1" name="Picture 1" descr="CSE release ownership from a builder preparing and validating a candidate to independent review, controlled signing, catalog publication, cache-only installation, destination acceptance, and authorized user exposure." title="cse-release-ownership"/>
+            <wp:cNvGraphicFramePr>
+              <a:graphicFrameLocks noChangeAspect="1"/>
+            </wp:cNvGraphicFramePr>
+            <a:graphic>
+              <a:graphicData uri="http://schemas.openxmlformats.org/drawingml/2006/picture">
+                <pic:pic>
+                  <pic:nvPicPr>
+                    <pic:cNvPr id="0" name="cse-release-ownership.png"/>
+                    <pic:cNvPicPr/>
+                  </pic:nvPicPr>
+                  <pic:blipFill>
+                    <a:blip r:embed="rId11"/>
+                    <a:stretch>
+                      <a:fillRect/>
+                    </a:stretch>
+                  </pic:blipFill>
+                  <pic:spPr>
+                    <a:xfrm>
+                      <a:off x="0" y="0"/>
+                      <a:ext cx="6309360" cy="3154680"/>
+                    </a:xfrm>
+                    <a:prstGeom prst="rect"/>
+                  </pic:spPr>
+                </pic:pic>
+              </a:graphicData>
+            </a:graphic>
+          </wp:inline>
+        </w:drawing>
       </w:r>
+    </w:p>
+    <w:p>
+      <w:pPr>
+        <w:pStyle w:val="Caption"/>
+      </w:pPr>
       <w:r>
         <w:rPr>
           <w:b w:val="0"/>
           <w:i w:val="0"/>
-          <w:color w:val="000000"/>
         </w:rPr>
-        <w:t xml:space="preserve"> Retain the builder/reviewer handoff and exact candidate evidence. Allocate review time within the two-person team and name alternate coverage; review need not duplicate the full build.</w:t>
+        <w:t>Figure 1. CSE review and release handoff. The technical reviewer may also act as delegated release authority and perform signing in its separate controlled context. Sections 9 and 10 define the validation and publication requirements.</w:t>
       </w:r>
     </w:p>
     <w:p>
@@ -2105,27 +2193,6 @@
       </w:r>
     </w:p>
     <w:p>
-      <w:pPr>
-        <w:keepLines/>
-      </w:pPr>
-      <w:r>
-        <w:rPr>
-          <w:b/>
-          <w:i w:val="0"/>
-          <w:color w:val="8A5200"/>
-        </w:rPr>
-        <w:t>Review note - APPLICABILITY:</w:t>
-      </w:r>
-      <w:r>
-        <w:rPr>
-          <w:b w:val="0"/>
-          <w:i w:val="0"/>
-          <w:color w:val="000000"/>
-        </w:rPr>
-        <w:t xml:space="preserve"> Involve the responsible security or platform authority for the triggers below. Confirm each trigger and owner without adding a routine security approval for every unchanged package.</w:t>
-      </w:r>
-    </w:p>
-    <w:p>
       <w:pPr/>
       <w:r>
         <w:rPr>
@@ -2157,9 +2224,9 @@
         </w:tblCellMar>
       </w:tblPr>
       <w:tblGrid>
-        <w:gridCol w:w="3456"/>
-        <w:gridCol w:w="3744"/>
-        <w:gridCol w:w="2952"/>
+        <w:gridCol w:w="3382"/>
+        <w:gridCol w:w="3664"/>
+        <w:gridCol w:w="2889"/>
       </w:tblGrid>
       <w:tr>
         <w:trPr>
@@ -2168,9 +2235,9 @@
         </w:trPr>
         <w:tc>
           <w:tcPr>
-            <w:tcW w:type="dxa" w:w="3456"/>
+            <w:tcW w:type="dxa" w:w="3382"/>
             <w:vAlign w:val="center"/>
-            <w:shd w:fill="DCE6F1"/>
+            <w:shd w:fill="EDF2F6"/>
           </w:tcPr>
           <w:p>
             <w:pPr>
@@ -2190,9 +2257,9 @@
         </w:tc>
         <w:tc>
           <w:tcPr>
-            <w:tcW w:type="dxa" w:w="3744"/>
+            <w:tcW w:type="dxa" w:w="3664"/>
             <w:vAlign w:val="center"/>
-            <w:shd w:fill="DCE6F1"/>
+            <w:shd w:fill="EDF2F6"/>
           </w:tcPr>
           <w:p>
             <w:pPr>
@@ -2212,9 +2279,9 @@
         </w:tc>
         <w:tc>
           <w:tcPr>
-            <w:tcW w:type="dxa" w:w="2952"/>
+            <w:tcW w:type="dxa" w:w="2889"/>
             <w:vAlign w:val="center"/>
-            <w:shd w:fill="DCE6F1"/>
+            <w:shd w:fill="EDF2F6"/>
           </w:tcPr>
           <w:p>
             <w:pPr>
@@ -2239,7 +2306,7 @@
         </w:trPr>
         <w:tc>
           <w:tcPr>
-            <w:tcW w:type="dxa" w:w="3456"/>
+            <w:tcW w:type="dxa" w:w="3382"/>
             <w:vAlign w:val="center"/>
           </w:tcPr>
           <w:p>
@@ -2260,7 +2327,7 @@
         </w:tc>
         <w:tc>
           <w:tcPr>
-            <w:tcW w:type="dxa" w:w="3744"/>
+            <w:tcW w:type="dxa" w:w="3664"/>
             <w:vAlign w:val="center"/>
           </w:tcPr>
           <w:p>
@@ -2281,7 +2348,7 @@
         </w:tc>
         <w:tc>
           <w:tcPr>
-            <w:tcW w:type="dxa" w:w="2952"/>
+            <w:tcW w:type="dxa" w:w="2889"/>
             <w:vAlign w:val="center"/>
           </w:tcPr>
           <w:p>
@@ -2307,7 +2374,7 @@
         </w:trPr>
         <w:tc>
           <w:tcPr>
-            <w:tcW w:type="dxa" w:w="3456"/>
+            <w:tcW w:type="dxa" w:w="3382"/>
             <w:vAlign w:val="center"/>
           </w:tcPr>
           <w:p>
@@ -2328,7 +2395,7 @@
         </w:tc>
         <w:tc>
           <w:tcPr>
-            <w:tcW w:type="dxa" w:w="3744"/>
+            <w:tcW w:type="dxa" w:w="3664"/>
             <w:vAlign w:val="center"/>
           </w:tcPr>
           <w:p>
@@ -2349,7 +2416,7 @@
         </w:tc>
         <w:tc>
           <w:tcPr>
-            <w:tcW w:type="dxa" w:w="2952"/>
+            <w:tcW w:type="dxa" w:w="2889"/>
             <w:vAlign w:val="center"/>
           </w:tcPr>
           <w:p>
@@ -2375,7 +2442,7 @@
         </w:trPr>
         <w:tc>
           <w:tcPr>
-            <w:tcW w:type="dxa" w:w="3456"/>
+            <w:tcW w:type="dxa" w:w="3382"/>
             <w:vAlign w:val="center"/>
           </w:tcPr>
           <w:p>
@@ -2396,7 +2463,7 @@
         </w:tc>
         <w:tc>
           <w:tcPr>
-            <w:tcW w:type="dxa" w:w="3744"/>
+            <w:tcW w:type="dxa" w:w="3664"/>
             <w:vAlign w:val="center"/>
           </w:tcPr>
           <w:p>
@@ -2417,7 +2484,7 @@
         </w:tc>
         <w:tc>
           <w:tcPr>
-            <w:tcW w:type="dxa" w:w="2952"/>
+            <w:tcW w:type="dxa" w:w="2889"/>
             <w:vAlign w:val="center"/>
           </w:tcPr>
           <w:p>
@@ -2443,7 +2510,7 @@
         </w:trPr>
         <w:tc>
           <w:tcPr>
-            <w:tcW w:type="dxa" w:w="3456"/>
+            <w:tcW w:type="dxa" w:w="3382"/>
             <w:vAlign w:val="center"/>
           </w:tcPr>
           <w:p>
@@ -2464,7 +2531,7 @@
         </w:tc>
         <w:tc>
           <w:tcPr>
-            <w:tcW w:type="dxa" w:w="3744"/>
+            <w:tcW w:type="dxa" w:w="3664"/>
             <w:vAlign w:val="center"/>
           </w:tcPr>
           <w:p>
@@ -2485,7 +2552,7 @@
         </w:tc>
         <w:tc>
           <w:tcPr>
-            <w:tcW w:type="dxa" w:w="2952"/>
+            <w:tcW w:type="dxa" w:w="2889"/>
             <w:vAlign w:val="center"/>
           </w:tcPr>
           <w:p>
@@ -2539,27 +2606,6 @@
       </w:r>
     </w:p>
     <w:p>
-      <w:pPr>
-        <w:keepLines/>
-      </w:pPr>
-      <w:r>
-        <w:rPr>
-          <w:b/>
-          <w:i w:val="0"/>
-          <w:color w:val="1D4E89"/>
-        </w:rPr>
-        <w:t>Review note - CORE PRACTICE:</w:t>
-      </w:r>
-      <w:r>
-        <w:rPr>
-          <w:b w:val="0"/>
-          <w:i w:val="0"/>
-          <w:color w:val="000000"/>
-        </w:rPr>
-        <w:t xml:space="preserve"> Retain the actual CSE package, platform, repository, deployment, and release selections. Record security control choices explicitly so the review pair describes the operating baseline consistently.</w:t>
-      </w:r>
-    </w:p>
-    <w:p>
       <w:pPr/>
       <w:r>
         <w:rPr>
@@ -2592,7 +2638,7 @@
       </w:tblPr>
       <w:tblGrid>
         <w:gridCol w:w="2333"/>
-        <w:gridCol w:w="7819"/>
+        <w:gridCol w:w="7603"/>
       </w:tblGrid>
       <w:tr>
         <w:trPr>
@@ -2603,7 +2649,7 @@
           <w:tcPr>
             <w:tcW w:type="dxa" w:w="2333"/>
             <w:vAlign w:val="center"/>
-            <w:shd w:fill="DCE6F1"/>
+            <w:shd w:fill="EDF2F6"/>
           </w:tcPr>
           <w:p>
             <w:pPr>
@@ -2623,9 +2669,9 @@
         </w:tc>
         <w:tc>
           <w:tcPr>
-            <w:tcW w:type="dxa" w:w="7819"/>
+            <w:tcW w:type="dxa" w:w="7603"/>
             <w:vAlign w:val="center"/>
-            <w:shd w:fill="DCE6F1"/>
+            <w:shd w:fill="EDF2F6"/>
           </w:tcPr>
           <w:p>
             <w:pPr>
@@ -2671,7 +2717,7 @@
         </w:tc>
         <w:tc>
           <w:tcPr>
-            <w:tcW w:type="dxa" w:w="7819"/>
+            <w:tcW w:type="dxa" w:w="7603"/>
             <w:vAlign w:val="center"/>
           </w:tcPr>
           <w:p>
@@ -2718,7 +2764,7 @@
         </w:tc>
         <w:tc>
           <w:tcPr>
-            <w:tcW w:type="dxa" w:w="7819"/>
+            <w:tcW w:type="dxa" w:w="7603"/>
             <w:vAlign w:val="center"/>
           </w:tcPr>
           <w:p>
@@ -2765,7 +2811,7 @@
         </w:tc>
         <w:tc>
           <w:tcPr>
-            <w:tcW w:type="dxa" w:w="7819"/>
+            <w:tcW w:type="dxa" w:w="7603"/>
             <w:vAlign w:val="center"/>
           </w:tcPr>
           <w:p>
@@ -2812,7 +2858,7 @@
         </w:tc>
         <w:tc>
           <w:tcPr>
-            <w:tcW w:type="dxa" w:w="7819"/>
+            <w:tcW w:type="dxa" w:w="7603"/>
             <w:vAlign w:val="center"/>
           </w:tcPr>
           <w:p>
@@ -2859,7 +2905,7 @@
         </w:tc>
         <w:tc>
           <w:tcPr>
-            <w:tcW w:type="dxa" w:w="7819"/>
+            <w:tcW w:type="dxa" w:w="7603"/>
             <w:vAlign w:val="center"/>
           </w:tcPr>
           <w:p>
@@ -2906,7 +2952,7 @@
         </w:tc>
         <w:tc>
           <w:tcPr>
-            <w:tcW w:type="dxa" w:w="7819"/>
+            <w:tcW w:type="dxa" w:w="7603"/>
             <w:vAlign w:val="center"/>
           </w:tcPr>
           <w:p>
@@ -2953,7 +2999,7 @@
         </w:tc>
         <w:tc>
           <w:tcPr>
-            <w:tcW w:type="dxa" w:w="7819"/>
+            <w:tcW w:type="dxa" w:w="7603"/>
             <w:vAlign w:val="center"/>
           </w:tcPr>
           <w:p>
@@ -3000,7 +3046,7 @@
         </w:tc>
         <w:tc>
           <w:tcPr>
-            <w:tcW w:type="dxa" w:w="7819"/>
+            <w:tcW w:type="dxa" w:w="7603"/>
             <w:vAlign w:val="center"/>
           </w:tcPr>
           <w:p>
@@ -3051,27 +3097,6 @@
           <w:i w:val="0"/>
         </w:rPr>
         <w:t>4. Storage, access, and Spack runtime</w:t>
-      </w:r>
-    </w:p>
-    <w:p>
-      <w:pPr>
-        <w:keepLines/>
-      </w:pPr>
-      <w:r>
-        <w:rPr>
-          <w:b/>
-          <w:i w:val="0"/>
-          <w:color w:val="1D4E89"/>
-        </w:rPr>
-        <w:t>Review note - CORE PRACTICE:</w:t>
-      </w:r>
-      <w:r>
-        <w:rPr>
-          <w:b w:val="0"/>
-          <w:i w:val="0"/>
-          <w:color w:val="000000"/>
-        </w:rPr>
-        <w:t xml:space="preserve"> Retain controlled shared access, private builder state, pinned tools, and protection of accepted releases. Signing infrastructure has a separate resource decision in Section 10.1.</w:t>
       </w:r>
     </w:p>
     <w:p>
@@ -3167,7 +3192,7 @@
       </w:tblPr>
       <w:tblGrid>
         <w:gridCol w:w="2333"/>
-        <w:gridCol w:w="7819"/>
+        <w:gridCol w:w="7603"/>
       </w:tblGrid>
       <w:tr>
         <w:trPr>
@@ -3178,7 +3203,7 @@
           <w:tcPr>
             <w:tcW w:type="dxa" w:w="2333"/>
             <w:vAlign w:val="center"/>
-            <w:shd w:fill="DCE6F1"/>
+            <w:shd w:fill="EDF2F6"/>
           </w:tcPr>
           <w:p>
             <w:pPr>
@@ -3198,9 +3223,9 @@
         </w:tc>
         <w:tc>
           <w:tcPr>
-            <w:tcW w:type="dxa" w:w="7819"/>
+            <w:tcW w:type="dxa" w:w="7603"/>
             <w:vAlign w:val="center"/>
-            <w:shd w:fill="DCE6F1"/>
+            <w:shd w:fill="EDF2F6"/>
           </w:tcPr>
           <w:p>
             <w:pPr>
@@ -3246,7 +3271,7 @@
         </w:tc>
         <w:tc>
           <w:tcPr>
-            <w:tcW w:type="dxa" w:w="7819"/>
+            <w:tcW w:type="dxa" w:w="7603"/>
             <w:vAlign w:val="center"/>
           </w:tcPr>
           <w:p>
@@ -3344,7 +3369,7 @@
         </w:tc>
         <w:tc>
           <w:tcPr>
-            <w:tcW w:type="dxa" w:w="7819"/>
+            <w:tcW w:type="dxa" w:w="7603"/>
             <w:vAlign w:val="center"/>
           </w:tcPr>
           <w:p>
@@ -3391,7 +3416,7 @@
         </w:tc>
         <w:tc>
           <w:tcPr>
-            <w:tcW w:type="dxa" w:w="7819"/>
+            <w:tcW w:type="dxa" w:w="7603"/>
             <w:vAlign w:val="center"/>
           </w:tcPr>
           <w:p>
@@ -3438,7 +3463,7 @@
         </w:tc>
         <w:tc>
           <w:tcPr>
-            <w:tcW w:type="dxa" w:w="7819"/>
+            <w:tcW w:type="dxa" w:w="7603"/>
             <w:vAlign w:val="center"/>
           </w:tcPr>
           <w:p>
@@ -3485,7 +3510,7 @@
         </w:tc>
         <w:tc>
           <w:tcPr>
-            <w:tcW w:type="dxa" w:w="7819"/>
+            <w:tcW w:type="dxa" w:w="7603"/>
             <w:vAlign w:val="center"/>
           </w:tcPr>
           <w:p>
@@ -3532,7 +3557,7 @@
         </w:tc>
         <w:tc>
           <w:tcPr>
-            <w:tcW w:type="dxa" w:w="7819"/>
+            <w:tcW w:type="dxa" w:w="7603"/>
             <w:vAlign w:val="center"/>
           </w:tcPr>
           <w:p>
@@ -3579,7 +3604,7 @@
         </w:tc>
         <w:tc>
           <w:tcPr>
-            <w:tcW w:type="dxa" w:w="7819"/>
+            <w:tcW w:type="dxa" w:w="7603"/>
             <w:vAlign w:val="center"/>
           </w:tcPr>
           <w:p>
@@ -3820,27 +3845,6 @@
       </w:r>
     </w:p>
     <w:p>
-      <w:pPr>
-        <w:keepLines/>
-      </w:pPr>
-      <w:r>
-        <w:rPr>
-          <w:b/>
-          <w:i w:val="0"/>
-          <w:color w:val="1D4E89"/>
-        </w:rPr>
-        <w:t>Review note - CORE PRACTICE:</w:t>
-      </w:r>
-      <w:r>
-        <w:rPr>
-          <w:b w:val="0"/>
-          <w:i w:val="0"/>
-          <w:color w:val="000000"/>
-        </w:rPr>
-        <w:t xml:space="preserve"> Retain complete environment/configuration inputs and exact locks, including compiler, provider, and deployment choices. Another authorized builder must be able to inspect and use the retained inputs.</w:t>
-      </w:r>
-    </w:p>
-    <w:p>
       <w:pPr/>
       <w:r>
         <w:rPr>
@@ -3895,7 +3899,7 @@
       </w:tblPr>
       <w:tblGrid>
         <w:gridCol w:w="2333"/>
-        <w:gridCol w:w="7819"/>
+        <w:gridCol w:w="7603"/>
       </w:tblGrid>
       <w:tr>
         <w:trPr>
@@ -3906,7 +3910,7 @@
           <w:tcPr>
             <w:tcW w:type="dxa" w:w="2333"/>
             <w:vAlign w:val="center"/>
-            <w:shd w:fill="DCE6F1"/>
+            <w:shd w:fill="EDF2F6"/>
           </w:tcPr>
           <w:p>
             <w:pPr>
@@ -3926,9 +3930,9 @@
         </w:tc>
         <w:tc>
           <w:tcPr>
-            <w:tcW w:type="dxa" w:w="7819"/>
+            <w:tcW w:type="dxa" w:w="7603"/>
             <w:vAlign w:val="center"/>
-            <w:shd w:fill="DCE6F1"/>
+            <w:shd w:fill="EDF2F6"/>
           </w:tcPr>
           <w:p>
             <w:pPr>
@@ -3974,7 +3978,7 @@
         </w:tc>
         <w:tc>
           <w:tcPr>
-            <w:tcW w:type="dxa" w:w="7819"/>
+            <w:tcW w:type="dxa" w:w="7603"/>
             <w:vAlign w:val="center"/>
           </w:tcPr>
           <w:p>
@@ -4021,7 +4025,7 @@
         </w:tc>
         <w:tc>
           <w:tcPr>
-            <w:tcW w:type="dxa" w:w="7819"/>
+            <w:tcW w:type="dxa" w:w="7603"/>
             <w:vAlign w:val="center"/>
           </w:tcPr>
           <w:p>
@@ -4068,7 +4072,7 @@
         </w:tc>
         <w:tc>
           <w:tcPr>
-            <w:tcW w:type="dxa" w:w="7819"/>
+            <w:tcW w:type="dxa" w:w="7603"/>
             <w:vAlign w:val="center"/>
           </w:tcPr>
           <w:p>
@@ -4115,7 +4119,7 @@
         </w:tc>
         <w:tc>
           <w:tcPr>
-            <w:tcW w:type="dxa" w:w="7819"/>
+            <w:tcW w:type="dxa" w:w="7603"/>
             <w:vAlign w:val="center"/>
           </w:tcPr>
           <w:p>
@@ -4310,27 +4314,6 @@
       </w:r>
     </w:p>
     <w:p>
-      <w:pPr>
-        <w:keepLines/>
-      </w:pPr>
-      <w:r>
-        <w:rPr>
-          <w:b/>
-          <w:i w:val="0"/>
-          <w:color w:val="1D4E89"/>
-        </w:rPr>
-        <w:t>Review note - CORE PRACTICE:</w:t>
-      </w:r>
-      <w:r>
-        <w:rPr>
-          <w:b w:val="0"/>
-          <w:i w:val="0"/>
-          <w:color w:val="000000"/>
-        </w:rPr>
-        <w:t xml:space="preserve"> Retain targeted correction records, separately versioned overlays, affected-environment review, and validation. Keeping the upstream pin does not remove the need to record local input changes.</w:t>
-      </w:r>
-    </w:p>
-    <w:p>
       <w:pPr/>
       <w:r>
         <w:rPr>
@@ -4441,48 +4424,6 @@
       </w:r>
     </w:p>
     <w:p>
-      <w:pPr>
-        <w:keepLines/>
-      </w:pPr>
-      <w:r>
-        <w:rPr>
-          <w:b/>
-          <w:i w:val="0"/>
-          <w:color w:val="1D4E89"/>
-        </w:rPr>
-        <w:t>Review note - CORE PRACTICE:</w:t>
-      </w:r>
-      <w:r>
-        <w:rPr>
-          <w:b w:val="0"/>
-          <w:i w:val="0"/>
-          <w:color w:val="000000"/>
-        </w:rPr>
-        <w:t xml:space="preserve"> Retain the dependency inventory, baseline comparison, local recipe review, and independent candidate decision. Keep manual effort focused on changed or risk-relevant inputs.</w:t>
-      </w:r>
-    </w:p>
-    <w:p>
-      <w:pPr>
-        <w:keepLines/>
-      </w:pPr>
-      <w:r>
-        <w:rPr>
-          <w:b/>
-          <w:i w:val="0"/>
-          <w:color w:val="6D3991"/>
-        </w:rPr>
-        <w:t>Review note - ADDED EFFORT:</w:t>
-      </w:r>
-      <w:r>
-        <w:rPr>
-          <w:b w:val="0"/>
-          <w:i w:val="0"/>
-          <w:color w:val="000000"/>
-        </w:rPr>
-        <w:t xml:space="preserve"> Decide scanner/feed ownership, required coverage, findings triage, and any specialist review capacity. These decisions do not replace the technical baseline and change review.</w:t>
-      </w:r>
-    </w:p>
-    <w:p>
       <w:pPr/>
       <w:r>
         <w:rPr>
@@ -4547,27 +4488,6 @@
       </w:r>
     </w:p>
     <w:p>
-      <w:pPr>
-        <w:keepLines/>
-      </w:pPr>
-      <w:r>
-        <w:rPr>
-          <w:b/>
-          <w:i w:val="0"/>
-          <w:color w:val="1D4E89"/>
-        </w:rPr>
-        <w:t>Review note - CORE PRACTICE:</w:t>
-      </w:r>
-      <w:r>
-        <w:rPr>
-          <w:b w:val="0"/>
-          <w:i w:val="0"/>
-          <w:color w:val="000000"/>
-        </w:rPr>
-        <w:t xml:space="preserve"> Retain verified source inputs and their identity so a build can be repeated or handed off. Reuse unchanged content and acquire only missing or changed inputs.</w:t>
-      </w:r>
-    </w:p>
-    <w:p>
       <w:pPr/>
       <w:r>
         <w:rPr>
@@ -4615,27 +4535,6 @@
           <w:i w:val="0"/>
         </w:rPr>
         <w:t>9.2 Systems with limited or no external network access</w:t>
-      </w:r>
-    </w:p>
-    <w:p>
-      <w:pPr>
-        <w:keepLines/>
-      </w:pPr>
-      <w:r>
-        <w:rPr>
-          <w:b/>
-          <w:i w:val="0"/>
-          <w:color w:val="8A5200"/>
-        </w:rPr>
-        <w:t>Review note - APPLICABILITY:</w:t>
-      </w:r>
-      <w:r>
-        <w:rPr>
-          <w:b w:val="0"/>
-          <w:i w:val="0"/>
-          <w:color w:val="000000"/>
-        </w:rPr>
-        <w:t xml:space="preserve"> Use the transfer procedure when the destination cannot retrieve the full input set directly, including partially connected systems. Destination restrictions and any applicable handling rules still govern that transfer.</w:t>
       </w:r>
     </w:p>
     <w:p>
@@ -4709,7 +4608,7 @@
       </w:tblPr>
       <w:tblGrid>
         <w:gridCol w:w="2333"/>
-        <w:gridCol w:w="7819"/>
+        <w:gridCol w:w="7603"/>
       </w:tblGrid>
       <w:tr>
         <w:trPr>
@@ -4720,7 +4619,7 @@
           <w:tcPr>
             <w:tcW w:type="dxa" w:w="2333"/>
             <w:vAlign w:val="center"/>
-            <w:shd w:fill="DCE6F1"/>
+            <w:shd w:fill="EDF2F6"/>
           </w:tcPr>
           <w:p>
             <w:pPr>
@@ -4740,9 +4639,9 @@
         </w:tc>
         <w:tc>
           <w:tcPr>
-            <w:tcW w:type="dxa" w:w="7819"/>
+            <w:tcW w:type="dxa" w:w="7603"/>
             <w:vAlign w:val="center"/>
-            <w:shd w:fill="DCE6F1"/>
+            <w:shd w:fill="EDF2F6"/>
           </w:tcPr>
           <w:p>
             <w:pPr>
@@ -4788,7 +4687,7 @@
         </w:tc>
         <w:tc>
           <w:tcPr>
-            <w:tcW w:type="dxa" w:w="7819"/>
+            <w:tcW w:type="dxa" w:w="7603"/>
             <w:vAlign w:val="center"/>
           </w:tcPr>
           <w:p>
@@ -4835,7 +4734,7 @@
         </w:tc>
         <w:tc>
           <w:tcPr>
-            <w:tcW w:type="dxa" w:w="7819"/>
+            <w:tcW w:type="dxa" w:w="7603"/>
             <w:vAlign w:val="center"/>
           </w:tcPr>
           <w:p>
@@ -4909,48 +4808,6 @@
       </w:r>
     </w:p>
     <w:p>
-      <w:pPr>
-        <w:keepLines/>
-      </w:pPr>
-      <w:r>
-        <w:rPr>
-          <w:b/>
-          <w:i w:val="0"/>
-          <w:color w:val="1D4E89"/>
-        </w:rPr>
-        <w:t>Review note - CORE PRACTICE:</w:t>
-      </w:r>
-      <w:r>
-        <w:rPr>
-          <w:b w:val="0"/>
-          <w:i w:val="0"/>
-          <w:color w:val="000000"/>
-        </w:rPr>
-        <w:t xml:space="preserve"> Retain nonprivileged builds, exact candidate inputs, safe concurrency, and software/module/runtime acceptance. The network and security-tool resource decisions below concern specific controls within this section.</w:t>
-      </w:r>
-    </w:p>
-    <w:p>
-      <w:pPr>
-        <w:keepLines/>
-      </w:pPr>
-      <w:r>
-        <w:rPr>
-          <w:b/>
-          <w:i w:val="0"/>
-          <w:color w:val="6D3991"/>
-        </w:rPr>
-        <w:t>Review note - ADDED EFFORT:</w:t>
-      </w:r>
-      <w:r>
-        <w:rPr>
-          <w:b w:val="0"/>
-          <w:i w:val="0"/>
-          <w:color w:val="000000"/>
-        </w:rPr>
-        <w:t xml:space="preserve"> Confirm whether enforced outbound-network denial remains the selected production control, how the system owner implements it, and who verifies it. The current draft requires it until that baseline is revised.</w:t>
-      </w:r>
-    </w:p>
-    <w:p>
       <w:pPr/>
       <w:r>
         <w:rPr>
@@ -4989,27 +4846,6 @@
       </w:r>
     </w:p>
     <w:p>
-      <w:pPr>
-        <w:keepLines/>
-      </w:pPr>
-      <w:r>
-        <w:rPr>
-          <w:b/>
-          <w:i w:val="0"/>
-          <w:color w:val="8A5200"/>
-        </w:rPr>
-        <w:t>Review note - APPLICABILITY:</w:t>
-      </w:r>
-      <w:r>
-        <w:rPr>
-          <w:b w:val="0"/>
-          <w:i w:val="0"/>
-          <w:color w:val="000000"/>
-        </w:rPr>
-        <w:t xml:space="preserve"> Run the tests for each supported language, lane, MPI/fabric/launcher, and GPU combination. Plan native multi-node access when required; omit a branch only when the supported release does not include it.</w:t>
-      </w:r>
-    </w:p>
-    <w:p>
       <w:pPr/>
       <w:r>
         <w:rPr>
@@ -5017,27 +4853,6 @@
           <w:i w:val="0"/>
         </w:rPr>
         <w:t>CSE acceptance covers applicable C/C++/Fortran compile/link/run checks, package runtime behavior, headers/libraries/linkage, numerical correctness and representative performance, clean Serial execution, native multi-node MPI and fabric/launcher behavior, and GPU tests when approved. Select checks and any reused baseline evidence under shared procedure Section 9.3.</w:t>
-      </w:r>
-    </w:p>
-    <w:p>
-      <w:pPr>
-        <w:keepLines/>
-      </w:pPr>
-      <w:r>
-        <w:rPr>
-          <w:b/>
-          <w:i w:val="0"/>
-          <w:color w:val="6D3991"/>
-        </w:rPr>
-        <w:t>Review note - ADDED EFFORT:</w:t>
-      </w:r>
-      <w:r>
-        <w:rPr>
-          <w:b w:val="0"/>
-          <w:i w:val="0"/>
-          <w:color w:val="000000"/>
-        </w:rPr>
-        <w:t xml:space="preserve"> Confirm the scan and hardening scope, test resources, and authority to disposition findings. Functional, numerical, performance, and module evidence remain part of technical acceptance.</w:t>
       </w:r>
     </w:p>
     <w:p>
@@ -5159,48 +4974,6 @@
       </w:r>
     </w:p>
     <w:p>
-      <w:pPr>
-        <w:keepLines/>
-      </w:pPr>
-      <w:r>
-        <w:rPr>
-          <w:b/>
-          <w:i w:val="0"/>
-          <w:color w:val="6D3991"/>
-        </w:rPr>
-        <w:t>Review note - ADDED EFFORT:</w:t>
-      </w:r>
-      <w:r>
-        <w:rPr>
-          <w:b w:val="0"/>
-          <w:i w:val="0"/>
-          <w:color w:val="000000"/>
-        </w:rPr>
-        <w:t xml:space="preserve"> CSE currently selects signed-cache publication. Confirm key custody, signing infrastructure, trust distribution, rotation/recovery, and staff ownership. Any proposed change needs corresponding edits to Sections 9, 10, 12, and 14 and the shared procedure.</w:t>
-      </w:r>
-    </w:p>
-    <w:p>
-      <w:pPr>
-        <w:keepLines/>
-      </w:pPr>
-      <w:r>
-        <w:rPr>
-          <w:b/>
-          <w:i w:val="0"/>
-          <w:color w:val="1D4E89"/>
-        </w:rPr>
-        <w:t>Review note - CORE PRACTICE:</w:t>
-      </w:r>
-      <w:r>
-        <w:rPr>
-          <w:b w:val="0"/>
-          <w:i w:val="0"/>
-          <w:color w:val="000000"/>
-        </w:rPr>
-        <w:t xml:space="preserve"> For the adopted signing method, retain protected private keys, verified public-key fingerprints, and binding of approval to the exact artifacts. Preserve those protections while reviewing infrastructure cost.</w:t>
-      </w:r>
-    </w:p>
-    <w:p>
       <w:pPr/>
       <w:r>
         <w:rPr>
@@ -5261,27 +5034,6 @@
       </w:r>
     </w:p>
     <w:p>
-      <w:pPr>
-        <w:keepLines/>
-      </w:pPr>
-      <w:r>
-        <w:rPr>
-          <w:b/>
-          <w:i w:val="0"/>
-          <w:color w:val="8A5200"/>
-        </w:rPr>
-        <w:t>Review note - APPLICABILITY:</w:t>
-      </w:r>
-      <w:r>
-        <w:rPr>
-          <w:b w:val="0"/>
-          <w:i w:val="0"/>
-          <w:color w:val="000000"/>
-        </w:rPr>
-        <w:t xml:space="preserve"> CSE currently requires catalog publication. Confirm which audience, supported selections, and accessible input locations apply; changing the required release sequence needs a policy revision.</w:t>
-      </w:r>
-    </w:p>
-    <w:p>
       <w:pPr/>
       <w:r>
         <w:rPr>
@@ -5329,27 +5081,6 @@
           <w:i w:val="0"/>
         </w:rPr>
         <w:t>10.3 CSE stack publication</w:t>
-      </w:r>
-    </w:p>
-    <w:p>
-      <w:pPr>
-        <w:keepLines/>
-      </w:pPr>
-      <w:r>
-        <w:rPr>
-          <w:b/>
-          <w:i w:val="0"/>
-          <w:color w:val="1D4E89"/>
-        </w:rPr>
-        <w:t>Review note - CORE PRACTICE:</w:t>
-      </w:r>
-      <w:r>
-        <w:rPr>
-          <w:b w:val="0"/>
-          <w:i w:val="0"/>
-          <w:color w:val="000000"/>
-        </w:rPr>
-        <w:t xml:space="preserve"> Retain exact accepted package identities, a protected publication area, destination validation, and controlled user exposure. The current cache-only method depends on the signing decision in Section 10.1; this note does not change that method.</w:t>
       </w:r>
     </w:p>
     <w:p>
@@ -5455,27 +5186,6 @@
       </w:r>
     </w:p>
     <w:p>
-      <w:pPr>
-        <w:keepLines/>
-      </w:pPr>
-      <w:r>
-        <w:rPr>
-          <w:b/>
-          <w:i w:val="0"/>
-          <w:color w:val="1D4E89"/>
-        </w:rPr>
-        <w:t>Review note - CORE PRACTICE:</w:t>
-      </w:r>
-      <w:r>
-        <w:rPr>
-          <w:b w:val="0"/>
-          <w:i w:val="0"/>
-          <w:color w:val="000000"/>
-        </w:rPr>
-        <w:t xml:space="preserve"> Retain package/dependency and external-component records for support, change impact, and recovery. Distinguish inventory capture from scanner operation and vulnerability findings triage.</w:t>
-      </w:r>
-    </w:p>
-    <w:p>
       <w:pPr/>
       <w:r>
         <w:rPr>
@@ -5495,27 +5205,6 @@
           <w:i w:val="0"/>
         </w:rPr>
         <w:t>11. User access</w:t>
-      </w:r>
-    </w:p>
-    <w:p>
-      <w:pPr>
-        <w:keepLines/>
-      </w:pPr>
-      <w:r>
-        <w:rPr>
-          <w:b/>
-          <w:i w:val="0"/>
-          <w:color w:val="1D4E89"/>
-        </w:rPr>
-        <w:t>Review note - CORE PRACTICE:</w:t>
-      </w:r>
-      <w:r>
-        <w:rPr>
-          <w:b w:val="0"/>
-          <w:i w:val="0"/>
-          <w:color w:val="000000"/>
-        </w:rPr>
-        <w:t xml:space="preserve"> Retain acceptance of the actual compiler, vendor/MPI, lane, and package environment users load. Test supported combinations, conflicts, clean-session behavior, and access from the intended node types.</w:t>
       </w:r>
     </w:p>
     <w:p>
@@ -5547,6 +5236,60 @@
         <w:t>module load &lt;Serial|MPI&gt;</w:t>
         <w:br/>
         <w:t>module load &lt;package&gt;/&lt;version&gt;</w:t>
+      </w:r>
+    </w:p>
+    <w:p>
+      <w:pPr>
+        <w:keepNext/>
+        <w:keepLines/>
+        <w:spacing w:before="140" w:after="0"/>
+        <w:jc w:val="center"/>
+      </w:pPr>
+      <w:r>
+        <w:drawing>
+          <wp:inline xmlns:a="http://schemas.openxmlformats.org/drawingml/2006/main" xmlns:pic="http://schemas.openxmlformats.org/drawingml/2006/picture">
+            <wp:extent cx="6309360" cy="2782252"/>
+            <wp:docPr id="2" name="Picture 2" descr="CSE user module sequence showing compiler selection, Serial or MPI lane selection, and package loading, with ambient Foundation libraries and user-loadable Core tools." title="cse-user-module-flow"/>
+            <wp:cNvGraphicFramePr>
+              <a:graphicFrameLocks noChangeAspect="1"/>
+            </wp:cNvGraphicFramePr>
+            <a:graphic>
+              <a:graphicData uri="http://schemas.openxmlformats.org/drawingml/2006/picture">
+                <pic:pic>
+                  <pic:nvPicPr>
+                    <pic:cNvPr id="0" name="cse-user-module-flow.png"/>
+                    <pic:cNvPicPr/>
+                  </pic:nvPicPr>
+                  <pic:blipFill>
+                    <a:blip r:embed="rId12"/>
+                    <a:stretch>
+                      <a:fillRect/>
+                    </a:stretch>
+                  </pic:blipFill>
+                  <pic:spPr>
+                    <a:xfrm>
+                      <a:off x="0" y="0"/>
+                      <a:ext cx="6309360" cy="2782252"/>
+                    </a:xfrm>
+                    <a:prstGeom prst="rect"/>
+                  </pic:spPr>
+                </pic:pic>
+              </a:graphicData>
+            </a:graphic>
+          </wp:inline>
+        </w:drawing>
+      </w:r>
+    </w:p>
+    <w:p>
+      <w:pPr>
+        <w:pStyle w:val="Caption"/>
+      </w:pPr>
+      <w:r>
+        <w:rPr>
+          <w:b w:val="0"/>
+          <w:i w:val="0"/>
+        </w:rPr>
+        <w:t>Figure 2. User access to the accepted CSE stack. The compiler and lane select the tested environment. Foundation libraries remain available through the selected view; Core tools and approved packages are exposed through modules.</w:t>
       </w:r>
     </w:p>
     <w:p>
@@ -5900,27 +5643,6 @@
       </w:r>
     </w:p>
     <w:p>
-      <w:pPr>
-        <w:keepLines/>
-      </w:pPr>
-      <w:r>
-        <w:rPr>
-          <w:b/>
-          <w:i w:val="0"/>
-          <w:color w:val="1D4E89"/>
-        </w:rPr>
-        <w:t>Review note - CORE PRACTICE:</w:t>
-      </w:r>
-      <w:r>
-        <w:rPr>
-          <w:b w:val="0"/>
-          <w:i w:val="0"/>
-          <w:color w:val="000000"/>
-        </w:rPr>
-        <w:t xml:space="preserve"> Retain versioned changes, advisory ownership, platform-update impact checks, and replacement/withdrawal capability. Keep the release record current as work happens.</w:t>
-      </w:r>
-    </w:p>
-    <w:p>
       <w:pPr/>
       <w:r>
         <w:rPr>
@@ -5938,27 +5660,6 @@
           <w:i w:val="0"/>
         </w:rPr>
         <w:t>CSE uses the approved support queue as its system of record. Assign advisory ownership to one team member; the other reviews the affected-release assessment and remediation evidence. Include transferred destination releases and their local contacts. Refresh vulnerability/scan intelligence on systems with limited or no external access through the approved update route and record its currency. A missed update or newly discovered finding requires a recorded disposition.</w:t>
-      </w:r>
-    </w:p>
-    <w:p>
-      <w:pPr>
-        <w:keepLines/>
-      </w:pPr>
-      <w:r>
-        <w:rPr>
-          <w:b/>
-          <w:i w:val="0"/>
-          <w:color w:val="6D3991"/>
-        </w:rPr>
-        <w:t>Review note - ADDED EFFORT:</w:t>
-      </w:r>
-      <w:r>
-        <w:rPr>
-          <w:b w:val="0"/>
-          <w:i w:val="0"/>
-          <w:color w:val="000000"/>
-        </w:rPr>
-        <w:t xml:space="preserve"> Review staffing and coverage for the stated response times, recurring advisory/scan updates, and remediation workload. Confirm achievable commitments and applicable site deadlines before adopting revised service targets.</w:t>
       </w:r>
     </w:p>
     <w:p>
@@ -5993,9 +5694,9 @@
         </w:tblCellMar>
       </w:tblPr>
       <w:tblGrid>
-        <w:gridCol w:w="1872"/>
-        <w:gridCol w:w="3888"/>
-        <w:gridCol w:w="4392"/>
+        <w:gridCol w:w="1832"/>
+        <w:gridCol w:w="3805"/>
+        <w:gridCol w:w="4299"/>
       </w:tblGrid>
       <w:tr>
         <w:trPr>
@@ -6004,9 +5705,9 @@
         </w:trPr>
         <w:tc>
           <w:tcPr>
-            <w:tcW w:type="dxa" w:w="1872"/>
+            <w:tcW w:type="dxa" w:w="1832"/>
             <w:vAlign w:val="center"/>
-            <w:shd w:fill="DCE6F1"/>
+            <w:shd w:fill="EDF2F6"/>
           </w:tcPr>
           <w:p>
             <w:pPr>
@@ -6026,9 +5727,9 @@
         </w:tc>
         <w:tc>
           <w:tcPr>
-            <w:tcW w:type="dxa" w:w="3888"/>
+            <w:tcW w:type="dxa" w:w="3805"/>
             <w:vAlign w:val="center"/>
-            <w:shd w:fill="DCE6F1"/>
+            <w:shd w:fill="EDF2F6"/>
           </w:tcPr>
           <w:p>
             <w:pPr>
@@ -6048,9 +5749,9 @@
         </w:tc>
         <w:tc>
           <w:tcPr>
-            <w:tcW w:type="dxa" w:w="4392"/>
+            <w:tcW w:type="dxa" w:w="4299"/>
             <w:vAlign w:val="center"/>
-            <w:shd w:fill="DCE6F1"/>
+            <w:shd w:fill="EDF2F6"/>
           </w:tcPr>
           <w:p>
             <w:pPr>
@@ -6075,7 +5776,7 @@
         </w:trPr>
         <w:tc>
           <w:tcPr>
-            <w:tcW w:type="dxa" w:w="1872"/>
+            <w:tcW w:type="dxa" w:w="1832"/>
             <w:vAlign w:val="center"/>
           </w:tcPr>
           <w:p>
@@ -6096,7 +5797,7 @@
         </w:tc>
         <w:tc>
           <w:tcPr>
-            <w:tcW w:type="dxa" w:w="3888"/>
+            <w:tcW w:type="dxa" w:w="3805"/>
             <w:vAlign w:val="center"/>
           </w:tcPr>
           <w:p>
@@ -6117,7 +5818,7 @@
         </w:tc>
         <w:tc>
           <w:tcPr>
-            <w:tcW w:type="dxa" w:w="4392"/>
+            <w:tcW w:type="dxa" w:w="4299"/>
             <w:vAlign w:val="center"/>
           </w:tcPr>
           <w:p>
@@ -6143,7 +5844,7 @@
         </w:trPr>
         <w:tc>
           <w:tcPr>
-            <w:tcW w:type="dxa" w:w="1872"/>
+            <w:tcW w:type="dxa" w:w="1832"/>
             <w:vAlign w:val="center"/>
           </w:tcPr>
           <w:p>
@@ -6164,7 +5865,7 @@
         </w:tc>
         <w:tc>
           <w:tcPr>
-            <w:tcW w:type="dxa" w:w="3888"/>
+            <w:tcW w:type="dxa" w:w="3805"/>
             <w:vAlign w:val="center"/>
           </w:tcPr>
           <w:p>
@@ -6185,7 +5886,7 @@
         </w:tc>
         <w:tc>
           <w:tcPr>
-            <w:tcW w:type="dxa" w:w="4392"/>
+            <w:tcW w:type="dxa" w:w="4299"/>
             <w:vAlign w:val="center"/>
           </w:tcPr>
           <w:p>
@@ -6211,7 +5912,7 @@
         </w:trPr>
         <w:tc>
           <w:tcPr>
-            <w:tcW w:type="dxa" w:w="1872"/>
+            <w:tcW w:type="dxa" w:w="1832"/>
             <w:vAlign w:val="center"/>
           </w:tcPr>
           <w:p>
@@ -6232,7 +5933,7 @@
         </w:tc>
         <w:tc>
           <w:tcPr>
-            <w:tcW w:type="dxa" w:w="3888"/>
+            <w:tcW w:type="dxa" w:w="3805"/>
             <w:vAlign w:val="center"/>
           </w:tcPr>
           <w:p>
@@ -6253,7 +5954,7 @@
         </w:tc>
         <w:tc>
           <w:tcPr>
-            <w:tcW w:type="dxa" w:w="4392"/>
+            <w:tcW w:type="dxa" w:w="4299"/>
             <w:vAlign w:val="center"/>
           </w:tcPr>
           <w:p>
@@ -6314,27 +6015,6 @@
           <w:i w:val="0"/>
         </w:rPr>
         <w:t>13. Retention, recovery, and rollback</w:t>
-      </w:r>
-    </w:p>
-    <w:p>
-      <w:pPr>
-        <w:keepLines/>
-      </w:pPr>
-      <w:r>
-        <w:rPr>
-          <w:b/>
-          <w:i w:val="0"/>
-          <w:color w:val="1D4E89"/>
-        </w:rPr>
-        <w:t>Review note - CORE PRACTICE:</w:t>
-      </w:r>
-      <w:r>
-        <w:rPr>
-          <w:b w:val="0"/>
-          <w:i w:val="0"/>
-          <w:color w:val="000000"/>
-        </w:rPr>
-        <w:t xml:space="preserve"> Retain recoverable inputs, reviewed evidence, and a usable prior release. Confirm that the stated retention periods, storage capacity, and notification responsibilities are sustainable and meet site requirements.</w:t>
       </w:r>
     </w:p>
     <w:p>
@@ -6462,27 +6142,6 @@
           <w:i w:val="0"/>
         </w:rPr>
         <w:t>14. Required release record</w:t>
-      </w:r>
-    </w:p>
-    <w:p>
-      <w:pPr>
-        <w:keepLines/>
-      </w:pPr>
-      <w:r>
-        <w:rPr>
-          <w:b/>
-          <w:i w:val="0"/>
-          <w:color w:val="1D4E89"/>
-        </w:rPr>
-        <w:t>Review note - CORE PRACTICE:</w:t>
-      </w:r>
-      <w:r>
-        <w:rPr>
-          <w:b w:val="0"/>
-          <w:i w:val="0"/>
-          <w:color w:val="000000"/>
-        </w:rPr>
-        <w:t xml:space="preserve"> Retain one auditable CSE release record with exact inputs, corrections, tests, reviewer decision, and published identity. Capture available outputs automatically and keep baseline-specific security evidence with the same record.</w:t>
       </w:r>
     </w:p>
     <w:p>
@@ -6685,7 +6344,7 @@
     <w:sectPr>
       <w:footerReference w:type="default" r:id="rId9"/>
       <w:pgSz w:w="12240" w:h="15840"/>
-      <w:pgMar w:top="936" w:right="1044" w:bottom="936" w:left="1044" w:header="720" w:footer="432" w:gutter="0"/>
+      <w:pgMar w:top="936" w:right="1152" w:bottom="936" w:left="1152" w:header="720" w:footer="432" w:gutter="0"/>
       <w:cols w:space="720"/>
       <w:docGrid w:linePitch="360"/>
     </w:sectPr>
@@ -7121,6 +6780,7 @@
     </w:pPr>
     <w:rPr>
       <w:rFonts w:ascii="Arial" w:hAnsi="Arial"/>
+      <w:color w:val="000000"/>
       <w:sz w:val="22"/>
     </w:rPr>
   </w:style>
@@ -7179,7 +6839,7 @@
     <w:pPr>
       <w:keepNext/>
       <w:keepLines/>
-      <w:spacing w:before="280" w:after="140"/>
+      <w:spacing w:before="300" w:after="140"/>
       <w:outlineLvl w:val="0"/>
     </w:pPr>
     <w:rPr>
@@ -7187,7 +6847,7 @@
       <w:b/>
       <w:bCs/>
       <w:color w:val="000000"/>
-      <w:sz w:val="28"/>
+      <w:sz w:val="30"/>
       <w:szCs w:val="28"/>
     </w:rPr>
   </w:style>
@@ -7203,7 +6863,7 @@
     <w:pPr>
       <w:keepNext/>
       <w:keepLines/>
-      <w:spacing w:before="220" w:after="120"/>
+      <w:spacing w:before="240" w:after="120"/>
       <w:outlineLvl w:val="1"/>
     </w:pPr>
     <w:rPr>
@@ -7211,7 +6871,7 @@
       <w:b/>
       <w:bCs/>
       <w:color w:val="000000"/>
-      <w:sz w:val="24"/>
+      <w:sz w:val="25"/>
       <w:szCs w:val="26"/>
     </w:rPr>
   </w:style>
@@ -7917,13 +7577,17 @@
     <w:qFormat/>
     <w:rsid w:val="00FC693F"/>
     <w:pPr>
-      <w:spacing w:line="240" w:lineRule="auto"/>
+      <w:keepNext w:val="0"/>
+      <w:keepLines/>
+      <w:spacing w:line="252" w:lineRule="auto" w:before="60" w:after="200"/>
     </w:pPr>
     <w:rPr>
+      <w:rFonts w:ascii="Arial" w:hAnsi="Arial"/>
       <w:b/>
       <w:bCs/>
-      <w:color w:val="4F81BD" w:themeColor="accent1"/>
-      <w:sz w:val="18"/>
+      <w:i w:val="0"/>
+      <w:color w:val="333333"/>
+      <w:sz w:val="20"/>
       <w:szCs w:val="18"/>
     </w:rPr>
   </w:style>

</xml_diff>

<commit_message>
Make SOP wording clearer and define CSE for reviewers
</commit_message>
<xml_diff>
--- a/docs/word-documents/cse_software_stack_sop_v1.docx
+++ b/docs/word-documents/cse_software_stack_sop_v1.docx
@@ -11,7 +11,17 @@
           <w:b w:val="0"/>
           <w:i w:val="0"/>
         </w:rPr>
-        <w:t>CSE Spack Build and Publication SOP</w:t>
+        <w:t>CSE Spack Build and Publication Procedure</w:t>
+      </w:r>
+    </w:p>
+    <w:p>
+      <w:pPr/>
+      <w:r>
+        <w:rPr>
+          <w:b w:val="0"/>
+          <w:i w:val="0"/>
+        </w:rPr>
+        <w:t>This standard operating procedure (SOP) is for teammates who build, review, and release CSE software. It explains who does each step, what to record, and when the software is ready for users.</w:t>
       </w:r>
     </w:p>
     <w:tbl>
@@ -178,7 +188,7 @@
                 <w:i w:val="0"/>
                 <w:sz w:val="20"/>
               </w:rPr>
-              <w:t>2026-09-09</w:t>
+              <w:t>2026-09-10</w:t>
             </w:r>
           </w:p>
         </w:tc>
@@ -225,7 +235,7 @@
                 <w:i w:val="0"/>
                 <w:sz w:val="20"/>
               </w:rPr>
-              <w:t>CSE builders, reviewers, release authority, and supporting system and security personnel</w:t>
+              <w:t>CSE builders, reviewers, release authority, and supporting system and security staff</w:t>
             </w:r>
           </w:p>
         </w:tc>
@@ -272,7 +282,7 @@
                 <w:i w:val="0"/>
                 <w:sz w:val="20"/>
               </w:rPr>
-              <w:t>CSE operating policy, supported software surfaces, security responsibilities, and release acceptance</w:t>
+              <w:t>CSE software choices, responsibilities, access, and release requirements</w:t>
             </w:r>
           </w:p>
         </w:tc>
@@ -358,14 +368,14 @@
           <w:b/>
           <w:i w:val="0"/>
         </w:rPr>
-        <w:t>Baseline to retain.</w:t>
+        <w:t>Keep the core practices.</w:t>
       </w:r>
       <w:r>
         <w:rPr>
           <w:b w:val="0"/>
           <w:i w:val="0"/>
         </w:rPr>
-        <w:t xml:space="preserve"> Keep exact CSE input and change records, separately versioned local corrections, verified sources, controlled access, and tested software and modules. Retain the two-person release review and evidence needed for support, rebuilding, and recovery. Review can reuse unchanged baseline evidence without repeating the full build or manually inspecting every package.</w:t>
+        <w:t xml:space="preserve"> Record exact inputs and changes, version local corrections separately, verify sources, control access, and test software and modules. Keep the two-person release review and records needed for support, rebuilding, and recovery. Reuse earlier evidence when it still applies; review does not require a second full build or a manual check of every package.</w:t>
       </w:r>
     </w:p>
     <w:p>
@@ -375,14 +385,14 @@
           <w:b/>
           <w:i w:val="0"/>
         </w:rPr>
-        <w:t>Applicability to confirm.</w:t>
+        <w:t>Confirm what each system needs.</w:t>
       </w:r>
       <w:r>
         <w:rPr>
           <w:b w:val="0"/>
           <w:i w:val="0"/>
         </w:rPr>
-        <w:t xml:space="preserve"> Match transfer procedures and platform tests to the supported systems. Confirm the catalog audience and supported selections; CSE catalog publication remains required. Security involvement follows Section 2.2.</w:t>
+        <w:t xml:space="preserve"> Match transfers and tests to supported systems. Confirm who will use the catalog (versioned platform configuration) and which software combinations it supports. CSE must publish the catalog. Section 2.2 explains when security staff become involved.</w:t>
       </w:r>
     </w:p>
     <w:p>
@@ -392,7 +402,7 @@
           <w:b w:val="0"/>
           <w:i w:val="0"/>
         </w:rPr>
-        <w:t>The following controls need explicit scope, ownership, and resource decisions.</w:t>
+        <w:t>Reviewers should settle these choices, including who owns the work and the resources needed:</w:t>
       </w:r>
     </w:p>
     <w:tbl>
@@ -514,7 +524,7 @@
                 <w:i w:val="0"/>
                 <w:sz w:val="20"/>
               </w:rPr>
-              <w:t>Build network boundary</w:t>
+              <w:t>Build network restrictions</w:t>
             </w:r>
           </w:p>
         </w:tc>
@@ -535,7 +545,7 @@
                 <w:i w:val="0"/>
                 <w:sz w:val="20"/>
               </w:rPr>
-              <w:t>Platform enforcement, responsible owner, and verification of outbound-network denial</w:t>
+              <w:t>How the system blocks outbound access, who maintains the block, and how it is tested</w:t>
             </w:r>
           </w:p>
         </w:tc>
@@ -582,7 +592,7 @@
                 <w:i w:val="0"/>
                 <w:sz w:val="20"/>
               </w:rPr>
-              <w:t>Scanning and hardening</w:t>
+              <w:t>Security scans and compiler protections</w:t>
             </w:r>
           </w:p>
         </w:tc>
@@ -603,7 +613,7 @@
                 <w:i w:val="0"/>
                 <w:sz w:val="20"/>
               </w:rPr>
-              <w:t>Tools and feeds, coverage, findings handling, and numerical and performance testing capacity</w:t>
+              <w:t>Tools, update feeds, coverage, handling of findings, and capacity for numerical and performance tests</w:t>
             </w:r>
           </w:p>
         </w:tc>
@@ -650,7 +660,7 @@
                 <w:i w:val="0"/>
                 <w:sz w:val="20"/>
               </w:rPr>
-              <w:t>Signing and cache publication</w:t>
+              <w:t>Signing and binary publication</w:t>
             </w:r>
           </w:p>
         </w:tc>
@@ -671,7 +681,7 @@
                 <w:i w:val="0"/>
                 <w:sz w:val="20"/>
               </w:rPr>
-              <w:t>Key custody, signing context, trust distribution, rotation, and recovery support</w:t>
+              <w:t>Who holds the keys, where signing runs, how public keys are trusted, and how keys are replaced or recovered</w:t>
             </w:r>
           </w:p>
         </w:tc>
@@ -718,7 +728,7 @@
                 <w:i w:val="0"/>
                 <w:sz w:val="20"/>
               </w:rPr>
-              <w:t>Continuing support</w:t>
+              <w:t>Ongoing support</w:t>
             </w:r>
           </w:p>
         </w:tc>
@@ -739,7 +749,7 @@
                 <w:i w:val="0"/>
                 <w:sz w:val="20"/>
               </w:rPr>
-              <w:t>Staffing for response targets, advisory updates, retention, and recovery</w:t>
+              <w:t>Staffing for response targets, security updates, record retention, and recovery</w:t>
             </w:r>
           </w:p>
         </w:tc>
@@ -783,7 +793,7 @@
           <w:b w:val="0"/>
           <w:i w:val="0"/>
         </w:rPr>
-        <w:t>The current draft requires restricted builds and signed, cache-only publication. For a proposed change, record the clause, rationale, owner, and resources, then align this SOP and the shared procedure before adoption. Applicable site requirements still govern. Inclusion in this draft does not certify that a control has been implemented.</w:t>
+        <w:t>This draft requires restricted builds and publication from signed binary packages only. To change a requirement, record the clause, reason, owner, and resources, then update both documents before adopting the change. Site requirements still apply. A written requirement is not proof that it is in place.</w:t>
       </w:r>
     </w:p>
     <w:p>
@@ -805,7 +815,7 @@
           <w:b w:val="0"/>
           <w:i w:val="0"/>
         </w:rPr>
-        <w:t xml:space="preserve">This SOP defines how CSE manages its software stacks and applies the shared Spack procedure. It records CSE's package and platform choices, team responsibilities, access policy, review decisions, user interface, and release conditions. The </w:t>
+        <w:t xml:space="preserve">This SOP sets CSE's software choices, responsibilities, access rules, and acceptance conditions. The </w:t>
       </w:r>
       <w:hyperlink r:id="rId10" w:history="1">
         <w:r>
@@ -823,7 +833,7 @@
           <w:b w:val="0"/>
           <w:i w:val="0"/>
         </w:rPr>
-        <w:t xml:space="preserve"> owns the common steps and commands for preparing inputs, creating mirrors, transferring artifacts, building, validating, signing, publishing, and maintaining a release.</w:t>
+        <w:t xml:space="preserve"> gives the common steps and commands for preparing inputs, mirrors and transfers, building, testing, signing, publishing, and maintenance.</w:t>
       </w:r>
     </w:p>
     <w:p>
@@ -833,7 +843,77 @@
           <w:b w:val="0"/>
           <w:i w:val="0"/>
         </w:rPr>
-        <w:t>Designated CSE package managers operate Spack in user space to prepare and maintain the CSE-managed stack, using the approved nonprivileged identities. Signing and publication use the separately authorized roles and contexts in Section 10. Normal users consume accepted software through published modules; they do not build, modify, or publish CSE-managed releases.</w:t>
+        <w:t xml:space="preserve">Spack manages software packages and their dependencies. A Spack </w:t>
+      </w:r>
+      <w:r>
+        <w:rPr>
+          <w:b/>
+          <w:i w:val="0"/>
+        </w:rPr>
+        <w:t>environment</w:t>
+      </w:r>
+      <w:r>
+        <w:rPr>
+          <w:b w:val="0"/>
+          <w:i w:val="0"/>
+        </w:rPr>
+        <w:t xml:space="preserve"> lists the requested packages and settings. </w:t>
+      </w:r>
+      <w:r>
+        <w:rPr>
+          <w:b/>
+          <w:i w:val="0"/>
+        </w:rPr>
+        <w:t>Concretization</w:t>
+      </w:r>
+      <w:r>
+        <w:rPr>
+          <w:b w:val="0"/>
+          <w:i w:val="0"/>
+        </w:rPr>
+        <w:t xml:space="preserve"> resolves these requests into exact package versions, dependencies, compilers, and build options, saved in a </w:t>
+      </w:r>
+      <w:r>
+        <w:rPr>
+          <w:b/>
+          <w:i w:val="0"/>
+        </w:rPr>
+        <w:t>lockfile</w:t>
+      </w:r>
+      <w:r>
+        <w:rPr>
+          <w:b w:val="0"/>
+          <w:i w:val="0"/>
+        </w:rPr>
+        <w:t xml:space="preserve">. A </w:t>
+      </w:r>
+      <w:r>
+        <w:rPr>
+          <w:b/>
+          <w:i w:val="0"/>
+        </w:rPr>
+        <w:t>pin</w:t>
+      </w:r>
+      <w:r>
+        <w:rPr>
+          <w:b w:val="0"/>
+          <w:i w:val="0"/>
+        </w:rPr>
+        <w:t xml:space="preserve"> fixes an input to a recorded version or revision. A proposed release is called a </w:t>
+      </w:r>
+      <w:r>
+        <w:rPr>
+          <w:b/>
+          <w:i w:val="0"/>
+        </w:rPr>
+        <w:t>candidate</w:t>
+      </w:r>
+      <w:r>
+        <w:rPr>
+          <w:b w:val="0"/>
+          <w:i w:val="0"/>
+        </w:rPr>
+        <w:t xml:space="preserve"> in the records.</w:t>
       </w:r>
     </w:p>
     <w:p>
@@ -843,7 +923,7 @@
           <w:b w:val="0"/>
           <w:i w:val="0"/>
         </w:rPr>
-        <w:t>Use both documents for a CSE release. Complete the shared procedure with the CSE selections and acceptance conditions in this SOP. Record the revision of each document in the release record. A conflict with an assigned system or security requirement is resolved with its responsible authority before the affected step; an operator does not choose whichever document is less strict.</w:t>
+        <w:t>Designated CSE package managers build with approved user accounts without elevated privileges. Signing and publication use the separately authorized roles and accounts in Section 10. End users load accepted software through environment modules, which select the software available in their shell. They do not build, modify, or publish CSE-managed releases.</w:t>
       </w:r>
     </w:p>
     <w:p>
@@ -853,7 +933,7 @@
           <w:b w:val="0"/>
           <w:i w:val="0"/>
         </w:rPr>
-        <w:t>This SOP and the shared procedure define the complete operating requirements. Record system-specific paths, provider selections, scheduler commands, network controls, and responsible people in the operating record specified in Section 3. The same release gates apply regardless of the approved tools used to carry out the procedure. A completed release record demonstrates which controls were performed on each system.</w:t>
+        <w:t>Use both documents and record their revisions for each release. Resolve conflicts with system or security requirements through the responsible authority before the affected step; do not choose the less strict instruction. These requirements apply with any approved tools. Record system paths, software providers, scheduler commands, network controls, and responsible people under Section 3. The release record shows the work completed on each system.</w:t>
       </w:r>
     </w:p>
     <w:p>
@@ -1055,7 +1135,7 @@
                 <w:i w:val="0"/>
                 <w:sz w:val="20"/>
               </w:rPr>
-              <w:t>Prepare runtime, storage, and configuration</w:t>
+              <w:t>Prepare Spack, storage, and configuration</w:t>
             </w:r>
           </w:p>
         </w:tc>
@@ -1263,7 +1343,7 @@
                 <w:i w:val="0"/>
                 <w:sz w:val="20"/>
               </w:rPr>
-              <w:t>Resolve and review the candidate</w:t>
+              <w:t>Resolve and review the proposed release</w:t>
             </w:r>
           </w:p>
         </w:tc>
@@ -1407,7 +1487,7 @@
                 <w:i w:val="0"/>
                 <w:sz w:val="20"/>
               </w:rPr>
-              <w:t>Deliver inputs to a system with limited or no external network access</w:t>
+              <w:t>Deliver inputs to systems with limited network access</w:t>
             </w:r>
           </w:p>
         </w:tc>
@@ -1479,7 +1559,7 @@
                 <w:i w:val="0"/>
                 <w:sz w:val="20"/>
               </w:rPr>
-              <w:t>Build and validate</w:t>
+              <w:t>Build and test</w:t>
             </w:r>
           </w:p>
         </w:tc>
@@ -1663,7 +1743,7 @@
                 <w:i w:val="0"/>
                 <w:sz w:val="20"/>
               </w:rPr>
-              <w:t>Accept user access and maintain releases</w:t>
+              <w:t>Check user access and maintain releases</w:t>
             </w:r>
           </w:p>
         </w:tc>
@@ -1728,7 +1808,21 @@
           <w:b w:val="0"/>
           <w:i w:val="0"/>
         </w:rPr>
-        <w:t>The normal CSE sequence is reviewed inputs and lockfiles, controlled source intake, restricted build and validation, second-person review, approved signing, catalog publication, cache-only stack installation, destination acceptance, and user exposure. A failed gate holds the candidate at the affected step.</w:t>
+        <w:t xml:space="preserve">Release sequence: review inputs and lockfiles, collect approved sources, build and test with network restrictions, obtain independent review, sign, publish the catalog, install from the </w:t>
+      </w:r>
+      <w:r>
+        <w:rPr>
+          <w:b/>
+          <w:i w:val="0"/>
+        </w:rPr>
+        <w:t>build cache</w:t>
+      </w:r>
+      <w:r>
+        <w:rPr>
+          <w:b w:val="0"/>
+          <w:i w:val="0"/>
+        </w:rPr>
+        <w:t xml:space="preserve"> (stored binary packages), check the destination, then make the software available to users. Stop at any step whose acceptance checks fail.</w:t>
       </w:r>
     </w:p>
     <w:p>
@@ -1750,7 +1844,7 @@
           <w:b w:val="0"/>
           <w:i w:val="0"/>
         </w:rPr>
-        <w:t>Assign a build owner and a separate qualified technical reviewer for each candidate release. The process can be performed by two CSE team members, who may exchange roles between releases. Their recorded decisions must remain attributable to separate people.</w:t>
+        <w:t>Assign a builder and a separate qualified technical reviewer to each proposed release. Two CSE team members can perform the process and exchange roles between releases. Each person's decisions must be recorded under their own name.</w:t>
       </w:r>
     </w:p>
     <w:tbl>
@@ -1870,7 +1964,7 @@
                 <w:i w:val="0"/>
                 <w:sz w:val="20"/>
               </w:rPr>
-              <w:t>Prepare the candidate, identify inputs and changes, perform intake/build/tests, record results and exceptions, and submit the exact candidate for review.</w:t>
+              <w:t>Prepare the release, record inputs and changes, collect sources, build and test, record results and exceptions, and submit the exact result for review.</w:t>
             </w:r>
           </w:p>
         </w:tc>
@@ -1917,7 +2011,7 @@
                 <w:i w:val="0"/>
                 <w:sz w:val="20"/>
               </w:rPr>
-              <w:t>Independently examine the input/change record, targeted package reviews, test and scan evidence, publication plan, and destination acceptance. Record approval, required correction, or hold with a reason.</w:t>
+              <w:t>Independently check inputs and changes, selected package reviews, test and scan results, publication plans, and destination acceptance. Record approval, required corrections, or a hold, with reasons.</w:t>
             </w:r>
           </w:p>
         </w:tc>
@@ -1964,7 +2058,7 @@
                 <w:i w:val="0"/>
                 <w:sz w:val="20"/>
               </w:rPr>
-              <w:t>Authorize signing and user exposure. This is the CSE software lead or a documented delegate. The technical reviewer may fill this role when delegated; a third routine CSE position is not required.</w:t>
+              <w:t>Approve signing and release to users. The CSE software lead or a named delegate fills this role. It may be delegated to the reviewer; a third person is not required.</w:t>
             </w:r>
           </w:p>
         </w:tc>
@@ -2011,7 +2105,7 @@
                 <w:i w:val="0"/>
                 <w:sz w:val="20"/>
               </w:rPr>
-              <w:t>Provide and confirm filesystem, account, network, scheduler, compiler, MPI, GPU, external-library, and destination controls that CSE relies on.</w:t>
+              <w:t>Provide and confirm the filesystem, account, network, scheduler, compiler, Message Passing Interface (MPI), graphics processing unit (GPU), external-library, and destination controls used by CSE.</w:t>
             </w:r>
           </w:p>
         </w:tc>
@@ -2058,7 +2152,7 @@
                 <w:i w:val="0"/>
                 <w:sz w:val="20"/>
               </w:rPr>
-              <w:t>Advise on the operating security baseline and assess security exceptions, boundary changes, or incidents within the authority assigned by the local process. Route decisions requiring another authorizing role to that role.</w:t>
+              <w:t>Advise on security requirements and assess exceptions, boundary changes, and incidents within their local authority. Send decisions that need another authorizing role to that role.</w:t>
             </w:r>
           </w:p>
         </w:tc>
@@ -2081,7 +2175,7 @@
           <w:b w:val="0"/>
           <w:i w:val="0"/>
         </w:rPr>
-        <w:t>The project manager receives schedule, risk, and release-status updates. The release record names the people filling the CSE roles and identifies the system/security contacts; role names alone do not prove that review occurred.</w:t>
+        <w:t>Give the project manager schedule, risk, and release-status updates. Name the CSE staff and system and security contacts in the release record. A list of roles alone does not show that review occurred.</w:t>
       </w:r>
     </w:p>
     <w:p>
@@ -2107,7 +2201,7 @@
         <w:drawing>
           <wp:inline xmlns:a="http://schemas.openxmlformats.org/drawingml/2006/main" xmlns:pic="http://schemas.openxmlformats.org/drawingml/2006/picture">
             <wp:extent cx="6309360" cy="3154680"/>
-            <wp:docPr id="1" name="Picture 1" descr="CSE release ownership from a builder preparing and validating a candidate to independent review, controlled signing, catalog publication, cache-only installation, destination acceptance, and authorized user exposure." title="cse-release-ownership"/>
+            <wp:docPr id="1" name="Picture 1" descr="CSE release steps: build and test, independent review, signing, catalog publication, installation from the build cache, destination checks, and approval for users." title="cse-release-ownership"/>
             <wp:cNvGraphicFramePr>
               <a:graphicFrameLocks noChangeAspect="1"/>
             </wp:cNvGraphicFramePr>
@@ -2147,7 +2241,7 @@
           <w:b w:val="0"/>
           <w:i w:val="0"/>
         </w:rPr>
-        <w:t>Figure 1. CSE review and release handoff. The technical reviewer may also act as delegated release authority and perform signing in its separate controlled context. Sections 9 and 10 define the validation and publication requirements.</w:t>
+        <w:t>Figure 1. CSE review and release handoff. The reviewer may also be the delegated release authority and sign in a separately controlled environment. Sections 9 and 10 define the testing and publication requirements.</w:t>
       </w:r>
     </w:p>
     <w:p>
@@ -2157,7 +2251,7 @@
           <w:b w:val="0"/>
           <w:i w:val="0"/>
         </w:rPr>
-        <w:t>The builder submits the candidate identity, input and change inventory, review scope and rationale, test and scan results, unresolved items, and proposed disposition. The reviewer records their identity, date, reviewed evidence revision or digest, decision, and any conditions. Record corrections and the reviewer's recheck against the new candidate state. Approval of earlier bytes does not approve later changes.</w:t>
+        <w:t>The builder submits the release identity, inputs and changes, review scope and reasoning, test and scan results, unresolved items, and recommended decision. The reviewer records their name, date, evidence revision or checksum, decision, and conditions. Keep corrections and the reviewer's recheck of the revised release. Approval of earlier files does not approve later changes.</w:t>
       </w:r>
     </w:p>
     <w:p>
@@ -2167,7 +2261,7 @@
           <w:b w:val="0"/>
           <w:i w:val="0"/>
         </w:rPr>
-        <w:t>The two people need not repeat the full build independently or manually read every package. The reviewer verifies that the defined procedure ran, evaluates the risk-based review and its findings, and checks selected evidence directly. One designated reviewer remains accountable for the complete candidate and independent of its material preparation or input changes. The reviewer may witness repeatable operations and run verification against unchanged approved inputs; requested corrections go back to the builder. If both people author material candidate changes, hold release or obtain a qualified independent reviewer through the existing management process. Reciprocal review of separate changes does not replace independent review of the complete release.</w:t>
+        <w:t>The reviewer checks that the procedure ran, assesses the package-review plan and findings, and checks selected evidence directly. One reviewer must remain independent of the changes affecting the release or its inputs and accountable for its full review. They may witness repeatable steps and verify unchanged approved inputs; corrections return to the builder. If both people make changes affecting the release or its inputs, hold the release or obtain another qualified independent reviewer through the existing management process. Reviewing each other's separate changes does not replace independent review of the whole release.</w:t>
       </w:r>
     </w:p>
     <w:p>
@@ -2177,7 +2271,7 @@
           <w:b w:val="0"/>
           <w:i w:val="0"/>
         </w:rPr>
-        <w:t>Use one controlled ticket, review record, or release database entry to connect these decisions to the candidate. Preserve history and the reviewed snapshots; do not replace a previous decision with an edited description of the outcome.</w:t>
+        <w:t>Keep these decisions in one controlled ticket, review record, or release database entry. Preserve its history and reviewed snapshots; do not rewrite an earlier decision to describe a later result.</w:t>
       </w:r>
     </w:p>
     <w:p>
@@ -2199,7 +2293,7 @@
           <w:b w:val="0"/>
           <w:i w:val="0"/>
         </w:rPr>
-        <w:t>Routine releases within the agreed baseline stay with the CSE builder, reviewer, and delegated release authority. Obtain security review or a decision at the following points. The local process identifies the responsible reviewer and any required approval authority:</w:t>
+        <w:t>Routine releases within agreed requirements stay with the builder, reviewer, and delegated release authority. Use the local security process to identify the reviewer and approval authority for these cases:</w:t>
       </w:r>
     </w:p>
     <w:tbl>
@@ -2273,7 +2367,7 @@
                 <w:i w:val="0"/>
                 <w:sz w:val="20"/>
               </w:rPr>
-              <w:t>Requested involvement</w:t>
+              <w:t>Required involvement</w:t>
             </w:r>
           </w:p>
         </w:tc>
@@ -2321,7 +2415,7 @@
                 <w:i w:val="0"/>
                 <w:sz w:val="20"/>
               </w:rPr>
-              <w:t>Initial operating baseline or a material change to source trust, build isolation, signing, review, or publication boundaries</w:t>
+              <w:t>Initial security requirements, or a substantial change to source trust, build isolation, signing, review, or publication boundaries</w:t>
             </w:r>
           </w:p>
         </w:tc>
@@ -2342,7 +2436,7 @@
                 <w:i w:val="0"/>
                 <w:sz w:val="20"/>
               </w:rPr>
-              <w:t>Confirm the applicable security outcomes, acceptable evidence, and who may accept exceptions.</w:t>
+              <w:t>Confirm required security outcomes, acceptable evidence, and who may accept exceptions.</w:t>
             </w:r>
           </w:p>
         </w:tc>
@@ -2363,7 +2457,7 @@
                 <w:i w:val="0"/>
                 <w:sz w:val="20"/>
               </w:rPr>
-              <w:t>Prepare and test the candidate; hold affected production use pending the required decision.</w:t>
+              <w:t>Prepare and test; hold affected production use until the required decision.</w:t>
             </w:r>
           </w:p>
         </w:tc>
@@ -2389,7 +2483,7 @@
                 <w:i w:val="0"/>
                 <w:sz w:val="20"/>
               </w:rPr>
-              <w:t>An unresolved security finding or an exception to an agreed security requirement</w:t>
+              <w:t>Unresolved security finding or exception to an agreed requirement</w:t>
             </w:r>
           </w:p>
         </w:tc>
@@ -2410,7 +2504,7 @@
                 <w:i w:val="0"/>
                 <w:sz w:val="20"/>
               </w:rPr>
-              <w:t>Assess the exposure and proposed mitigation; obtain a scoped, time-bounded decision from the authorized role.</w:t>
+              <w:t>Assess the risk and proposed protection; obtain an authorized decision with a defined scope and end date.</w:t>
             </w:r>
           </w:p>
         </w:tc>
@@ -2431,7 +2525,7 @@
                 <w:i w:val="0"/>
                 <w:sz w:val="20"/>
               </w:rPr>
-              <w:t>Hold affected promotion; document owner, scope, expiration, and retest conditions.</w:t>
+              <w:t>Hold affected publication; record owner, scope, expiration, and retest conditions.</w:t>
             </w:r>
           </w:p>
         </w:tc>
@@ -2457,7 +2551,7 @@
                 <w:i w:val="0"/>
                 <w:sz w:val="20"/>
               </w:rPr>
-              <w:t>Suspected malicious content, key compromise, or a failed integrity check suggesting compromise</w:t>
+              <w:t>Suspected malicious content, compromised key, or integrity failure suggesting compromise</w:t>
             </w:r>
           </w:p>
         </w:tc>
@@ -2478,7 +2572,7 @@
                 <w:i w:val="0"/>
                 <w:sz w:val="20"/>
               </w:rPr>
-              <w:t>Engage the established incident-response/security process and obtain containment guidance.</w:t>
+              <w:t>Use the existing incident-response and security process for containment guidance.</w:t>
             </w:r>
           </w:p>
         </w:tc>
@@ -2499,7 +2593,7 @@
                 <w:i w:val="0"/>
                 <w:sz w:val="20"/>
               </w:rPr>
-              <w:t>Quarantine affected inputs or outputs and preserve evidence; do not promote them.</w:t>
+              <w:t>Quarantine affected inputs or outputs, preserve evidence, and do not publish them.</w:t>
             </w:r>
           </w:p>
         </w:tc>
@@ -2525,7 +2619,7 @@
                 <w:i w:val="0"/>
                 <w:sz w:val="20"/>
               </w:rPr>
-              <w:t>First use of a new transfer route or destination security boundary, or a change to an existing approved route</w:t>
+              <w:t>New transfer route or destination security boundary, or a change to an approved route</w:t>
             </w:r>
           </w:p>
         </w:tc>
@@ -2546,7 +2640,7 @@
                 <w:i w:val="0"/>
                 <w:sz w:val="20"/>
               </w:rPr>
-              <w:t>Confirm transfer handling, destination acceptance, and any required security approval with the transfer and system authorities.</w:t>
+              <w:t>Confirm transfer handling, destination checks, and security approval with transfer and system authorities.</w:t>
             </w:r>
           </w:p>
         </w:tc>
@@ -2567,7 +2661,7 @@
                 <w:i w:val="0"/>
                 <w:sz w:val="20"/>
               </w:rPr>
-              <w:t>Prepare the delivery inventory; do not use an unapproved route or assume source-system approval covers the destination.</w:t>
+              <w:t>Prepare the inventory; do not use an unapproved route or assume source-system approval covers the destination.</w:t>
             </w:r>
           </w:p>
         </w:tc>
@@ -2590,7 +2684,7 @@
           <w:b w:val="0"/>
           <w:i w:val="0"/>
         </w:rPr>
-        <w:t>This SOP does not add separate security approval for each unchanged dependency or routine source-mirror refresh within an already accepted scope. Ask for input where it can resolve a security question. CSE technical sign-off does not grant authority to waive a system security requirement.</w:t>
+        <w:t>Unchanged dependencies and routine source-mirror refreshes within an accepted scope need no separate security approval under this SOP. Seek input when it resolves a security question. CSE technical approval cannot waive a system security requirement.</w:t>
       </w:r>
     </w:p>
     <w:p>
@@ -2612,7 +2706,7 @@
           <w:b w:val="0"/>
           <w:i w:val="0"/>
         </w:rPr>
-        <w:t>Complete the common operating record in shared procedure Section 3 for each system and release. CSE additionally binds the following selections:</w:t>
+        <w:t>Complete the operating record in shared procedure Section 3 for each system and release. Also record these CSE choices:</w:t>
       </w:r>
     </w:p>
     <w:tbl>
@@ -2685,7 +2779,7 @@
                 <w:i w:val="0"/>
                 <w:sz w:val="20"/>
               </w:rPr>
-              <w:t>Required selection</w:t>
+              <w:t>Required information</w:t>
             </w:r>
           </w:p>
         </w:tc>
@@ -2732,7 +2826,7 @@
                 <w:i w:val="0"/>
                 <w:sz w:val="20"/>
               </w:rPr>
-              <w:t>System, stack, candidate/release identifier, predecessor, builder, reviewer, release authority, and the SOP/procedure revisions used.</w:t>
+              <w:t>System, stack, candidate or release identifier, previous release, builder, reviewer, release authority, and document revisions.</w:t>
             </w:r>
           </w:p>
         </w:tc>
@@ -2758,7 +2852,7 @@
                 <w:i w:val="0"/>
                 <w:sz w:val="20"/>
               </w:rPr>
-              <w:t>Package intent</w:t>
+              <w:t>Package choices</w:t>
             </w:r>
           </w:p>
         </w:tc>
@@ -2779,7 +2873,7 @@
                 <w:i w:val="0"/>
                 <w:sz w:val="20"/>
               </w:rPr>
-              <w:t>Controlled CSE roster and environment definitions, including root versions, variants, supported dependency combinations, and explicit exceptions.</w:t>
+              <w:t>Approved package list and environments, including requested package versions, build options (variants), supported dependency combinations, and exceptions.</w:t>
             </w:r>
           </w:p>
         </w:tc>
@@ -2826,7 +2920,7 @@
                 <w:i w:val="0"/>
                 <w:sz w:val="20"/>
               </w:rPr>
-              <w:t>Exact restricted catalog release, source identities, selected-scope digests, and the reviewed platform/provider records.</w:t>
+              <w:t>Exact restricted catalog release, source identities, checksums of selected configuration scopes (sets of Spack settings), and reviewed platform and provider records.</w:t>
             </w:r>
           </w:p>
         </w:tc>
@@ -2852,7 +2946,7 @@
                 <w:i w:val="0"/>
                 <w:sz w:val="20"/>
               </w:rPr>
-              <w:t>Tool and recipe baseline</w:t>
+              <w:t>Tools and recipes</w:t>
             </w:r>
           </w:p>
         </w:tc>
@@ -2873,7 +2967,7 @@
                 <w:i w:val="0"/>
                 <w:sz w:val="20"/>
               </w:rPr>
-              <w:t>Exact approved Spack version/tag/commit, package-repository commits and order, and CSE overlays. Verify the selected version against the command baseline in the shared procedure before use.</w:t>
+              <w:t>Approved Spack version, tag, and commit, package-repository commits and search order, and local recipes (overlays). Verify the exact Spack version against the shared procedure's command baseline.</w:t>
             </w:r>
           </w:p>
         </w:tc>
@@ -2920,7 +3014,7 @@
                 <w:i w:val="0"/>
                 <w:sz w:val="20"/>
               </w:rPr>
-              <w:t>Installer-chosen restricted and published roots, stages, caches/mirrors, evidence location, gateway location, collaboration group, and access audiences.</w:t>
+              <w:t>Installer-chosen restricted and published paths, build stages, caches and mirrors, evidence and module-entry locations, collaboration group, and intended users.</w:t>
             </w:r>
           </w:p>
         </w:tc>
@@ -2946,7 +3040,7 @@
                 <w:i w:val="0"/>
                 <w:sz w:val="20"/>
               </w:rPr>
-              <w:t>Security baseline</w:t>
+              <w:t>Security requirements</w:t>
             </w:r>
           </w:p>
         </w:tc>
@@ -2967,7 +3061,7 @@
                 <w:i w:val="0"/>
                 <w:sz w:val="20"/>
               </w:rPr>
-              <w:t>Input origins, preparation/build network controls, approved scanners and test requirements, signing backend and full key fingerprint, review scope, and applicable exception decisions.</w:t>
+              <w:t>Input sources, acquisition and build network controls, scanners and tests, signing backend and full key fingerprint, review scope, and all applicable exception decisions.</w:t>
             </w:r>
           </w:p>
         </w:tc>
@@ -2993,7 +3087,7 @@
                 <w:i w:val="0"/>
                 <w:sz w:val="20"/>
               </w:rPr>
-              <w:t>Transfer when used</w:t>
+              <w:t>Transfer, when used</w:t>
             </w:r>
           </w:p>
         </w:tc>
@@ -3014,7 +3108,7 @@
                 <w:i w:val="0"/>
                 <w:sz w:val="20"/>
               </w:rPr>
-              <w:t>Source and destination identifiers, transfer authorization/route, bundle identity and inventory, destination build or binary-install mode, compatibility evidence, and receipt/acceptance decisions.</w:t>
+              <w:t>Source, destination, authorized route, bundle identity and inventory, build or binary-install mode, compatibility evidence, and receipt and acceptance decisions.</w:t>
             </w:r>
           </w:p>
         </w:tc>
@@ -3061,7 +3155,7 @@
                 <w:i w:val="0"/>
                 <w:sz w:val="20"/>
               </w:rPr>
-              <w:t>Support queue, announcement channel, system/security contacts, retention choices, and any stricter site response targets.</w:t>
+              <w:t>Support queue, announcement channel, system and security contacts, retention choices, and stricter site response targets.</w:t>
             </w:r>
           </w:p>
         </w:tc>
@@ -3084,7 +3178,7 @@
           <w:b w:val="0"/>
           <w:i w:val="0"/>
         </w:rPr>
-        <w:t>The roster controls root versions and variants. An email, mirror's contents, or an available binary does not override that selection. The platform catalog controls supported configuration, and the installer records deployment paths; CSE does not infer those paths from system discovery.</w:t>
+        <w:t>The approved package list controls requested versions and variants. Email, mirror contents, or available binaries do not override it. The catalog controls supported configuration. The installer records deployment paths; CSE does not infer them from system discovery.</w:t>
       </w:r>
     </w:p>
     <w:p>
@@ -3106,7 +3200,7 @@
           <w:b w:val="0"/>
           <w:i w:val="0"/>
         </w:rPr>
-        <w:t>Follow shared procedure Section 4 to configure and verify the selected paths, runtime, permissions, and effective configuration. CSE uses separate restricted working and published namespaces:</w:t>
+        <w:t>Use shared procedure Section 4 to set up and check paths, Spack, permissions, and the configuration Spack actually uses. Keep restricted work and published content in separate directory trees:</w:t>
       </w:r>
     </w:p>
     <w:p>
@@ -3166,7 +3260,7 @@
           <w:b w:val="0"/>
           <w:i w:val="0"/>
         </w:rPr>
-        <w:t>This is a deployment pattern. Record actual roots rather than copying the placeholders. Source-mirror snapshots, transfer staging, and accepted evidence snapshots have separately recorded paths and write authorities.</w:t>
+        <w:t>Record actual paths in place of these examples. Also record source-mirror snapshot, transfer staging, and evidence paths and write access.</w:t>
       </w:r>
     </w:p>
     <w:tbl>
@@ -3265,7 +3359,7 @@
                 <w:i w:val="0"/>
                 <w:sz w:val="20"/>
               </w:rPr>
-              <w:t>Restricted working workspace, source cache, views, modules, file-backed candidate cache, and working evidence</w:t>
+              <w:t>Restricted workspace, source cache, views, modules, file-backed candidate cache, and working evidence</w:t>
             </w:r>
           </w:p>
         </w:tc>
@@ -3337,7 +3431,7 @@
                 <w:i w:val="0"/>
                 <w:sz w:val="20"/>
               </w:rPr>
-              <w:t>, with no access for others while assembling the candidate.</w:t>
+              <w:t>, with no access for others during preparation.</w:t>
             </w:r>
           </w:p>
         </w:tc>
@@ -3384,7 +3478,7 @@
                 <w:i w:val="0"/>
                 <w:sz w:val="20"/>
               </w:rPr>
-              <w:t>Spack package permissions use the recorded group, group read/write, and enabled locking; shared-filesystem lock behavior must be verified.</w:t>
+              <w:t>Spack permissions use the recorded group, group read and write, and enabled locking. Verify locks on the shared filesystem.</w:t>
             </w:r>
           </w:p>
         </w:tc>
@@ -3431,7 +3525,7 @@
                 <w:i w:val="0"/>
                 <w:sz w:val="20"/>
               </w:rPr>
-              <w:t>A builder-named partition, group-accessible for recovery; different builders use different mutable index partitions.</w:t>
+              <w:t>A separate mutable index partition for each builder, with group access for recovery.</w:t>
             </w:r>
           </w:p>
         </w:tc>
@@ -3457,7 +3551,7 @@
                 <w:i w:val="0"/>
                 <w:sz w:val="20"/>
               </w:rPr>
-              <w:t>Build stage, per-process/user cache, and bootstrap work state</w:t>
+              <w:t>Build stage, per-process or per-user cache, and bootstrap state (tools needed to run Spack)</w:t>
             </w:r>
           </w:p>
         </w:tc>
@@ -3478,7 +3572,7 @@
                 <w:i w:val="0"/>
                 <w:sz w:val="20"/>
               </w:rPr>
-              <w:t>Private to the builder or process, recreated for a handoff, outside the Spack tool root.</w:t>
+              <w:t>Private to the builder or process, recreated for handoff, and outside the Spack tool directory.</w:t>
             </w:r>
           </w:p>
         </w:tc>
@@ -3504,7 +3598,7 @@
                 <w:i w:val="0"/>
                 <w:sz w:val="20"/>
               </w:rPr>
-              <w:t>Admitted inputs, reviewed snapshots, and accepted evidence</w:t>
+              <w:t>Approved inputs, reviewed snapshots, and accepted evidence</w:t>
             </w:r>
           </w:p>
         </w:tc>
@@ -3525,7 +3619,7 @@
                 <w:i w:val="0"/>
                 <w:sz w:val="20"/>
               </w:rPr>
-              <w:t>Retained as identifiable versions with controlled write authority; read-only to build execution where required by the baseline. Shared working-directory modes alone do not provide this protection.</w:t>
+              <w:t>Identifiable retained versions with controlled write access; read-only to build execution where required. Shared working-directory permissions alone do not provide this protection.</w:t>
             </w:r>
           </w:p>
         </w:tc>
@@ -3572,7 +3666,7 @@
                 <w:i w:val="0"/>
                 <w:sz w:val="20"/>
               </w:rPr>
-              <w:t>Controlled signing context outside build execution and transfer bundles. Builder work does not receive the release-signing credential.</w:t>
+              <w:t>Separately controlled signing environment, outside builds and transfer bundles. Build work receives no signing credential.</w:t>
             </w:r>
           </w:p>
         </w:tc>
@@ -3619,7 +3713,7 @@
                 <w:i w:val="0"/>
                 <w:sz w:val="20"/>
               </w:rPr>
-              <w:t xml:space="preserve">Same recorded CSE management group; directories </w:t>
+              <w:t xml:space="preserve">Recorded CSE management group; directories </w:t>
             </w:r>
             <w:r>
               <w:rPr>
@@ -3670,7 +3764,7 @@
                 <w:i w:val="0"/>
                 <w:sz w:val="20"/>
               </w:rPr>
-              <w:t>, and no write for users outside CSE.</w:t>
+              <w:t>, and no write access outside CSE.</w:t>
             </w:r>
           </w:p>
         </w:tc>
@@ -3693,7 +3787,7 @@
           <w:b w:val="0"/>
           <w:i w:val="0"/>
         </w:rPr>
-        <w:t xml:space="preserve">Record and confirm the designated CSE Unix collaboration group on each system. Setgid and the selected default ACL or </w:t>
+        <w:t xml:space="preserve">Confirm the CSE Unix collaboration group on each system. Use setgid to retain group ownership and the selected default access control list (ACL) or </w:t>
       </w:r>
       <w:r>
         <w:rPr>
@@ -3709,7 +3803,7 @@
           <w:b w:val="0"/>
           <w:i w:val="0"/>
         </w:rPr>
-        <w:t xml:space="preserve"> provide working defaults; programs can create stricter modes, so the common handoff permission checks still apply. Each builder normalizes only their own working outputs after parallel work stops. Do not recursively change a shared tree without its filesystem owner's confirmation of scope.</w:t>
+        <w:t xml:space="preserve"> for working permissions. Programs can create stricter permissions, so still run the shared handoff checks. Each builder fixes permissions only on their own outputs after parallel work stops. Obtain the filesystem owner's confirmation of scope before recursively changing a shared tree.</w:t>
       </w:r>
     </w:p>
     <w:p>
@@ -3719,7 +3813,7 @@
           <w:b w:val="0"/>
           <w:i w:val="0"/>
         </w:rPr>
-        <w:t>CSE retains group management access to published content for controlled retirement and replacement. A frozen release is not edited in place. Protect and retain the approved snapshot/digests and record management actions; group-writable permissions are not a claim of storage-enforced immutability.</w:t>
+        <w:t>CSE keeps group management access for retirement and replacement, but does not edit accepted releases in place. Protect and retain approved snapshots and checksums, and record management actions. Group-write access does not make storage immutable.</w:t>
       </w:r>
     </w:p>
     <w:p>
@@ -3729,7 +3823,7 @@
           <w:b w:val="0"/>
           <w:i w:val="0"/>
         </w:rPr>
-        <w:t>CSE accepts either a read-only shared Spack checkout or an identity-equivalent builder-local checkout. Both must match the approved clean version/tag/commit and remain unchanged during the release. The tool root contains no workspace, package install tree, stage, cache, view, module tree, or signing key. Provision a changed Spack version in a new sibling directory. Follow the shared runtime and scope checks rather than changing checkout-local configuration in place.</w:t>
+        <w:t>Use a read-only shared Spack checkout or a builder-local copy of the same clean, approved version, tag, and commit. Keep it unchanged during the release. The Spack tool directory contains no workspace, installed packages, stages, caches, views, modules, or signing key. Install a changed Spack version in a new sibling directory. Follow the shared runtime and configuration-scope checks; do not change checkout-local configuration in place.</w:t>
       </w:r>
     </w:p>
     <w:p>
@@ -3751,7 +3845,7 @@
           <w:b w:val="0"/>
           <w:i w:val="0"/>
         </w:rPr>
-        <w:t>Follow shared procedure Section 5 with the CSE operating record. Before work proceeds, the two team members confirm that the prepared system/catalog, deployment, roster, runtime, repositories, and configuration identify the same candidate; the required node types and providers are available; shared paths and locking work; and both accounts have the intended working access.</w:t>
+        <w:t>With shared procedure Section 5 and the CSE operating record, both team members confirm that the system and catalog, deployment, package list, Spack, repositories, and configuration describe the same release. Check required node types and providers, shared paths and locks, and both accounts' working access.</w:t>
       </w:r>
     </w:p>
     <w:p>
@@ -3761,7 +3855,7 @@
           <w:b w:val="0"/>
           <w:i w:val="0"/>
         </w:rPr>
-        <w:t>Record the actual intake/build network enforcement, signing context, and mirror paths. An intended control written in this SOP is not evidence of enforcement. When inputs arrive by transfer, complete the receiving-system preflight and approved transfer checks before executing transferred tools or recipes. A failed prerequisite holds the affected step.</w:t>
+        <w:t>Record and verify acquisition and build network controls, the signing environment, and mirror paths. For transferred inputs, complete destination preflight and transfer checks before running tools or recipes. Stop the affected step if a prerequisite fails.</w:t>
       </w:r>
     </w:p>
     <w:p>
@@ -3783,7 +3877,7 @@
           <w:b w:val="0"/>
           <w:i w:val="0"/>
         </w:rPr>
-        <w:t>Use shared procedure Section 6 for catalog preparation, inspection, and scope selection. CSE retains an exact restricted catalog as the configuration record for both its build workspace and its later publication workspace. Record the catalog identity, source revisions, scope selections, and resulting effective configuration in the release evidence.</w:t>
+        <w:t>Use shared procedure Section 6 to prepare, inspect, and select catalog configuration. Keep the exact restricted catalog as the source for both build and publication workspaces. Record its identity, source revisions, selected configuration scopes, and resulting Spack configuration.</w:t>
       </w:r>
     </w:p>
     <w:p>
@@ -3793,7 +3887,7 @@
           <w:b w:val="0"/>
           <w:i w:val="0"/>
         </w:rPr>
-        <w:t xml:space="preserve">The public static catalog is a separate configuration product for package managers outside CSE. It contains reviewed Spack configuration, a contents and identity inventory, supported platform/provider combinations, usage instructions, and its approval record. It does not expose restricted workspaces, package prefixes, private caches, or signing material. Its versioned public path is pinned by its consumers; </w:t>
+        <w:t xml:space="preserve">The public catalog is a separate configuration release for package managers outside CSE. Include reviewed Spack configuration, a contents and identity inventory, supported platform and provider combinations, instructions, and approval. Exclude restricted workspaces, package installation paths, private caches, and signing material. Consumers pin its versioned path; </w:t>
       </w:r>
       <w:r>
         <w:rPr>
@@ -3809,7 +3903,7 @@
           <w:b w:val="0"/>
           <w:i w:val="0"/>
         </w:rPr>
-        <w:t xml:space="preserve"> is for discovery. Public catalog publication does not replace the restricted catalog of record.</w:t>
+        <w:t xml:space="preserve"> helps them find releases. Publishing it does not replace CSE's restricted catalog of record.</w:t>
       </w:r>
     </w:p>
     <w:p>
@@ -3819,7 +3913,7 @@
           <w:b w:val="0"/>
           <w:i w:val="0"/>
         </w:rPr>
-        <w:t>CSE selects compiler/MPI/GPU combinations from reviewed provider evidence. Cray MPICH is the normal Cray-native provider, with explicit alternative MPI providers allowed when CSE policy and the catalog support them. Do not infer MPI solely from system family. A GNU version in a Cray MPI flavor name is a supported compiler baseline, not by itself an exact CSE GCC version pin.</w:t>
+        <w:t>Select compiler, MPI, and GPU combinations from reviewed provider evidence. Cray MPICH is the normal Cray-native MPI provider; alternatives are allowed when CSE policy and the catalog support them. Do not select MPI from system family alone. A compiler version in a Cray MPI flavor name states a supported baseline; it does not pin CSE's exact GNU Compiler Collection (GCC) version.</w:t>
       </w:r>
     </w:p>
     <w:p>
@@ -3829,7 +3923,21 @@
           <w:b w:val="0"/>
           <w:i w:val="0"/>
         </w:rPr>
-        <w:t>System OpenSSL, curl, MPI, fabric, launcher, math, and runtime components remain external when selected catalog policy assigns them to the platform. Inventory their exact identities and test their integration. The acquisition host's platform facts do not replace those of the destination system.</w:t>
+        <w:t xml:space="preserve">Keep system OpenSSL, curl, MPI, fabric, launcher, math, and runtime components as </w:t>
+      </w:r>
+      <w:r>
+        <w:rPr>
+          <w:b/>
+          <w:i w:val="0"/>
+        </w:rPr>
+        <w:t>externals</w:t>
+      </w:r>
+      <w:r>
+        <w:rPr>
+          <w:b w:val="0"/>
+          <w:i w:val="0"/>
+        </w:rPr>
+        <w:t xml:space="preserve"> (software supplied outside this Spack build) when catalog policy assigns them to the platform. Record exact identities and test integration. The acquisition system's platform details do not replace the destination's.</w:t>
       </w:r>
     </w:p>
     <w:p>
@@ -3851,7 +3959,7 @@
           <w:b w:val="0"/>
           <w:i w:val="0"/>
         </w:rPr>
-        <w:t>Use shared procedure Section 7 to prepare and inspect the complete Spack environment and its approved inputs. Retain the release record, environment sources and lockfiles, configuration scopes, overlays, module definitions, and instructions needed by another authorized operator. Preserve relative includes as a complete tree during delivery. Accept the resulting configuration through the same Spack checks whether it was assembled manually or with approved automation.</w:t>
+        <w:t>Prepare and inspect environments and inputs with shared procedure Section 7. Keep the release record, environment sources and lockfiles, configuration scopes, overlays, modules, and instructions another authorized operator needs. Transfer relative includes as a complete directory tree. Run the same Spack configuration checks whether preparation was manual or automated.</w:t>
       </w:r>
     </w:p>
     <w:p>
@@ -3873,7 +3981,21 @@
           <w:b w:val="0"/>
           <w:i w:val="0"/>
         </w:rPr>
-        <w:t>CSE separates the following independently concretized environments for each supported compiler surface:</w:t>
+        <w:t xml:space="preserve">A </w:t>
+      </w:r>
+      <w:r>
+        <w:rPr>
+          <w:b/>
+          <w:i w:val="0"/>
+        </w:rPr>
+        <w:t>compiler surface</w:t>
+      </w:r>
+      <w:r>
+        <w:rPr>
+          <w:b w:val="0"/>
+          <w:i w:val="0"/>
+        </w:rPr>
+        <w:t xml:space="preserve"> groups the software built for one selected compiler. Concretize its environments separately:</w:t>
       </w:r>
     </w:p>
     <w:tbl>
@@ -3946,7 +4068,7 @@
                 <w:i w:val="0"/>
                 <w:sz w:val="20"/>
               </w:rPr>
-              <w:t>CSE content and binding</w:t>
+              <w:t>CSE content and compiler and provider requirements</w:t>
             </w:r>
           </w:p>
         </w:tc>
@@ -3993,7 +4115,7 @@
                 <w:i w:val="0"/>
                 <w:sz w:val="20"/>
               </w:rPr>
-              <w:t>Foundation libraries and CSE-selected tools/Python; bound to the compiler surface.</w:t>
+              <w:t>Foundation support libraries, CSE tools, and Python, built for the compiler surface.</w:t>
             </w:r>
           </w:p>
         </w:tc>
@@ -4040,7 +4162,7 @@
                 <w:i w:val="0"/>
                 <w:sz w:val="20"/>
               </w:rPr>
-              <w:t>Compiler-dependent packages shared by payload lanes; bound to the compiler.</w:t>
+              <w:t>Compiler-dependent packages shared by the application environments, built for the compiler.</w:t>
             </w:r>
           </w:p>
         </w:tc>
@@ -4087,7 +4209,7 @@
                 <w:i w:val="0"/>
                 <w:sz w:val="20"/>
               </w:rPr>
-              <w:t>Non-MPI payloads; bound to the compiler with MPI disabled.</w:t>
+              <w:t>Applications and libraries built for the compiler with MPI disabled.</w:t>
             </w:r>
           </w:p>
         </w:tc>
@@ -4134,7 +4256,7 @@
                 <w:i w:val="0"/>
                 <w:sz w:val="20"/>
               </w:rPr>
-              <w:t>MPI-enabled payloads; bound to the compiler and its selected MPI provider.</w:t>
+              <w:t>Applications and libraries built for the compiler with MPI enabled and the selected provider.</w:t>
             </w:r>
           </w:p>
         </w:tc>
@@ -4157,7 +4279,21 @@
           <w:b w:val="0"/>
           <w:i w:val="0"/>
         </w:rPr>
-        <w:t>When the approved package selection includes GPU software, compose a GPU environment from the applicable MPI set plus GPU-specific packages and compatible compiler/MPI/GPU selections. Record the supported combinations and required GPU acceptance checks for the destination.</w:t>
+        <w:t xml:space="preserve">A </w:t>
+      </w:r>
+      <w:r>
+        <w:rPr>
+          <w:b/>
+          <w:i w:val="0"/>
+        </w:rPr>
+        <w:t>lane</w:t>
+      </w:r>
+      <w:r>
+        <w:rPr>
+          <w:b w:val="0"/>
+          <w:i w:val="0"/>
+        </w:rPr>
+        <w:t xml:space="preserve"> is a selected Serial, MPI, or GPU environment. For approved GPU software, start with the applicable MPI set, add GPU packages, and select compatible compiler, MPI, and GPU versions. Record supported combinations and required destination GPU tests.</w:t>
       </w:r>
     </w:p>
     <w:p>
@@ -4167,7 +4303,35 @@
           <w:b w:val="0"/>
           <w:i w:val="0"/>
         </w:rPr>
-        <w:t>Producer order is compiler, Foundation, build tools/Core, then payload. Use the shared procedure's Spack-native grouping and toolchain constraints to express producer order and selection. Repeated compiler, Foundation, and build-tool specs reuse installed packages only when their complete concrete hashes match. Foundation is owned per compiler surface; a public view alone does not establish cross-surface compatibility.</w:t>
+        <w:t>Build in this order: compiler, Foundation, build tools and Core, then application packages. Express this order and selection with Spack's grouping and toolchain constraints from the shared procedure. Repeated compiler, Foundation, and build-tool specifications (</w:t>
+      </w:r>
+      <w:r>
+        <w:rPr>
+          <w:b/>
+          <w:i w:val="0"/>
+        </w:rPr>
+        <w:t>specs</w:t>
+      </w:r>
+      <w:r>
+        <w:rPr>
+          <w:b w:val="0"/>
+          <w:i w:val="0"/>
+        </w:rPr>
+        <w:t xml:space="preserve">) reuse installed packages only when their full concrete hashes match. These hashes identify the resolved builds. Foundation belongs to its compiler surface; a public </w:t>
+      </w:r>
+      <w:r>
+        <w:rPr>
+          <w:b/>
+          <w:i w:val="0"/>
+        </w:rPr>
+        <w:t>view</w:t>
+      </w:r>
+      <w:r>
+        <w:rPr>
+          <w:b w:val="0"/>
+          <w:i w:val="0"/>
+        </w:rPr>
+        <w:t xml:space="preserve"> (a directory presenting selected installed software) does not prove compatibility with another surface.</w:t>
       </w:r>
     </w:p>
     <w:p>
@@ -4196,7 +4360,7 @@
           <w:b w:val="0"/>
           <w:i w:val="0"/>
         </w:rPr>
-        <w:t>Foundation libraries use one pinned version per release and remain ambient through the selected view, without per-package modules.</w:t>
+        <w:t>Pin one Foundation library version per release. Make these libraries available through the selected view, without individual package modules.</w:t>
       </w:r>
     </w:p>
     <w:p>
@@ -4213,7 +4377,7 @@
           <w:b w:val="0"/>
           <w:i w:val="0"/>
         </w:rPr>
-        <w:t>Public packages normally include the current approved CSE version and the newest active version in the pinned recipe set. If the current CSE version is absent, use the two newest approved recipe-backed versions.</w:t>
+        <w:t>Normally publish the current approved CSE package version and the newest active version in the pinned recipes. If the current version is absent, use the two newest approved versions available in those recipes.</w:t>
       </w:r>
     </w:p>
     <w:p>
@@ -4230,7 +4394,7 @@
           <w:b w:val="0"/>
           <w:i w:val="0"/>
         </w:rPr>
-        <w:t>Record additional versions as controlled-roster exceptions.</w:t>
+        <w:t>Record additional versions as exceptions in the approved package list.</w:t>
       </w:r>
     </w:p>
     <w:p>
@@ -4247,7 +4411,7 @@
           <w:b w:val="0"/>
           <w:i w:val="0"/>
         </w:rPr>
-        <w:t>Publish HDF5 and NetCDF as tested dependency combinations. Pin build-tool dependencies independently from any additional public tool version.</w:t>
+        <w:t>Publish Hierarchical Data Format version 5 (HDF5) and Network Common Data Form (NetCDF) as tested dependency combinations. Pin build-tool dependencies separately from any additional public tool version.</w:t>
       </w:r>
     </w:p>
     <w:p>
@@ -4264,7 +4428,7 @@
           <w:b w:val="0"/>
           <w:i w:val="0"/>
         </w:rPr>
-        <w:t>Version-sensitive modules express the tested dependency loads and conflicts.</w:t>
+        <w:t>Make version-sensitive modules load tested dependencies and reject conflicts.</w:t>
       </w:r>
     </w:p>
     <w:p>
@@ -4281,7 +4445,7 @@
           <w:b w:val="0"/>
           <w:i w:val="0"/>
         </w:rPr>
-        <w:t>Serial specs disable MPI; MPI specs enable it and bind the selected provider.</w:t>
+        <w:t>Disable MPI in Serial specs; enable MPI and select its provider in MPI specs.</w:t>
       </w:r>
     </w:p>
     <w:p>
@@ -4298,7 +4462,7 @@
           <w:b w:val="0"/>
           <w:i w:val="0"/>
         </w:rPr>
-        <w:t>Apply the approved portable CPU target to source-built roots and dependencies. Approved architecture-specific binary distributions may use their recipe's required generic target.</w:t>
+        <w:t>Apply the approved portable central processing unit (CPU) target to packages requested directly and their dependencies when building from source. Approved architecture-specific binary distributions may use the generic target their recipe requires.</w:t>
       </w:r>
     </w:p>
     <w:p>
@@ -4320,7 +4484,7 @@
           <w:b w:val="0"/>
           <w:i w:val="0"/>
         </w:rPr>
-        <w:t xml:space="preserve">CSE may maintain a local recipe or source correction when the approved package and platform combination needs behavior that the pinned upstream recipe set does not provide correctly. Keep the upstream repository at its approved pin; record the correction in a separately versioned local package repository with an explicit namespace and search order. Follow the shared </w:t>
+        <w:t xml:space="preserve">When pinned upstream recipes do not correctly support an approved package and platform combination, CSE may keep a local recipe or source correction. Keep the upstream pin and version the local package repository separately, with an explicit namespace and search order. Follow the shared </w:t>
       </w:r>
       <w:hyperlink r:id="rId10" w:history="1" w:anchor="procedure_local_corrections">
         <w:r>
@@ -4338,7 +4502,7 @@
           <w:b w:val="0"/>
           <w:i w:val="0"/>
         </w:rPr>
-        <w:t>. Package selections and deployment settings remain in their owning configuration under shared procedure Section 4.2.</w:t>
+        <w:t>. Keep package choices and deployment settings in their own configuration under shared procedure Section 4.2.</w:t>
       </w:r>
     </w:p>
     <w:p>
@@ -4348,7 +4512,7 @@
           <w:b w:val="0"/>
           <w:i w:val="0"/>
         </w:rPr>
-        <w:t>The build owner retains the original failure, correction rationale, complete recipe and supporting files, applicable versions/compilers/variants, upstream reference or disposition, and affected environment graphs. The independent reviewer examines the local changes and validation evidence under Sections 2.1 and 8.1. This targeted review is part of the candidate's release assessment. Security involvement follows the existing triggers in Section 2.2.</w:t>
+        <w:t>Keep the failure, correction rationale, full recipe and supporting files, affected versions, compilers, and variants, upstream reference or decision, and dependency graphs. The independent reviewer checks changes and test evidence under Sections 2.1 and 8.1 as part of release review. Use Section 2.2 for security involvement.</w:t>
       </w:r>
     </w:p>
     <w:p>
@@ -4358,7 +4522,7 @@
           <w:b w:val="0"/>
           <w:i w:val="0"/>
         </w:rPr>
-        <w:t>Coordinate changes across every CSE environment that uses the local repository, including shared dependencies and other compiler surfaces. A condition limited to one compiler is not sufficient evidence that every other concrete identity is unchanged. Preserve accepted releases; retain a new candidate input revision, review affected locks, and rebuild and retest the affected dependency closure. Keep the validated repository revision available to another authorized builder and include it in applicable transfer and retention records.</w:t>
+        <w:t>Check every CSE environment using the local repository, including shared dependencies and other compilers. A compiler-specific condition does not prove other resolved package identities stayed unchanged. Keep accepted releases unchanged; record a new candidate input revision, review affected lockfiles, and rebuild and retest all affected packages and dependencies. Make the tested repository revision available to another authorized builder and include it in applicable transfer and retention records.</w:t>
       </w:r>
     </w:p>
     <w:p>
@@ -4368,7 +4532,7 @@
           <w:b w:val="0"/>
           <w:i w:val="0"/>
         </w:rPr>
-        <w:t>If a supported public catalog selection requires a correction, provide the approved audience with the exact immutable local repository through an authorized accessible source, together with its identity and selection instructions. A restricted internal path is not a usable public dependency. When a later approved upstream baseline includes the correction, assess its equivalence and retire the redundant local change through the same candidate review and validation process.</w:t>
+        <w:t>If a supported public catalog choice needs the correction, give its approved users the exact unchanging repository revision through an authorized, accessible source, with identity and selection instructions. A restricted internal path will not work for those users. When an approved upstream update contains the fix, check that it provides equivalent behavior and retire the local change through the same review and tests.</w:t>
       </w:r>
     </w:p>
     <w:p>
@@ -4390,7 +4554,7 @@
           <w:b w:val="0"/>
           <w:i w:val="0"/>
         </w:rPr>
-        <w:t xml:space="preserve">Follow the shared </w:t>
+        <w:t xml:space="preserve">Use the shared </w:t>
       </w:r>
       <w:hyperlink r:id="rId10" w:history="1" w:anchor="procedure_review">
         <w:r>
@@ -4408,7 +4572,7 @@
           <w:b w:val="0"/>
           <w:i w:val="0"/>
         </w:rPr>
-        <w:t xml:space="preserve"> for resolution, inventory, changes, and review evidence. CSE checks the complete set of environments for controlled-roster versions, compiler/MPI binding, portable targets, externals, HDF5/NetCDF combinations, build-tool pins, absence of MPI from Serial, and matching producer hashes where reuse is intended. All required lockfiles and cross-environment checks must pass before production builds start.</w:t>
+        <w:t>. Across all environments, check approved versions, compiler and MPI selections, portable targets, externals, HDF5 and NetCDF combinations, build-tool pins, no MPI in Serial, and matching producer hashes for reuse. All required lockfiles and cross-environment checks must pass before production builds start.</w:t>
       </w:r>
     </w:p>
     <w:p>
@@ -4420,7 +4584,7 @@
           <w:b w:val="0"/>
           <w:i w:val="0"/>
         </w:rPr>
-        <w:t>8.1 Scalable package review</w:t>
+        <w:t>8.1 Review package changes</w:t>
       </w:r>
     </w:p>
     <w:p>
@@ -4430,7 +4594,7 @@
           <w:b w:val="0"/>
           <w:i w:val="0"/>
         </w:rPr>
-        <w:t>CSE inventories the full concrete dependency closure and applies the required automated checks across the available source/artifact inventory. It does not require manual inspection of every package recipe or every line of every dependency for each buildout. Recipe and source code remain executable inputs even when no individual manual review is selected.</w:t>
+        <w:t>Inventory all resolved packages and dependencies. Run required automated checks across available sources and build outputs. Manual review of every recipe or every dependency's source code is not required for each build. Recipes and source code remain executable inputs even when not individually reviewed.</w:t>
       </w:r>
     </w:p>
     <w:p>
@@ -4440,7 +4604,7 @@
           <w:b w:val="0"/>
           <w:i w:val="0"/>
         </w:rPr>
-        <w:t>For an initial baseline, the builder records the pinned repositories and source origins, selected dependency inventory, automated findings, and a risk-based human review plan. The reviewer assesses that plan and its results. Human attention focuses on CSE-authored or modified recipes/patches, new trust sources, changed fetch or execution logic, unusual hooks or embedded downloads, security-sensitive components, and material findings. A package's presence in an upstream repository alone is not a local review decision.</w:t>
+        <w:t>For the initial baseline, record pinned repositories, source origins, selected dependencies, automated findings, and a human review plan based on risk. The reviewer assesses the plan and results. Focus on local recipes and patches, new sources of trust, changed download or execution logic, unusual hooks or embedded downloads, security-sensitive components, and significant findings. Presence in an upstream repository alone does not count as local review.</w:t>
       </w:r>
     </w:p>
     <w:p>
@@ -4450,7 +4614,7 @@
           <w:b w:val="0"/>
           <w:i w:val="0"/>
         </w:rPr>
-        <w:t>For later candidates, compare the complete input inventory with the retained baseline. Use the resulting delta and findings to select further review; do not require a person to inspect every upstream repository change unrelated to the selected release. Reuse an earlier review only when its input identity, context, and risk assumptions remain applicable. Record the selection criteria, what was examined, tools/results, decisions, and what was covered by baseline inheritance. Increase review when a finding or changed trust boundary warrants it. An unresolved material finding follows Section 2.2.</w:t>
+        <w:t>For later releases, compare all inputs with the retained baseline and use changes and findings to select further review. Upstream changes unrelated to the selected release need not be manually reviewed. Reuse earlier review only when the input identity, context, and risk assumptions still apply. Record selection criteria, examined content, tools and results, decisions, and reused review evidence. Expand review when findings or trust-boundary changes warrant it; send unresolved significant findings through Section 2.2.</w:t>
       </w:r>
     </w:p>
     <w:p>
@@ -4460,7 +4624,7 @@
           <w:b w:val="0"/>
           <w:i w:val="0"/>
         </w:rPr>
-        <w:t>The independent reviewer signs off on the candidate's review record and required corrections. Any required stricter organizational review is recorded in the operating baseline and followed within its actual scope.</w:t>
+        <w:t>The independent reviewer approves the review record and required corrections. Record and follow any stricter organizational review within its required scope.</w:t>
       </w:r>
     </w:p>
     <w:p>
@@ -4494,7 +4658,7 @@
           <w:b w:val="0"/>
           <w:i w:val="0"/>
         </w:rPr>
-        <w:t xml:space="preserve">Follow the shared </w:t>
+        <w:t xml:space="preserve">Use the shared </w:t>
       </w:r>
       <w:hyperlink r:id="rId10" w:history="1" w:anchor="procedure_source_mirrors">
         <w:r>
@@ -4512,7 +4676,21 @@
           <w:b w:val="0"/>
           <w:i w:val="0"/>
         </w:rPr>
-        <w:t>. CSE prepares an identifiable source-mirror snapshot for the approved concrete environments on a system with the required approved network access. Include dependency sources, patches/resources, VCS-derived source archives and their identity bindings, and separately admitted bootstrap/tool prerequisites. Retain origin, digest, scan, completeness, and review evidence with the snapshot. An ordinary fetch cache alone is not the documented transfer bundle.</w:t>
+        <w:t xml:space="preserve">. Prepare a versioned </w:t>
+      </w:r>
+      <w:r>
+        <w:rPr>
+          <w:b/>
+          <w:i w:val="0"/>
+        </w:rPr>
+        <w:t>source mirror</w:t>
+      </w:r>
+      <w:r>
+        <w:rPr>
+          <w:b w:val="0"/>
+          <w:i w:val="0"/>
+        </w:rPr>
+        <w:t xml:space="preserve"> (a stored collection of source archives) for the approved resolved environments on a system with authorized network access. Include dependency sources, patches and resources, archives from version control systems with recorded source identities, and separately approved bootstrap tools and prerequisites. Keep origins, checksums, scan results, completeness checks, and review evidence. A download cache alone is not a documented transfer bundle.</w:t>
       </w:r>
     </w:p>
     <w:p>
@@ -4522,7 +4700,7 @@
           <w:b w:val="0"/>
           <w:i w:val="0"/>
         </w:rPr>
-        <w:t>When a system cannot directly retrieve all required source tarballs or other build inputs, use an approved acquisition system with the necessary access to prepare the content, then use Section 9.2 for delivery. This applies to partial external-access restrictions as well as fully air-gapped systems. The receiving build uses destination-approved configuration and local mirrors. Missing content returns to controlled acquisition as a recorded supplemental delivery.</w:t>
+        <w:t>If a destination cannot retrieve all inputs, gather them on an approved connected system and deliver them under Section 9.2. Build with destination-approved configuration and local mirrors. Gather missing content through the same controlled process and record each supplemental delivery.</w:t>
       </w:r>
     </w:p>
     <w:p>
@@ -4544,7 +4722,7 @@
           <w:b w:val="0"/>
           <w:i w:val="0"/>
         </w:rPr>
-        <w:t xml:space="preserve">Apply the shared </w:t>
+        <w:t xml:space="preserve">Use the shared </w:t>
       </w:r>
       <w:hyperlink r:id="rId10" w:history="1" w:anchor="procedure_disconnected_transfer">
         <w:r>
@@ -4562,7 +4740,7 @@
           <w:b w:val="0"/>
           <w:i w:val="0"/>
         </w:rPr>
-        <w:t xml:space="preserve"> when a destination cannot directly obtain all required inputs, even if it can reach some Internet or internal-network resources. Air-gapped systems follow the same preparation and verification sequence. Transfer only through the authorized route for the source/destination pair. This procedure also supplies the technical preparation pattern for future classified destinations; their transfer and destination-security rules remain additional acceptance conditions.</w:t>
+        <w:t xml:space="preserve"> whenever a destination cannot retrieve all inputs, including partially connected and air-gapped systems. Use only the authorized route for that source and destination. Future classified systems use the same technical preparation; their transfer and destination-security rules add acceptance requirements.</w:t>
       </w:r>
     </w:p>
     <w:p>
@@ -4572,7 +4750,7 @@
           <w:b w:val="0"/>
           <w:i w:val="0"/>
         </w:rPr>
-        <w:t>The CSE builder prepares the delivery inventory and the second person reviews it before submission to the authorized transfer process. On receipt, retain the destination verification and acceptance record. The bundle contains the approved source mirrors and/or signed build-cache objects, required pinned tools and recipe repositories, complete configuration inputs, lockfiles, inventories, and transferable evidence. It contains no release private keys or acquisition credentials. The receiving system separately establishes trust in the approved public keys.</w:t>
+        <w:t>The builder prepares the delivery inventory; the second person reviews it before transfer. Keep destination verification and acceptance records. Include approved source mirrors, signed binary packages, or both; pinned tools and recipe repositories, complete configuration, lockfiles, inventories, and transferable evidence. Exclude release private keys and acquisition credentials. Establish trust in approved public keys separately on the receiving system.</w:t>
       </w:r>
     </w:p>
     <w:p>
@@ -4582,7 +4760,7 @@
           <w:b w:val="0"/>
           <w:i w:val="0"/>
         </w:rPr>
-        <w:t>Record one of these modes for each destination environment:</w:t>
+        <w:t>Record one mode per destination environment:</w:t>
       </w:r>
     </w:p>
     <w:tbl>
@@ -4655,7 +4833,7 @@
                 <w:i w:val="0"/>
                 <w:sz w:val="20"/>
               </w:rPr>
-              <w:t>CSE use and acceptance</w:t>
+              <w:t>Required CSE checks</w:t>
             </w:r>
           </w:p>
         </w:tc>
@@ -4702,7 +4880,7 @@
                 <w:i w:val="0"/>
                 <w:sz w:val="20"/>
               </w:rPr>
-              <w:t>Prepare or verify a destination-specific concrete graph and ensure its complete source/tool inputs are available locally. Build in the destination's restricted area, test there, and submit the new candidate to the two-person review and signing/publication process.</w:t>
+              <w:t>Prepare or verify the destination's resolved dependency graph and complete local sources and tools. Build and test in its restricted area, then apply two-person review, signing, and publication to the new candidate.</w:t>
             </w:r>
           </w:p>
         </w:tc>
@@ -4749,7 +4927,7 @@
                 <w:i w:val="0"/>
                 <w:sz w:val="20"/>
               </w:rPr>
-              <w:t>Verify the approved release and package signatures, exact selected hashes, and destination compatibility. Install from the transferred local build cache without a source-build fallback, then complete destination runtime/module/permission acceptance before user exposure.</w:t>
+              <w:t>Verify approved release and package signatures, exact selected hashes, and destination compatibility. Install only from the transferred build cache, with no source-build fallback. Accept runtime, modules, and permissions before making software available to users.</w:t>
             </w:r>
           </w:p>
         </w:tc>
@@ -4772,7 +4950,7 @@
           <w:b w:val="0"/>
           <w:i w:val="0"/>
         </w:rPr>
-        <w:t>Sister systems are good candidates for reuse, but their relationship is not a compatibility test. Compare OS/ABI, architecture and CPU target, compiler and runtime, MPI/fabric/launcher, GPU stack when applicable, external identities, and required paths/relocation. Record supporting evidence from the destination. If binary reuse cannot be accepted, choose a source-build candidate explicitly and apply its gates; do not silently rebuild during publication.</w:t>
+        <w:t>Sister systems still need compatibility checks. Compare operating system (OS), application binary interface (ABI), architecture and CPU target, compiler and runtime, MPI, fabric, and launcher, applicable GPU software, external identities, and required paths and relocation needs. Keep destination evidence. If binaries are not acceptable, explicitly select a source build and apply its requirements; never silently rebuild during publication.</w:t>
       </w:r>
     </w:p>
     <w:p>
@@ -4782,7 +4960,7 @@
           <w:b w:val="0"/>
           <w:i w:val="0"/>
         </w:rPr>
-        <w:t>Use the same approved lockfile on the acquisition host only to collect the destination's inputs, without substituting acquisition-host compiler or external choices. If destination resolution changes the graph, review the new candidate and prepare any missing sources before building. Do not assume a source tar set from a sister system is complete for a different graph.</w:t>
+        <w:t>On the acquisition system, use the approved lockfile only to collect destination inputs. Do not substitute the acquisition system's compiler or externals. If destination concretization changes the graph, review it and gather missing sources before building. Sources from a sister system may be incomplete for that graph.</w:t>
       </w:r>
     </w:p>
     <w:p>
@@ -4792,7 +4970,7 @@
           <w:b w:val="0"/>
           <w:i w:val="0"/>
         </w:rPr>
-        <w:t>The destination owns its acceptance decision and release evidence. Source-site review can be referenced for unchanged inputs; destination configuration, platform integration, transfer integrity, and execution results still require local evidence. A destination rebuild produces new artifacts with their own build, test, review, and signing records.</w:t>
+        <w:t>The destination owns its acceptance decision and records. It may reference source-site review for unchanged inputs, but needs local evidence for its configuration, platform integration, transfer integrity, and execution results. A destination rebuild needs its own build, test, review, and signing records.</w:t>
       </w:r>
     </w:p>
     <w:p>
@@ -4832,7 +5010,7 @@
           <w:b w:val="0"/>
           <w:i w:val="0"/>
         </w:rPr>
-        <w:t>. Separate approved acquisition from build execution. CSE's intended production baseline uses a nonprivileged restricted build, approved local inputs, enforced outbound-network denial, and no access to release-signing credentials. Record platform enforcement and its verification. Any proposed deviation is handled through Section 2.2 before affected production promotion.</w:t>
+        <w:t>. Separate source acquisition from builds. CSE's intended production requirements are builds without root privileges, approved local inputs, enforced outbound network blocking, and no access to release-signing credentials. Record and test the system's enforcement. Handle proposed exceptions under Section 2.2 before affected production publication.</w:t>
       </w:r>
     </w:p>
     <w:p>
@@ -4842,7 +5020,7 @@
           <w:b w:val="0"/>
           <w:i w:val="0"/>
         </w:rPr>
-        <w:t>Parallel CSE builds use distinct environments, enabled and verified shared locks, separate private process state, builder-specific miscellaneous caches, and one owner for each environment's views/modules. Coordinate total CPU and memory budgets. The two-person review remains required after parallel work; concurrency does not supply independent approval.</w:t>
+        <w:t>For parallel builds, use separate environments, enabled and tested shared locks, private process state, separate builder miscellaneous caches, and one owner per environment's views and modules. Coordinate total CPU and memory use. Parallel work still requires independent two-person review.</w:t>
       </w:r>
     </w:p>
     <w:p>
@@ -4852,7 +5030,7 @@
           <w:b w:val="0"/>
           <w:i w:val="0"/>
         </w:rPr>
-        <w:t>CSE acceptance covers applicable C/C++/Fortran compile/link/run checks, package runtime behavior, headers/libraries/linkage, numerical correctness and representative performance, clean Serial execution, native multi-node MPI and fabric/launcher behavior, and GPU tests when approved. Select checks and any reused baseline evidence under shared procedure Section 9.3.</w:t>
+        <w:t>Acceptance tests cover applicable C, C++, and Fortran compilation, linking and execution; package behavior; headers, libraries and linkage; numerical accuracy and representative performance; clean Serial execution; native multi-node MPI and fabric and launcher behavior; and approved GPU tests. Select checks and any reused evidence under shared procedure Section 9.3.</w:t>
       </w:r>
     </w:p>
     <w:p>
@@ -4862,7 +5040,21 @@
           <w:b w:val="0"/>
           <w:i w:val="0"/>
         </w:rPr>
-        <w:t>Apply the recorded security scans and qualified compiler-hardening settings; record failures and exceptions together with functional and performance evidence where relevant. Scans, SBOMs, and successful tests answer different questions.</w:t>
+        <w:t xml:space="preserve">Run recorded security scans and validated compiler-hardening settings. Keep failures and exceptions with related functional and performance results. A </w:t>
+      </w:r>
+      <w:r>
+        <w:rPr>
+          <w:b/>
+          <w:i w:val="0"/>
+        </w:rPr>
+        <w:t>software bill of materials (SBOM)</w:t>
+      </w:r>
+      <w:r>
+        <w:rPr>
+          <w:b w:val="0"/>
+          <w:i w:val="0"/>
+        </w:rPr>
+        <w:t xml:space="preserve"> lists software components; it is not a vulnerability scan or proof that tests passed.</w:t>
       </w:r>
     </w:p>
     <w:p>
@@ -4872,7 +5064,7 @@
           <w:b w:val="0"/>
           <w:i w:val="0"/>
         </w:rPr>
-        <w:t xml:space="preserve">Stage the compiler front doors and lane selectors in the restricted module root and review the presentation as a team. This does not expose the stack to non-CSE users. Record each required environment as </w:t>
+        <w:t xml:space="preserve">Prepare compiler-entry and lane-selection modules in the restricted module directory for team review, without making them available outside CSE. Record each required environment as </w:t>
       </w:r>
       <w:r>
         <w:rPr>
@@ -4920,7 +5112,7 @@
           <w:b w:val="0"/>
           <w:i w:val="0"/>
         </w:rPr>
-        <w:t xml:space="preserve">, and retain the applicable security disposition. Signing requires all release-required environments to pass and all required findings to have an accepted disposition; </w:t>
+        <w:t xml:space="preserve">, with its security decision. Sign only after all release-required environments pass and all required findings have accepted decisions. </w:t>
       </w:r>
       <w:r>
         <w:rPr>
@@ -4946,7 +5138,7 @@
           <w:b w:val="0"/>
           <w:i w:val="0"/>
         </w:rPr>
-        <w:t>A presentation-only correction can repeat module/view validation without a new solve or package build if the graph is unchanged. A compiler, provider, external, dependency, recipe, or hash change returns to candidate review. Using an alternate compiler for a dependency requires an explicit mixed-toolchain decision with ABI/linkage tests and retained compatibility evidence.</w:t>
+        <w:t>For module and view presentation changes only, repeat those checks without a new solve or build if the graph is unchanged. Compiler, provider, external, dependency, recipe, or hash changes return to release review. A different compiler for a dependency needs an explicit mixed-toolchain decision, ABI and linkage tests, and retained compatibility evidence.</w:t>
       </w:r>
     </w:p>
     <w:p>
@@ -4980,7 +5172,7 @@
           <w:b w:val="0"/>
           <w:i w:val="0"/>
         </w:rPr>
-        <w:t xml:space="preserve">Follow the shared </w:t>
+        <w:t xml:space="preserve">Use the shared </w:t>
       </w:r>
       <w:hyperlink r:id="rId10" w:history="1" w:anchor="procedure_signing">
         <w:r>
@@ -4998,7 +5190,7 @@
           <w:b w:val="0"/>
           <w:i w:val="0"/>
         </w:rPr>
-        <w:t>. Use the dedicated approved CSE signing identity and distribute its complete public-key fingerprint through a controlled channel. The reviewer/release authority may perform the signing action using separate controlled credentials; this separation does not require a third team member. A build job receives no private key.</w:t>
+        <w:t xml:space="preserve"> and dedicated approved CSE signing identity. Share the complete public-key fingerprint through a controlled channel. The reviewer or release authority may sign with separately controlled credentials; a third person is not required. Build jobs receive no private key.</w:t>
       </w:r>
     </w:p>
     <w:p>
@@ -5008,7 +5200,7 @@
           <w:b w:val="0"/>
           <w:i w:val="0"/>
         </w:rPr>
-        <w:t>Sign only the exact reviewed artifact set and bind the evidence and decision to it in the release record. Record the selected cache backend and its verified signing behavior; do not assume an OCI registry meets Spack 1.2.2 native signing requirements. Native package signatures do not authenticate the complete cache index or establish membership in an approved CSE release. Under shared procedure Section 10.1, bind the permitted concrete-hash set to the authenticated release record and require the installer to compare the selected hashes with that set before installation.</w:t>
+        <w:t>Sign only the exact reviewed set of packages and associated files. Link their identities to the evidence and decision in the release record. Record and verify the selected cache backend's signing behavior. Do not assume an Open Container Initiative (OCI) registry meets Spack 1.2.2 native signing requirements. Package signatures do not authenticate the whole cache index or prove CSE release membership. Under shared procedure Section 10.1, record the allowed full hashes in the authenticated release record, whose source and integrity have been verified. The installer must compare selected hashes with that set before installation.</w:t>
       </w:r>
     </w:p>
     <w:p>
@@ -5018,7 +5210,7 @@
           <w:b w:val="0"/>
           <w:i w:val="0"/>
         </w:rPr>
-        <w:t>Review the release key at least annually. Retain old public keys while retained releases need verification. Rotation, expiration, revocation, or suspected exposure receives a recorded security/release disposition under Section 12.</w:t>
+        <w:t>Review the release key at least annually. Keep old public keys while retained releases need verification. Record the applicable security or release decision for key replacement, expiration, revocation, or suspected disclosure under Section 12.</w:t>
       </w:r>
     </w:p>
     <w:p>
@@ -5040,7 +5232,7 @@
           <w:b w:val="0"/>
           <w:i w:val="0"/>
         </w:rPr>
-        <w:t xml:space="preserve">Follow the shared </w:t>
+        <w:t xml:space="preserve">Use the shared </w:t>
       </w:r>
       <w:hyperlink r:id="rId10" w:history="1" w:anchor="procedure_catalog_publication">
         <w:r>
@@ -5058,7 +5250,7 @@
           <w:b w:val="0"/>
           <w:i w:val="0"/>
         </w:rPr>
-        <w:t>. Publish the accepted restricted catalog after restricted validation and the build-cache gate. The catalog remains an independent configuration product; this sequence defines CSE's release order.</w:t>
+        <w:t>. Publish the accepted restricted catalog once restricted validation and build-cache checks pass. The catalog remains a separate configuration product; CSE publishes it in this release order.</w:t>
       </w:r>
     </w:p>
     <w:p>
@@ -5068,7 +5260,7 @@
           <w:b w:val="0"/>
           <w:i w:val="0"/>
         </w:rPr>
-        <w:t>Require the versioned public tree, publication approval record, checksum inventory, original catalog identity, and approved consumer-facing paths, using the records defined in the shared procedure. Use CSE's published permissions from Section 4 and test access from outside the CSE group. Retain the restricted original. CSE's own workspaces continue to use the restricted catalog identity; external package managers pin the public versioned catalog.</w:t>
+        <w:t>Before publication, require and retain the versioned public tree, publication approval record, checksum inventory, original catalog identity, and approved user-facing paths required by the shared procedure. Apply Section 4's published permissions and test access outside CSE. Retain the restricted original for CSE workspaces; external package managers pin the versioned public catalog.</w:t>
       </w:r>
     </w:p>
     <w:p>
@@ -5090,7 +5282,7 @@
           <w:b w:val="0"/>
           <w:i w:val="0"/>
         </w:rPr>
-        <w:t xml:space="preserve">Follow the shared </w:t>
+        <w:t xml:space="preserve">Use the shared </w:t>
       </w:r>
       <w:hyperlink r:id="rId10" w:history="1" w:anchor="procedure_cache_publication">
         <w:r>
@@ -5108,7 +5300,7 @@
           <w:b w:val="0"/>
           <w:i w:val="0"/>
         </w:rPr>
-        <w:t>. CSE prepares a separate publication workspace from the same approved package and platform inputs, applies its publication deployment record, and carries over the approved lockfiles. Do not copy the mutable restricted workspace, reconcretize, or substitute the public catalog as a new configuration authority.</w:t>
+        <w:t>. Prepare a separate publication workspace from the same approved package and platform inputs, its publication deployment record, and approved lockfiles. Do not copy the changeable restricted workspace, reconcretize, or replace the restricted catalog with the public catalog as the configuration source.</w:t>
       </w:r>
     </w:p>
     <w:p>
@@ -5118,7 +5310,7 @@
           <w:b w:val="0"/>
           <w:i w:val="0"/>
         </w:rPr>
-        <w:t xml:space="preserve">The publication deployment and effective Spack package permissions retain the recorded CSE group with </w:t>
+        <w:t xml:space="preserve">Retain the recorded CSE group and effective Spack permissions </w:t>
       </w:r>
       <w:r>
         <w:rPr>
@@ -5150,7 +5342,7 @@
           <w:b w:val="0"/>
           <w:i w:val="0"/>
         </w:rPr>
-        <w:t>. This access policy is a deployment choice, not a platform-catalog fact. A missing or unverified cache object stops publication and returns to restricted preparation; a changed input or required hash creates a new candidate.</w:t>
+        <w:t xml:space="preserve"> in the publication deployment. These are deployment choices, not catalog facts. A missing or unverified cache object stops publication and returns to restricted preparation. Changed inputs or required hashes create a new candidate.</w:t>
       </w:r>
     </w:p>
     <w:p>
@@ -5160,7 +5352,7 @@
           <w:b w:val="0"/>
           <w:i w:val="0"/>
         </w:rPr>
-        <w:t>After cache installation, verify package signatures and each hash's membership in the permitted set bound to the authenticated release record. Accept the destination's runtime behavior, module/view presentation, and permissions. Verify management access with the second CSE account and read/execute plus denied write with a non-CSE account on the relevant node types. Perform write probes in designated test locations without changing approved artifact bytes.</w:t>
+        <w:t>After installation, verify signatures and confirm every hash belongs to the allowed set in the authenticated release record. Check destination runtime, modules and views, and permissions. On relevant node types, use the second CSE account to verify management access, and a non-CSE account to verify read and execute access with writes denied. Test writes only in designated locations without changing approved files.</w:t>
       </w:r>
     </w:p>
     <w:p>
@@ -5170,7 +5362,7 @@
           <w:b w:val="0"/>
           <w:i w:val="0"/>
         </w:rPr>
-        <w:t>The reviewer records the result and the delegated release authority approves user exposure. Publish a new version and update the discovery/default pointer only after acceptance; do not repair an accepted release in place.</w:t>
+        <w:t>The reviewer records results; the delegated release authority approves access for users. Only then publish the new version and update the discovery or default pointer. Do not repair accepted releases in place.</w:t>
       </w:r>
     </w:p>
     <w:p>
@@ -5192,7 +5384,7 @@
           <w:b w:val="0"/>
           <w:i w:val="0"/>
         </w:rPr>
-        <w:t>Use shared procedure Section 10.4 for SBOM and external-inventory handling. Bind the retained producer SBOMs and their digests to the accepted release. Record any destination-generated SBOM separately; installation hooks can regenerate metadata, so equal Spack hashes do not require equal SBOM bytes. Compare expected package/component identities and retain the platform-owned external inventory. Use the approved vulnerability analysis process rather than interpreting an SBOM as a scan result.</w:t>
+        <w:t>Handle SBOMs and external inventories under shared procedure Section 10.4. Link the SBOMs generated where the binaries were built, and their checksums, to the accepted release. Keep any destination-generated SBOM separately: installation hooks may regenerate metadata, so matching Spack hashes need not produce identical SBOM files. Compare expected package and component identities and retain the platform-owned external inventory. Use the approved vulnerability analysis process; an SBOM is not a scan result.</w:t>
       </w:r>
     </w:p>
     <w:p>
@@ -5214,7 +5406,7 @@
           <w:b w:val="0"/>
           <w:i w:val="0"/>
         </w:rPr>
-        <w:t>Use shared procedure Section 11 for clean-session module, runtime, and access checks. CSE's public entrance is:</w:t>
+        <w:t>Check modules, execution, and access in clean sessions under shared procedure Section 11. Users enter the CSE stack with:</w:t>
       </w:r>
     </w:p>
     <w:p>
@@ -5249,7 +5441,7 @@
         <w:drawing>
           <wp:inline xmlns:a="http://schemas.openxmlformats.org/drawingml/2006/main" xmlns:pic="http://schemas.openxmlformats.org/drawingml/2006/picture">
             <wp:extent cx="6309360" cy="2782252"/>
-            <wp:docPr id="2" name="Picture 2" descr="CSE user module sequence showing compiler selection, Serial or MPI lane selection, and package loading, with ambient Foundation libraries and user-loadable Core tools." title="cse-user-module-flow"/>
+            <wp:docPr id="2" name="Picture 2" descr="Users select a compiler, choose Serial or MPI, and load a package. Foundation libraries are available automatically; Core tools are loaded through modules." title="cse-user-module-flow"/>
             <wp:cNvGraphicFramePr>
               <a:graphicFrameLocks noChangeAspect="1"/>
             </wp:cNvGraphicFramePr>
@@ -5289,7 +5481,7 @@
           <w:b w:val="0"/>
           <w:i w:val="0"/>
         </w:rPr>
-        <w:t>Figure 2. User access to the accepted CSE stack. The compiler and lane select the tested environment. Foundation libraries remain available through the selected view; Core tools and approved packages are exposed through modules.</w:t>
+        <w:t>Figure 2. User access to the accepted CSE stack. The compiler and lane select the tested environment. Foundation libraries are available through the view; users load Core tools and approved packages through modules.</w:t>
       </w:r>
     </w:p>
     <w:p>
@@ -5299,7 +5491,21 @@
           <w:b w:val="0"/>
           <w:i w:val="0"/>
         </w:rPr>
-        <w:t xml:space="preserve">The CSE gateway lives in the site's established module namespace, directly or through an approved symlink. It selects the accepted compiler surface and adds the release-owned lane-module root; the lane selects the corresponding Spack package-module root. Generated package modules and views remain under the published release. Normal users do not need </w:t>
+        <w:t xml:space="preserve">The </w:t>
+      </w:r>
+      <w:r>
+        <w:rPr>
+          <w:b/>
+          <w:i w:val="0"/>
+        </w:rPr>
+        <w:t>CSE gateway</w:t>
+      </w:r>
+      <w:r>
+        <w:rPr>
+          <w:b w:val="0"/>
+          <w:i w:val="0"/>
+        </w:rPr>
+        <w:t xml:space="preserve"> is the entry module in the site's established module namespace, directly or through an approved symbolic link. It selects the accepted compiler surface and adds that release's lane-module directory. The lane selects the matching Spack package-module directory. Generated modules and views stay under the published release. Users need no </w:t>
       </w:r>
       <w:r>
         <w:rPr>
@@ -5315,7 +5521,7 @@
           <w:b w:val="0"/>
           <w:i w:val="0"/>
         </w:rPr>
-        <w:t>, Spack hashes, package prefixes, or a local Spack installation to use the accepted software.</w:t>
+        <w:t>, Spack hashes, installation paths, or local Spack installation.</w:t>
       </w:r>
     </w:p>
     <w:p>
@@ -5325,7 +5531,7 @@
           <w:b w:val="0"/>
           <w:i w:val="0"/>
         </w:rPr>
-        <w:t xml:space="preserve">The compiler front door activates its exact chain and records </w:t>
+        <w:t xml:space="preserve">The compiler-entry module activates its exact module chain and records </w:t>
       </w:r>
       <w:r>
         <w:rPr>
@@ -5453,7 +5659,23 @@
           <w:b w:val="0"/>
           <w:i w:val="0"/>
         </w:rPr>
-        <w:t>. A CSE-built MPI lane loads its exact provider module. A platform Cray MPI lane uses the reviewed module supplied by its selected PrgEnv/CPE chain and does not silently replace that chain.</w:t>
+        <w:t>. CSE-built MPI loads its exact provider module. Platform Cray MPI uses the reviewed module from its selected programming-environment (</w:t>
+      </w:r>
+      <w:r>
+        <w:rPr>
+          <w:rFonts w:ascii="Courier New" w:hAnsi="Courier New"/>
+          <w:b w:val="0"/>
+          <w:i w:val="0"/>
+          <w:sz w:val="18"/>
+        </w:rPr>
+        <w:t>PrgEnv</w:t>
+      </w:r>
+      <w:r>
+        <w:rPr>
+          <w:b w:val="0"/>
+          <w:i w:val="0"/>
+        </w:rPr>
+        <w:t>) and Cray Programming Environment (CPE) module chain, without silently replacing the chain.</w:t>
       </w:r>
     </w:p>
     <w:p>
@@ -5463,7 +5685,7 @@
           <w:b w:val="0"/>
           <w:i w:val="0"/>
         </w:rPr>
-        <w:t xml:space="preserve">For CSE-built compilers with external Cray MPICH, accept the ordinary-user wrapper interface separately from the completed Spack builds. It exposes the exact-prefix </w:t>
+        <w:t xml:space="preserve">With CSE-built compilers and external Cray MPICH, test and accept the compiler wrappers users will run separately. Successful Spack builds alone do not verify that user interface. Expose </w:t>
       </w:r>
       <w:r>
         <w:rPr>
@@ -5543,7 +5765,7 @@
           <w:b w:val="0"/>
           <w:i w:val="0"/>
         </w:rPr>
-        <w:t xml:space="preserve">, binds the </w:t>
+        <w:t xml:space="preserve"> from the exact approved installation, set </w:t>
       </w:r>
       <w:r>
         <w:rPr>
@@ -5559,7 +5781,7 @@
           <w:b w:val="0"/>
           <w:i w:val="0"/>
         </w:rPr>
-        <w:t xml:space="preserve"> compiler overrides to the CSE front door, and avoids loading a compiler-selecting </w:t>
+        <w:t xml:space="preserve"> compiler overrides to the CSE compiler-entry module, and avoid compiler-selecting </w:t>
       </w:r>
       <w:r>
         <w:rPr>
@@ -5575,7 +5797,7 @@
           <w:b w:val="0"/>
           <w:i w:val="0"/>
         </w:rPr>
-        <w:t>. Require a native multi-node launch through the site-approved scheduler/launcher before exposing this selector.</w:t>
+        <w:t xml:space="preserve"> modules. Require a native multi-node launch through the approved scheduler and launcher before making this selector available to users.</w:t>
       </w:r>
     </w:p>
     <w:p>
@@ -5585,7 +5807,7 @@
           <w:b w:val="0"/>
           <w:i w:val="0"/>
         </w:rPr>
-        <w:t>Foundation libraries remain ambient without package modules. Core tools and payloads use the approved projections. Serial and MPI selections conflict; versioned modules express tested dependency loads/conflicts. Test a version-sensitive combination such as NetCDF-C and its exact public HDF5 dependency, including rejection of an incompatible simultaneous HDF5 load.</w:t>
+        <w:t>Foundation libraries are available without package modules. Use approved module and view naming rules for Core tools and application packages. Serial and MPI selections conflict. Versioned modules load tested dependencies and reject conflicts. Test a version-sensitive combination such as NetCDF-C with its exact public HDF5 dependency, including rejection of an incompatible HDF5 loaded at the same time.</w:t>
       </w:r>
     </w:p>
     <w:p>
@@ -5595,7 +5817,7 @@
           <w:b w:val="0"/>
           <w:i w:val="0"/>
         </w:rPr>
-        <w:t>Candidate module paths are allowed during validation. In accepted clean login and compute shells, generated package roots must be absent before the gateway is loaded, and only the selected accepted roots may appear afterward.</w:t>
+        <w:t>Proposed-release module paths are allowed during validation. In accepted clean login and compute shells, generated package-module directories must be absent before loading the gateway. Afterward, only selected accepted directories may appear.</w:t>
       </w:r>
     </w:p>
     <w:p>
@@ -5617,7 +5839,7 @@
           <w:b w:val="0"/>
           <w:i w:val="0"/>
         </w:rPr>
-        <w:t>The compiler-surface/lane sequence is CSE's primary presentation. If additional fully qualified module names are published, define them in a separate named Spack module set and module root. They refer to the same accepted specs and prefixes, with no separate build, environment, view, or install tree.</w:t>
+        <w:t>Compiler then lane remains CSE's main module sequence. If publishing additional fully qualified names, use a separate named Spack module set and directory. These aliases use the same accepted specs and installation paths, with no separate build, environment, view, or install tree.</w:t>
       </w:r>
     </w:p>
     <w:p>
@@ -5627,7 +5849,7 @@
           <w:b w:val="0"/>
           <w:i w:val="0"/>
         </w:rPr>
-        <w:t>Qualified Serial names include package and compiler versions; MPI names also include the provider and version. Use the common module refresh/inspection procedure for each enabled set. Alias modulefiles must resolve to the same prefix/hash and conflict with each other. Record clean login and batch results and the approved public presentation. If both are public, keep the lane presentation as the documented entrance.</w:t>
+        <w:t>Serial names include package and compiler versions; MPI names also include provider and version. Refresh and inspect each enabled set with the shared procedure. Aliases must resolve to the same installation path and hash and conflict with each other. Record clean login and batch results and approved names. If both sets are public, document the lane sequence as the main entrance.</w:t>
       </w:r>
     </w:p>
     <w:p>
@@ -5649,7 +5871,7 @@
           <w:b w:val="0"/>
           <w:i w:val="0"/>
         </w:rPr>
-        <w:t>Follow shared procedure Section 12 for change handling, advisory assessment, platform revalidation, withdrawal, and replacement. A build-defining root, version, variant, recipe, patch, repository revision/order, compiler, MPI/GPU provider, catalog scope, Spack runtime, external identity, environment, or lockfile change creates a new CSE candidate/release. Reuse unchanged packages only with matching full hashes and applicable retained provenance/approval.</w:t>
+        <w:t>Use shared procedure Section 12 for changes, security advisories, platform checks, withdrawal, and replacement. Create a new CSE candidate or release when build-defining requested packages, versions, variants, recipes, patches, repository revisions or search order, compilers, MPI or GPU providers, catalog scopes, Spack, externals, environments, or lockfiles change. Reuse unchanged packages only with matching full hashes and retained records of their inputs, build history, and approval that still apply.</w:t>
       </w:r>
     </w:p>
     <w:p>
@@ -5659,7 +5881,7 @@
           <w:b w:val="0"/>
           <w:i w:val="0"/>
         </w:rPr>
-        <w:t>CSE uses the approved support queue as its system of record. Assign advisory ownership to one team member; the other reviews the affected-release assessment and remediation evidence. Include transferred destination releases and their local contacts. Refresh vulnerability/scan intelligence on systems with limited or no external access through the approved update route and record its currency. A missed update or newly discovered finding requires a recorded disposition.</w:t>
+        <w:t>Keep the official record in the approved support queue. One team member owns advisory response; the other reviews affected releases and corrective results. Include transferred releases and destination contacts. On restricted networks, refresh vulnerability and scan information through the approved route and record how current it is. Record a decision for missed updates or new findings.</w:t>
       </w:r>
     </w:p>
     <w:p>
@@ -5669,7 +5891,7 @@
           <w:b w:val="0"/>
           <w:i w:val="0"/>
         </w:rPr>
-        <w:t>Use these CSE response targets unless an applicable stricter policy is recorded:</w:t>
+        <w:t>Use these targets unless a recorded stricter policy applies:</w:t>
       </w:r>
     </w:p>
     <w:tbl>
@@ -5992,7 +6214,7 @@
           <w:b w:val="0"/>
           <w:i w:val="0"/>
         </w:rPr>
-        <w:t>Escalate the cases in Section 2.2 through the existing security process. Immediate containment follows incident authority; planned release approval must not delay required containment. Notices identify affected releases, temporary actions, replacement, retirement date, and support reference.</w:t>
+        <w:t>Handle Section 2.2 cases through the existing security process. Follow incident authority for immediate containment; release approval must not delay it. Notices name affected releases, temporary actions, replacement, retirement date, and support reference.</w:t>
       </w:r>
     </w:p>
     <w:p>
@@ -6002,7 +6224,7 @@
           <w:b w:val="0"/>
           <w:i w:val="0"/>
         </w:rPr>
-        <w:t>For OS, CPE, compiler, MPI, fabric, launcher, GPU, or platform-library changes, obtain the updated reviewed platform/catalog evidence and use the common compatibility and runtime checks to decide revalidation, continued pinning, rebuild, or hold. A changed default module alone proves neither compatibility nor incompatibility.</w:t>
+        <w:t>For OS, CPE, compiler, MPI, fabric, launcher, GPU, or platform-library changes, obtain updated reviewed platform and catalog evidence. Use shared compatibility and runtime checks to decide whether to retest, keep the current pin, rebuild, or hold. A changed default module alone does not settle compatibility.</w:t>
       </w:r>
     </w:p>
     <w:p>
@@ -6024,7 +6246,7 @@
           <w:b w:val="0"/>
           <w:i w:val="0"/>
         </w:rPr>
-        <w:t>Apply shared procedure Section 13 with these CSE retention requirements, unless a documented applicable site/security decision supersedes them:</w:t>
+        <w:t>Apply shared procedure Section 13 and these CSE retention requirements unless a documented site or security decision supersedes them:</w:t>
       </w:r>
     </w:p>
     <w:p>
@@ -6092,7 +6314,7 @@
           <w:b w:val="0"/>
           <w:i w:val="0"/>
         </w:rPr>
-        <w:t>Retain a build-cache hash while a retained lockfile refers to it; wait at least 30 further days after the last referring release is removed before cache pruning.</w:t>
+        <w:t>Keep a build-cache hash while any retained lockfile refers to it. Wait at least 30 more days after removing the last referring release before pruning it.</w:t>
       </w:r>
     </w:p>
     <w:p>
@@ -6109,7 +6331,7 @@
           <w:b w:val="0"/>
           <w:i w:val="0"/>
         </w:rPr>
-        <w:t>Retain manifests, lockfiles, SBOMs, reviews/approvals, security decisions, test evidence, and transfer/destination acceptance records for at least three years, subject to the destination's handling rules.</w:t>
+        <w:t>Keep manifests, lockfiles, SBOMs, reviews and approvals, security decisions, test evidence, and transfer and destination acceptance records for at least three years, subject to destination handling rules.</w:t>
       </w:r>
     </w:p>
     <w:p>
@@ -6119,7 +6341,7 @@
           <w:b w:val="0"/>
           <w:i w:val="0"/>
         </w:rPr>
-        <w:t>Retain or reference the admitted sources, recipes, and tool prerequisites needed to rebuild supported releases, including disconnected destinations, and record the selected retention period in the operating record. Preserve failed-workspace evidence and the last accepted checkpoint until the replacement is accepted. Reuse a candidate only for an operational retry with unchanged defining inputs; otherwise create a new candidate.</w:t>
+        <w:t>Keep or reference approved sources, recipes, and tools needed to rebuild supported releases, including disconnected destinations. Record their retention period. Preserve failed-workspace evidence and the last accepted checkpoint until the replacement is accepted. Reuse a candidate only to retry operations with unchanged defining inputs; otherwise create a new one.</w:t>
       </w:r>
     </w:p>
     <w:p>
@@ -6129,7 +6351,7 @@
           <w:b w:val="0"/>
           <w:i w:val="0"/>
         </w:rPr>
-        <w:t>Rollback selects a retained release that remains acceptable under current security findings. It changes the supported pointer or module default without editing either release. Do not restore an exposed release merely because it was previously approved.</w:t>
+        <w:t>Rollback selects a retained release still acceptable under current security findings. Change the supported pointer or module default without editing either release. Do not restore a release that is no longer acceptable under current security findings based only on its earlier approval.</w:t>
       </w:r>
     </w:p>
     <w:p>
@@ -6151,7 +6373,7 @@
           <w:b w:val="0"/>
           <w:i w:val="0"/>
         </w:rPr>
-        <w:t>Use the common release record in shared procedure Section 14. CSE adds the controlled roster and cross-environment checks, restricted/public catalog relationship, CSE permissions, compiler/lane/module acceptance, and the transfer records when applicable. The record links the builder's execution evidence, independent review, release authority's decision, and the exact approved candidate/artifact identities.</w:t>
+        <w:t>To the release record in shared procedure Section 14, add CSE's approved package list, cross-environment checks, relationship between the restricted and public catalogs, permissions, compiler, lane, and module acceptance, and applicable transfer records. Link builder evidence, independent review, the release decision, and exact approved input and output identities.</w:t>
       </w:r>
     </w:p>
     <w:p>
@@ -6161,7 +6383,7 @@
           <w:b w:val="0"/>
           <w:i w:val="0"/>
         </w:rPr>
-        <w:t>Complete the system roots, contacts, approved security baseline, scanner/update process, signing authority/backend, transfer route when used, support channel, and named CSE assignments before the corresponding operation. Track remaining values explicitly as open prerequisites; this draft does not assign unknown people or certify unavailable controls.</w:t>
+        <w:t>Before each operation, record its system paths, contacts, security requirements, scanner and update process, signing authority and backend, transfer route if used, support channel, and named CSE roles. List missing values as open prerequisites. This draft does not assign unnamed people or certify controls not yet in place.</w:t>
       </w:r>
     </w:p>
     <w:p>
@@ -6183,7 +6405,7 @@
           <w:b w:val="0"/>
           <w:i w:val="0"/>
         </w:rPr>
-        <w:t>Common terms, including source mirror, build cache, lockfile, environment, scope, and transfer, are defined in the shared procedure.</w:t>
+        <w:t>The shared procedure defines common terms such as source mirror, build cache, lockfile, environment, configuration scope, and transfer.</w:t>
       </w:r>
     </w:p>
     <w:p>
@@ -6193,28 +6415,28 @@
           <w:b/>
           <w:i w:val="0"/>
         </w:rPr>
-        <w:t>CSE restricted catalog</w:t>
+        <w:t>CSE restricted catalog:</w:t>
       </w:r>
       <w:r>
         <w:rPr>
           <w:b w:val="0"/>
           <w:i w:val="0"/>
         </w:rPr>
-        <w:t xml:space="preserve"> is the retained configuration release used to prepare both CSE workspaces. </w:t>
+        <w:t xml:space="preserve"> the retained configuration release used for both CSE workspaces. </w:t>
       </w:r>
       <w:r>
         <w:rPr>
           <w:b/>
           <w:i w:val="0"/>
         </w:rPr>
-        <w:t>CSE public catalog</w:t>
+        <w:t>CSE public catalog:</w:t>
       </w:r>
       <w:r>
         <w:rPr>
           <w:b w:val="0"/>
           <w:i w:val="0"/>
         </w:rPr>
-        <w:t xml:space="preserve"> is its separately accepted configuration publication for external package managers.</w:t>
+        <w:t xml:space="preserve"> its separately accepted publication for external package managers.</w:t>
       </w:r>
     </w:p>
     <w:p>
@@ -6224,14 +6446,14 @@
           <w:b/>
           <w:i w:val="0"/>
         </w:rPr>
-        <w:t>CSE package roster</w:t>
+        <w:t>CSE package roster:</w:t>
       </w:r>
       <w:r>
         <w:rPr>
           <w:b w:val="0"/>
           <w:i w:val="0"/>
         </w:rPr>
-        <w:t xml:space="preserve"> is the approved list of package roots, versions, variants, and supported combinations recorded for the release; Section 7.2 defines its selection policy.</w:t>
+        <w:t xml:space="preserve"> the approved list of requested packages, versions, variants, and supported combinations. Section 7.2 sets the selection rules.</w:t>
       </w:r>
     </w:p>
     <w:p>
@@ -6241,42 +6463,42 @@
           <w:b/>
           <w:i w:val="0"/>
         </w:rPr>
-        <w:t>Foundation</w:t>
+        <w:t>Foundation:</w:t>
       </w:r>
       <w:r>
         <w:rPr>
           <w:b w:val="0"/>
           <w:i w:val="0"/>
         </w:rPr>
-        <w:t xml:space="preserve"> means the pinned support libraries made available through the selected view without individual package modules. </w:t>
+        <w:t xml:space="preserve"> pinned support libraries available through the selected view, without individual package modules. </w:t>
       </w:r>
       <w:r>
         <w:rPr>
           <w:b/>
           <w:i w:val="0"/>
         </w:rPr>
-        <w:t>Core</w:t>
+        <w:t>Core:</w:t>
       </w:r>
       <w:r>
         <w:rPr>
           <w:b w:val="0"/>
           <w:i w:val="0"/>
         </w:rPr>
-        <w:t xml:space="preserve"> contains those libraries and user-loadable tools. </w:t>
+        <w:t xml:space="preserve"> Foundation plus user-loadable tools. </w:t>
       </w:r>
       <w:r>
         <w:rPr>
           <w:b/>
           <w:i w:val="0"/>
         </w:rPr>
-        <w:t>Common</w:t>
+        <w:t>Common:</w:t>
       </w:r>
       <w:r>
         <w:rPr>
           <w:b w:val="0"/>
           <w:i w:val="0"/>
         </w:rPr>
-        <w:t xml:space="preserve"> contains compiler-dependent packages shared by the Serial and MPI environments.</w:t>
+        <w:t xml:space="preserve"> compiler-dependent packages shared by Serial and MPI.</w:t>
       </w:r>
     </w:p>
     <w:p>
@@ -6286,42 +6508,42 @@
           <w:b/>
           <w:i w:val="0"/>
         </w:rPr>
-        <w:t>CSE compiler surface</w:t>
+        <w:t>Compiler surface:</w:t>
       </w:r>
       <w:r>
         <w:rPr>
           <w:b w:val="0"/>
           <w:i w:val="0"/>
         </w:rPr>
-        <w:t xml:space="preserve"> is one selected compiler and its associated Core, Common, Serial, MPI, and any approved GPU environments. A </w:t>
+        <w:t xml:space="preserve"> one compiler with its Core, Common, Serial, MPI, and approved GPU environments. </w:t>
       </w:r>
       <w:r>
         <w:rPr>
           <w:b/>
           <w:i w:val="0"/>
         </w:rPr>
-        <w:t>lane</w:t>
+        <w:t>Lane:</w:t>
       </w:r>
       <w:r>
         <w:rPr>
           <w:b w:val="0"/>
           <w:i w:val="0"/>
         </w:rPr>
-        <w:t xml:space="preserve"> is a selected Serial, MPI, or GPU software environment. The </w:t>
+        <w:t xml:space="preserve"> a selected Serial, MPI, or GPU environment. </w:t>
       </w:r>
       <w:r>
         <w:rPr>
           <w:b/>
           <w:i w:val="0"/>
         </w:rPr>
-        <w:t>CSE gateway</w:t>
+        <w:t>CSE gateway:</w:t>
       </w:r>
       <w:r>
         <w:rPr>
           <w:b w:val="0"/>
           <w:i w:val="0"/>
         </w:rPr>
-        <w:t xml:space="preserve"> is the module entry point that selects the compiler surface and makes its lane selectors available, as defined in Section 11.</w:t>
+        <w:t xml:space="preserve"> the entry module that selects the compiler surface and makes its lane selectors available (Section 11).</w:t>
       </w:r>
     </w:p>
     <w:p>
@@ -6331,14 +6553,14 @@
           <w:b/>
           <w:i w:val="0"/>
         </w:rPr>
-        <w:t>CSE published release</w:t>
+        <w:t>CSE published release:</w:t>
       </w:r>
       <w:r>
         <w:rPr>
           <w:b w:val="0"/>
           <w:i w:val="0"/>
         </w:rPr>
-        <w:t xml:space="preserve"> is the accepted cache-installed software, views, modules, and release evidence exposed to the approved users.</w:t>
+        <w:t xml:space="preserve"> accepted cache-installed software, views, modules, and release records made available to approved users.</w:t>
       </w:r>
     </w:p>
     <w:sectPr>
@@ -6357,17 +6579,16 @@
   <w:p>
     <w:pPr>
       <w:pStyle w:val="Footer"/>
+      <w:spacing w:after="0"/>
       <w:jc w:val="right"/>
     </w:pPr>
-    <w:r>
-      <w:rPr>
-        <w:color w:val="666666"/>
-        <w:sz w:val="18"/>
-      </w:rPr>
-      <w:t xml:space="preserve">CSE Spack SOP  |  </w:t>
-    </w:r>
     <w:fldSimple w:instr="PAGE">
       <w:r>
+        <w:rPr>
+          <w:rFonts w:ascii="Arial" w:hAnsi="Arial"/>
+          <w:sz w:val="18"/>
+          <w:color w:val="000000"/>
+        </w:rPr>
         <w:t>1</w:t>
       </w:r>
     </w:fldSimple>

</xml_diff>

<commit_message>
Align SOP handoffs and refresh Word review copies
</commit_message>
<xml_diff>
--- a/docs/word-documents/cse_software_stack_sop_v1.docx
+++ b/docs/word-documents/cse_software_stack_sop_v1.docx
@@ -21,7 +21,7 @@
           <w:b w:val="0"/>
           <w:i w:val="0"/>
         </w:rPr>
-        <w:t>This standard operating procedure (SOP) is for teammates who build, review, and release CSE software. It explains who does each step, what to record, and when the software is ready for users.</w:t>
+        <w:t>This standard operating procedure (SOP) is for teammates who build, review, and release software for the Computational Science Environment (CSE). It explains who does each step, what to record, and when the software is ready for users.</w:t>
       </w:r>
     </w:p>
     <w:tbl>
@@ -3887,7 +3887,7 @@
           <w:b w:val="0"/>
           <w:i w:val="0"/>
         </w:rPr>
-        <w:t xml:space="preserve">The public catalog is a separate configuration release for package managers outside CSE. Include reviewed Spack configuration, a contents and identity inventory, supported platform and provider combinations, instructions, and approval. Exclude restricted workspaces, package installation paths, private caches, and signing material. Consumers pin its versioned path; </w:t>
+        <w:t xml:space="preserve">The public catalog is a separate configuration release for package managers outside CSE. Include reviewed Spack configuration, a contents and identity inventory, supported platform and provider combinations, instructions, and approval. Exclude restricted workspaces, CSE-managed package installation paths, private caches, and signing material. Consumers pin its versioned path; </w:t>
       </w:r>
       <w:r>
         <w:rPr>
@@ -5765,7 +5765,7 @@
           <w:b w:val="0"/>
           <w:i w:val="0"/>
         </w:rPr>
-        <w:t xml:space="preserve"> from the exact approved installation, set </w:t>
+        <w:t xml:space="preserve"> from the exact approved installation, set the </w:t>
       </w:r>
       <w:r>
         <w:rPr>
@@ -5781,7 +5781,7 @@
           <w:b w:val="0"/>
           <w:i w:val="0"/>
         </w:rPr>
-        <w:t xml:space="preserve"> compiler overrides to the CSE compiler-entry module, and avoid compiler-selecting </w:t>
+        <w:t xml:space="preserve"> compiler overrides in the CSE compiler-entry module to the accepted CSE compiler executables, and avoid compiler-selecting </w:t>
       </w:r>
       <w:r>
         <w:rPr>

</xml_diff>

<commit_message>
Refresh Word SOPs and security review documents
</commit_message>
<xml_diff>
--- a/docs/word-documents/cse_software_stack_sop_v1.docx
+++ b/docs/word-documents/cse_software_stack_sop_v1.docx
@@ -3,6 +3,7 @@
 <w:document xmlns:wpc="http://schemas.microsoft.com/office/word/2010/wordprocessingCanvas" xmlns:mo="http://schemas.microsoft.com/office/mac/office/2008/main" xmlns:mc="http://schemas.openxmlformats.org/markup-compatibility/2006" xmlns:mv="urn:schemas-microsoft-com:mac:vml" xmlns:o="urn:schemas-microsoft-com:office:office" xmlns:r="http://schemas.openxmlformats.org/officeDocument/2006/relationships" xmlns:m="http://schemas.openxmlformats.org/officeDocument/2006/math" xmlns:v="urn:schemas-microsoft-com:vml" xmlns:wp14="http://schemas.microsoft.com/office/word/2010/wordprocessingDrawing" xmlns:wp="http://schemas.openxmlformats.org/drawingml/2006/wordprocessingDrawing" xmlns:w10="urn:schemas-microsoft-com:office:word" xmlns:w="http://schemas.openxmlformats.org/wordprocessingml/2006/main" xmlns:w14="http://schemas.microsoft.com/office/word/2010/wordml" xmlns:wpg="http://schemas.microsoft.com/office/word/2010/wordprocessingGroup" xmlns:wpi="http://schemas.microsoft.com/office/word/2010/wordprocessingInk" xmlns:wne="http://schemas.microsoft.com/office/word/2006/wordml" xmlns:wps="http://schemas.microsoft.com/office/word/2010/wordprocessingShape" mc:Ignorable="w14 wp14">
   <w:body>
     <w:p>
+      <w:bookmarkStart w:id="1000" w:name="s_b60ddbd4121033fd66060164"/>
       <w:pPr>
         <w:pStyle w:val="Title"/>
       </w:pPr>
@@ -13,9 +14,9 @@
         </w:rPr>
         <w:t>CSE Spack Build and Publication Procedure</w:t>
       </w:r>
+      <w:bookmarkEnd w:id="1000"/>
     </w:p>
     <w:p>
-      <w:pPr/>
       <w:r>
         <w:rPr>
           <w:b w:val="0"/>
@@ -188,7 +189,7 @@
                 <w:i w:val="0"/>
                 <w:sz w:val="20"/>
               </w:rPr>
-              <w:t>2026-09-10</w:t>
+              <w:t>2026-09-16</w:t>
             </w:r>
           </w:p>
         </w:tc>
@@ -323,14 +324,13 @@
               <w:widowControl w:val="0"/>
               <w:spacing w:after="0" w:before="0" w:line="250" w:lineRule="auto"/>
             </w:pPr>
-            <w:hyperlink r:id="rId10" w:history="1">
+            <w:hyperlink r:id="rId10">
               <w:r>
                 <w:rPr>
                   <w:b w:val="0"/>
                   <w:i w:val="0"/>
+                  <w:color w:val="1F4E79"/>
                   <w:sz w:val="20"/>
-                  <w:color w:val="245A81"/>
-                  <w:u w:val="single"/>
                 </w:rPr>
                 <w:t>Spack build and publication procedure</w:t>
               </w:r>
@@ -341,7 +341,7 @@
     </w:tbl>
     <w:p>
       <w:pPr>
-        <w:spacing w:after="0" w:before="0" w:line="80" w:lineRule="exact"/>
+        <w:spacing w:after="60" w:before="0"/>
       </w:pPr>
       <w:r>
         <w:rPr>
@@ -350,6 +350,7 @@
       </w:r>
     </w:p>
     <w:p>
+      <w:bookmarkStart w:id="1001" w:name="s_a37908d64e37ab99d0eaeb03"/>
       <w:pPr>
         <w:pStyle w:val="Heading1"/>
       </w:pPr>
@@ -360,9 +361,9 @@
         </w:rPr>
         <w:t>Review priorities</w:t>
       </w:r>
+      <w:bookmarkEnd w:id="1001"/>
     </w:p>
     <w:p>
-      <w:pPr/>
       <w:r>
         <w:rPr>
           <w:b/>
@@ -379,7 +380,6 @@
       </w:r>
     </w:p>
     <w:p>
-      <w:pPr/>
       <w:r>
         <w:rPr>
           <w:b/>
@@ -396,7 +396,6 @@
       </w:r>
     </w:p>
     <w:p>
-      <w:pPr/>
       <w:r>
         <w:rPr>
           <w:b w:val="0"/>
@@ -428,7 +427,7 @@
       </w:tblPr>
       <w:tblGrid>
         <w:gridCol w:w="2385"/>
-        <w:gridCol w:w="5962"/>
+        <w:gridCol w:w="5961"/>
         <w:gridCol w:w="1590"/>
       </w:tblGrid>
       <w:tr>
@@ -460,7 +459,7 @@
         </w:tc>
         <w:tc>
           <w:tcPr>
-            <w:tcW w:type="dxa" w:w="5962"/>
+            <w:tcW w:type="dxa" w:w="5961"/>
             <w:vAlign w:val="center"/>
             <w:shd w:fill="EDF2F6"/>
           </w:tcPr>
@@ -530,7 +529,7 @@
         </w:tc>
         <w:tc>
           <w:tcPr>
-            <w:tcW w:type="dxa" w:w="5962"/>
+            <w:tcW w:type="dxa" w:w="5961"/>
             <w:vAlign w:val="center"/>
           </w:tcPr>
           <w:p>
@@ -598,7 +597,7 @@
         </w:tc>
         <w:tc>
           <w:tcPr>
-            <w:tcW w:type="dxa" w:w="5962"/>
+            <w:tcW w:type="dxa" w:w="5961"/>
             <w:vAlign w:val="center"/>
           </w:tcPr>
           <w:p>
@@ -666,7 +665,7 @@
         </w:tc>
         <w:tc>
           <w:tcPr>
-            <w:tcW w:type="dxa" w:w="5962"/>
+            <w:tcW w:type="dxa" w:w="5961"/>
             <w:vAlign w:val="center"/>
           </w:tcPr>
           <w:p>
@@ -734,7 +733,7 @@
         </w:tc>
         <w:tc>
           <w:tcPr>
-            <w:tcW w:type="dxa" w:w="5962"/>
+            <w:tcW w:type="dxa" w:w="5961"/>
             <w:vAlign w:val="center"/>
           </w:tcPr>
           <w:p>
@@ -778,7 +777,7 @@
     </w:tbl>
     <w:p>
       <w:pPr>
-        <w:spacing w:after="0" w:before="0" w:line="80" w:lineRule="exact"/>
+        <w:spacing w:after="60" w:before="0"/>
       </w:pPr>
       <w:r>
         <w:rPr>
@@ -787,7 +786,6 @@
       </w:r>
     </w:p>
     <w:p>
-      <w:pPr/>
       <w:r>
         <w:rPr>
           <w:b w:val="0"/>
@@ -797,6 +795,7 @@
       </w:r>
     </w:p>
     <w:p>
+      <w:bookmarkStart w:id="1002" w:name="s_4e656c7b6450ec476f453091"/>
       <w:pPr>
         <w:pStyle w:val="Heading1"/>
       </w:pPr>
@@ -807,9 +806,9 @@
         </w:rPr>
         <w:t>1. Purpose</w:t>
       </w:r>
+      <w:bookmarkEnd w:id="1002"/>
     </w:p>
     <w:p>
-      <w:pPr/>
       <w:r>
         <w:rPr>
           <w:b w:val="0"/>
@@ -817,13 +816,12 @@
         </w:rPr>
         <w:t xml:space="preserve">This SOP sets CSE's software choices, responsibilities, access rules, and acceptance conditions. The </w:t>
       </w:r>
-      <w:hyperlink r:id="rId10" w:history="1">
+      <w:hyperlink r:id="rId10">
         <w:r>
           <w:rPr>
             <w:b w:val="0"/>
             <w:i w:val="0"/>
-            <w:color w:val="245A81"/>
-            <w:u w:val="single"/>
+            <w:color w:val="1F4E79"/>
           </w:rPr>
           <w:t>shared procedure</w:t>
         </w:r>
@@ -837,7 +835,6 @@
       </w:r>
     </w:p>
     <w:p>
-      <w:pPr/>
       <w:r>
         <w:rPr>
           <w:b w:val="0"/>
@@ -917,7 +914,6 @@
       </w:r>
     </w:p>
     <w:p>
-      <w:pPr/>
       <w:r>
         <w:rPr>
           <w:b w:val="0"/>
@@ -927,7 +923,6 @@
       </w:r>
     </w:p>
     <w:p>
-      <w:pPr/>
       <w:r>
         <w:rPr>
           <w:b w:val="0"/>
@@ -937,6 +932,7 @@
       </w:r>
     </w:p>
     <w:p>
+      <w:bookmarkStart w:id="1003" w:name="s_323b9798c5ac36fbbf541f0b"/>
       <w:pPr>
         <w:pStyle w:val="Heading2"/>
       </w:pPr>
@@ -947,6 +943,7 @@
         </w:rPr>
         <w:t>1.1 Procedure map</w:t>
       </w:r>
+      <w:bookmarkEnd w:id="1003"/>
     </w:p>
     <w:tbl>
       <w:tblPr>
@@ -1286,14 +1283,13 @@
               <w:widowControl w:val="0"/>
               <w:spacing w:after="0" w:before="0" w:line="250" w:lineRule="auto"/>
             </w:pPr>
-            <w:hyperlink r:id="rId10" w:history="1" w:anchor="procedure_local_corrections">
+            <w:hyperlink r:id="rId13">
               <w:r>
                 <w:rPr>
                   <w:b w:val="0"/>
                   <w:i w:val="0"/>
+                  <w:color w:val="1F4E79"/>
                   <w:sz w:val="20"/>
-                  <w:color w:val="245A81"/>
-                  <w:u w:val="single"/>
                 </w:rPr>
                 <w:t>Local correction procedure</w:t>
               </w:r>
@@ -1358,14 +1354,13 @@
               <w:widowControl w:val="0"/>
               <w:spacing w:after="0" w:before="0" w:line="250" w:lineRule="auto"/>
             </w:pPr>
-            <w:hyperlink r:id="rId10" w:history="1" w:anchor="procedure_review">
+            <w:hyperlink r:id="rId14">
               <w:r>
                 <w:rPr>
                   <w:b w:val="0"/>
                   <w:i w:val="0"/>
+                  <w:color w:val="1F4E79"/>
                   <w:sz w:val="20"/>
-                  <w:color w:val="245A81"/>
-                  <w:u w:val="single"/>
                 </w:rPr>
                 <w:t>Review procedure</w:t>
               </w:r>
@@ -1430,14 +1425,13 @@
               <w:widowControl w:val="0"/>
               <w:spacing w:after="0" w:before="0" w:line="250" w:lineRule="auto"/>
             </w:pPr>
-            <w:hyperlink r:id="rId10" w:history="1" w:anchor="procedure_source_mirrors">
+            <w:hyperlink r:id="rId15">
               <w:r>
                 <w:rPr>
                   <w:b w:val="0"/>
                   <w:i w:val="0"/>
+                  <w:color w:val="1F4E79"/>
                   <w:sz w:val="20"/>
-                  <w:color w:val="245A81"/>
-                  <w:u w:val="single"/>
                 </w:rPr>
                 <w:t>Source mirror procedure</w:t>
               </w:r>
@@ -1502,14 +1496,13 @@
               <w:widowControl w:val="0"/>
               <w:spacing w:after="0" w:before="0" w:line="250" w:lineRule="auto"/>
             </w:pPr>
-            <w:hyperlink r:id="rId10" w:history="1" w:anchor="procedure_disconnected_transfer">
+            <w:hyperlink r:id="rId16">
               <w:r>
                 <w:rPr>
                   <w:b w:val="0"/>
                   <w:i w:val="0"/>
+                  <w:color w:val="1F4E79"/>
                   <w:sz w:val="20"/>
-                  <w:color w:val="245A81"/>
-                  <w:u w:val="single"/>
                 </w:rPr>
                 <w:t>Transfer procedure</w:t>
               </w:r>
@@ -1574,14 +1567,13 @@
               <w:widowControl w:val="0"/>
               <w:spacing w:after="0" w:before="0" w:line="250" w:lineRule="auto"/>
             </w:pPr>
-            <w:hyperlink r:id="rId10" w:history="1" w:anchor="procedure_build_validation">
+            <w:hyperlink r:id="rId17">
               <w:r>
                 <w:rPr>
                   <w:b w:val="0"/>
                   <w:i w:val="0"/>
+                  <w:color w:val="1F4E79"/>
                   <w:sz w:val="20"/>
-                  <w:color w:val="245A81"/>
-                  <w:u w:val="single"/>
                 </w:rPr>
                 <w:t>Build and validation procedure</w:t>
               </w:r>
@@ -1646,14 +1638,13 @@
               <w:widowControl w:val="0"/>
               <w:spacing w:after="0" w:before="0" w:line="250" w:lineRule="auto"/>
             </w:pPr>
-            <w:hyperlink r:id="rId10" w:history="1" w:anchor="procedure_signing">
+            <w:hyperlink r:id="rId18">
               <w:r>
                 <w:rPr>
                   <w:b w:val="0"/>
                   <w:i w:val="0"/>
+                  <w:color w:val="1F4E79"/>
                   <w:sz w:val="20"/>
-                  <w:color w:val="245A81"/>
-                  <w:u w:val="single"/>
                 </w:rPr>
                 <w:t>Signing</w:t>
               </w:r>
@@ -1666,14 +1657,13 @@
               </w:rPr>
               <w:t xml:space="preserve">, </w:t>
             </w:r>
-            <w:hyperlink r:id="rId10" w:history="1" w:anchor="procedure_catalog_publication">
+            <w:hyperlink r:id="rId19">
               <w:r>
                 <w:rPr>
                   <w:b w:val="0"/>
                   <w:i w:val="0"/>
+                  <w:color w:val="1F4E79"/>
                   <w:sz w:val="20"/>
-                  <w:color w:val="245A81"/>
-                  <w:u w:val="single"/>
                 </w:rPr>
                 <w:t>catalog publication</w:t>
               </w:r>
@@ -1686,14 +1676,13 @@
               </w:rPr>
               <w:t xml:space="preserve">, and </w:t>
             </w:r>
-            <w:hyperlink r:id="rId10" w:history="1" w:anchor="procedure_cache_publication">
+            <w:hyperlink r:id="rId20">
               <w:r>
                 <w:rPr>
                   <w:b w:val="0"/>
                   <w:i w:val="0"/>
+                  <w:color w:val="1F4E79"/>
                   <w:sz w:val="20"/>
-                  <w:color w:val="245A81"/>
-                  <w:u w:val="single"/>
                 </w:rPr>
                 <w:t>cache publication</w:t>
               </w:r>
@@ -1793,7 +1782,7 @@
     </w:tbl>
     <w:p>
       <w:pPr>
-        <w:spacing w:after="0" w:before="0" w:line="80" w:lineRule="exact"/>
+        <w:spacing w:after="60" w:before="0"/>
       </w:pPr>
       <w:r>
         <w:rPr>
@@ -1802,7 +1791,6 @@
       </w:r>
     </w:p>
     <w:p>
-      <w:pPr/>
       <w:r>
         <w:rPr>
           <w:b w:val="0"/>
@@ -1826,6 +1814,7 @@
       </w:r>
     </w:p>
     <w:p>
+      <w:bookmarkStart w:id="1004" w:name="s_96b405f97d63b578bf61bfcc"/>
       <w:pPr>
         <w:pStyle w:val="Heading1"/>
       </w:pPr>
@@ -1836,15 +1825,15 @@
         </w:rPr>
         <w:t>2. Responsibilities</w:t>
       </w:r>
+      <w:bookmarkEnd w:id="1004"/>
     </w:p>
     <w:p>
-      <w:pPr/>
       <w:r>
         <w:rPr>
           <w:b w:val="0"/>
           <w:i w:val="0"/>
         </w:rPr>
-        <w:t>Assign a builder and a separate qualified technical reviewer to each proposed release. Two CSE team members can perform the process and exchange roles between releases. Each person's decisions must be recorded under their own name.</w:t>
+        <w:t>Assign a builder and a separate qualified technical reviewer to each proposed release. Two CSE team members can perform the process and exchange roles between releases. Each person's decisions must be recorded under their own name. The release authority, system owner, or responsible security authority may designate a qualified reviewer outside CSE when independent scrutiny, specialist expertise, or a conflict of interest warrants it. The person may serve as the technical reviewer or provide an additional scoped assessment. Outside review is supported, not mandatory for every routine release.</w:t>
       </w:r>
     </w:p>
     <w:tbl>
@@ -2160,7 +2149,7 @@
     </w:tbl>
     <w:p>
       <w:pPr>
-        <w:spacing w:after="0" w:before="0" w:line="80" w:lineRule="exact"/>
+        <w:spacing w:after="60" w:before="0"/>
       </w:pPr>
       <w:r>
         <w:rPr>
@@ -2169,7 +2158,6 @@
       </w:r>
     </w:p>
     <w:p>
-      <w:pPr/>
       <w:r>
         <w:rPr>
           <w:b w:val="0"/>
@@ -2179,6 +2167,7 @@
       </w:r>
     </w:p>
     <w:p>
+      <w:bookmarkStart w:id="1005" w:name="s_d49ae16dcd0eb903f4159fe5"/>
       <w:pPr>
         <w:pStyle w:val="Heading2"/>
       </w:pPr>
@@ -2189,19 +2178,18 @@
         </w:rPr>
         <w:t>2.1 Two-person review and audit trail</w:t>
       </w:r>
+      <w:bookmarkEnd w:id="1005"/>
     </w:p>
     <w:p>
       <w:pPr>
         <w:keepNext/>
-        <w:keepLines/>
-        <w:spacing w:before="140" w:after="0"/>
         <w:jc w:val="center"/>
       </w:pPr>
       <w:r>
         <w:drawing>
           <wp:inline xmlns:a="http://schemas.openxmlformats.org/drawingml/2006/main" xmlns:pic="http://schemas.openxmlformats.org/drawingml/2006/picture">
             <wp:extent cx="6309360" cy="3154680"/>
-            <wp:docPr id="1" name="Picture 1" descr="CSE release steps: build and test, independent review, signing, catalog publication, installation from the build cache, destination checks, and approval for users." title="cse-release-ownership"/>
+            <wp:docPr id="1" name="Picture 1" descr="CSE release steps: build and test, independent review, signing, catalog publication, installation from the build cache, destination checks, and approval for users."/>
             <wp:cNvGraphicFramePr>
               <a:graphicFrameLocks noChangeAspect="1"/>
             </wp:cNvGraphicFramePr>
@@ -2209,7 +2197,7 @@
               <a:graphicData uri="http://schemas.openxmlformats.org/drawingml/2006/picture">
                 <pic:pic>
                   <pic:nvPicPr>
-                    <pic:cNvPr id="0" name="cse-release-ownership.png"/>
+                    <pic:cNvPr id="0" name="image.png"/>
                     <pic:cNvPicPr/>
                   </pic:nvPicPr>
                   <pic:blipFill>
@@ -2245,17 +2233,15 @@
       </w:r>
     </w:p>
     <w:p>
-      <w:pPr/>
       <w:r>
         <w:rPr>
           <w:b w:val="0"/>
           <w:i w:val="0"/>
         </w:rPr>
-        <w:t>The builder submits the release identity, inputs and changes, review scope and reasoning, test and scan results, unresolved items, and recommended decision. The reviewer records their name, date, evidence revision or checksum, decision, and conditions. Keep corrections and the reviewer's recheck of the revised release. Approval of earlier files does not approve later changes.</w:t>
+        <w:t>The builder submits the release identity, inputs and changes, review scope and reasoning, test and scan results, unresolved items, and recommended decision. The reviewer records their name, organization, relevant qualifications, independence, scope, date, evidence revision or checksum, decision, and conditions. Keep corrections and the reviewer's recheck of the revised release. Approval of earlier files does not approve later changes.</w:t>
       </w:r>
     </w:p>
     <w:p>
-      <w:pPr/>
       <w:r>
         <w:rPr>
           <w:b w:val="0"/>
@@ -2265,7 +2251,15 @@
       </w:r>
     </w:p>
     <w:p>
-      <w:pPr/>
+      <w:r>
+        <w:rPr>
+          <w:b w:val="0"/>
+          <w:i w:val="0"/>
+        </w:rPr>
+        <w:t>Provide an outside reviewer approved read-only access or an authorized evidence copy. Review assignment does not itself grant CSE build-write membership, signing credentials, publication authority, or authority to accept security risk. Record any such delegation separately through the responsible authority.</w:t>
+      </w:r>
+    </w:p>
+    <w:p>
       <w:r>
         <w:rPr>
           <w:b w:val="0"/>
@@ -2275,6 +2269,7 @@
       </w:r>
     </w:p>
     <w:p>
+      <w:bookmarkStart w:id="1006" w:name="s_a6b822fc55929e8e27d54015"/>
       <w:pPr>
         <w:pStyle w:val="Heading2"/>
       </w:pPr>
@@ -2285,9 +2280,9 @@
         </w:rPr>
         <w:t>2.2 Security review and decisions</w:t>
       </w:r>
+      <w:bookmarkEnd w:id="1006"/>
     </w:p>
     <w:p>
-      <w:pPr/>
       <w:r>
         <w:rPr>
           <w:b w:val="0"/>
@@ -2669,7 +2664,7 @@
     </w:tbl>
     <w:p>
       <w:pPr>
-        <w:spacing w:after="0" w:before="0" w:line="80" w:lineRule="exact"/>
+        <w:spacing w:after="60" w:before="0"/>
       </w:pPr>
       <w:r>
         <w:rPr>
@@ -2678,7 +2673,6 @@
       </w:r>
     </w:p>
     <w:p>
-      <w:pPr/>
       <w:r>
         <w:rPr>
           <w:b w:val="0"/>
@@ -2688,6 +2682,7 @@
       </w:r>
     </w:p>
     <w:p>
+      <w:bookmarkStart w:id="1007" w:name="s_56fae238b853f5947ea11f70"/>
       <w:pPr>
         <w:pStyle w:val="Heading1"/>
       </w:pPr>
@@ -2698,9 +2693,9 @@
         </w:rPr>
         <w:t>3. Required inputs</w:t>
       </w:r>
+      <w:bookmarkEnd w:id="1007"/>
     </w:p>
     <w:p>
-      <w:pPr/>
       <w:r>
         <w:rPr>
           <w:b w:val="0"/>
@@ -2967,7 +2962,7 @@
                 <w:i w:val="0"/>
                 <w:sz w:val="20"/>
               </w:rPr>
-              <w:t>Approved Spack version, tag, and commit, package-repository commits and search order, and local recipes (overlays). Verify the exact Spack version against the shared procedure's command baseline.</w:t>
+              <w:t>Approved Spack version, tag, full commit or archive identity, vendored-library inventory, starting Python and host prerequisites, bootstrap metadata/artifacts and installed-tool inventory, package-repository commits and search order, and local recipes (overlays). Link the toolchain assessment and acceptance record in Section 4.1. Verify the exact Spack version against the shared procedure's command baseline.</w:t>
             </w:r>
           </w:p>
         </w:tc>
@@ -3163,7 +3158,7 @@
     </w:tbl>
     <w:p>
       <w:pPr>
-        <w:spacing w:after="0" w:before="0" w:line="80" w:lineRule="exact"/>
+        <w:spacing w:after="60" w:before="0"/>
       </w:pPr>
       <w:r>
         <w:rPr>
@@ -3172,7 +3167,6 @@
       </w:r>
     </w:p>
     <w:p>
-      <w:pPr/>
       <w:r>
         <w:rPr>
           <w:b w:val="0"/>
@@ -3182,6 +3176,7 @@
       </w:r>
     </w:p>
     <w:p>
+      <w:bookmarkStart w:id="1008" w:name="s_394d598e73c16928aafded0e"/>
       <w:pPr>
         <w:pStyle w:val="Heading1"/>
       </w:pPr>
@@ -3192,9 +3187,9 @@
         </w:rPr>
         <w:t>4. Storage, access, and Spack runtime</w:t>
       </w:r>
+      <w:bookmarkEnd w:id="1008"/>
     </w:p>
     <w:p>
-      <w:pPr/>
       <w:r>
         <w:rPr>
           <w:b w:val="0"/>
@@ -3206,15 +3201,12 @@
     <w:p>
       <w:pPr>
         <w:keepLines w:val="0"/>
-        <w:widowControl/>
         <w:spacing w:before="40" w:after="160" w:line="245" w:lineRule="auto"/>
         <w:ind w:left="115" w:right="43"/>
       </w:pPr>
       <w:r>
         <w:rPr>
           <w:rFonts w:ascii="Courier New" w:hAnsi="Courier New"/>
-          <w:b w:val="0"/>
-          <w:i w:val="0"/>
           <w:sz w:val="18"/>
         </w:rPr>
         <w:t>&lt;approved-cse-shared-root&gt;/</w:t>
@@ -3254,7 +3246,6 @@
       </w:r>
     </w:p>
     <w:p>
-      <w:pPr/>
       <w:r>
         <w:rPr>
           <w:b w:val="0"/>
@@ -3387,7 +3378,7 @@
                 <w:rFonts w:ascii="Courier New" w:hAnsi="Courier New"/>
                 <w:b w:val="0"/>
                 <w:i w:val="0"/>
-                <w:sz w:val="18"/>
+                <w:sz w:val="20"/>
               </w:rPr>
               <w:t>2770</w:t>
             </w:r>
@@ -3404,7 +3395,7 @@
                 <w:rFonts w:ascii="Courier New" w:hAnsi="Courier New"/>
                 <w:b w:val="0"/>
                 <w:i w:val="0"/>
-                <w:sz w:val="18"/>
+                <w:sz w:val="20"/>
               </w:rPr>
               <w:t>0660</w:t>
             </w:r>
@@ -3421,7 +3412,7 @@
                 <w:rFonts w:ascii="Courier New" w:hAnsi="Courier New"/>
                 <w:b w:val="0"/>
                 <w:i w:val="0"/>
-                <w:sz w:val="18"/>
+                <w:sz w:val="20"/>
               </w:rPr>
               <w:t>0770</w:t>
             </w:r>
@@ -3720,7 +3711,7 @@
                 <w:rFonts w:ascii="Courier New" w:hAnsi="Courier New"/>
                 <w:b w:val="0"/>
                 <w:i w:val="0"/>
-                <w:sz w:val="18"/>
+                <w:sz w:val="20"/>
               </w:rPr>
               <w:t>2775</w:t>
             </w:r>
@@ -3737,7 +3728,7 @@
                 <w:rFonts w:ascii="Courier New" w:hAnsi="Courier New"/>
                 <w:b w:val="0"/>
                 <w:i w:val="0"/>
-                <w:sz w:val="18"/>
+                <w:sz w:val="20"/>
               </w:rPr>
               <w:t>0775</w:t>
             </w:r>
@@ -3754,7 +3745,7 @@
                 <w:rFonts w:ascii="Courier New" w:hAnsi="Courier New"/>
                 <w:b w:val="0"/>
                 <w:i w:val="0"/>
-                <w:sz w:val="18"/>
+                <w:sz w:val="20"/>
               </w:rPr>
               <w:t>0664</w:t>
             </w:r>
@@ -3772,7 +3763,7 @@
     </w:tbl>
     <w:p>
       <w:pPr>
-        <w:spacing w:after="0" w:before="0" w:line="80" w:lineRule="exact"/>
+        <w:spacing w:after="60" w:before="0"/>
       </w:pPr>
       <w:r>
         <w:rPr>
@@ -3781,7 +3772,6 @@
       </w:r>
     </w:p>
     <w:p>
-      <w:pPr/>
       <w:r>
         <w:rPr>
           <w:b w:val="0"/>
@@ -3794,7 +3784,7 @@
           <w:rFonts w:ascii="Courier New" w:hAnsi="Courier New"/>
           <w:b w:val="0"/>
           <w:i w:val="0"/>
-          <w:sz w:val="18"/>
+          <w:sz w:val="19"/>
         </w:rPr>
         <w:t>umask 0007</w:t>
       </w:r>
@@ -3807,7 +3797,6 @@
       </w:r>
     </w:p>
     <w:p>
-      <w:pPr/>
       <w:r>
         <w:rPr>
           <w:b w:val="0"/>
@@ -3817,7 +3806,6 @@
       </w:r>
     </w:p>
     <w:p>
-      <w:pPr/>
       <w:r>
         <w:rPr>
           <w:b w:val="0"/>
@@ -3827,6 +3815,425 @@
       </w:r>
     </w:p>
     <w:p>
+      <w:bookmarkStart w:id="1009" w:name="s_6186fc04e1cb31601fdff8b1"/>
+      <w:pPr>
+        <w:pStyle w:val="Heading2"/>
+      </w:pPr>
+      <w:r>
+        <w:rPr>
+          <w:b w:val="0"/>
+          <w:i w:val="0"/>
+        </w:rPr>
+        <w:t>4.1 Admit Spack and its supporting tools before production use</w:t>
+      </w:r>
+      <w:bookmarkEnd w:id="1009"/>
+    </w:p>
+    <w:p>
+      <w:r>
+        <w:rPr>
+          <w:b w:val="0"/>
+          <w:i w:val="0"/>
+        </w:rPr>
+        <w:t xml:space="preserve">Follow shared procedure </w:t>
+      </w:r>
+      <w:r>
+        <w:rPr>
+          <w:b/>
+          <w:i w:val="0"/>
+        </w:rPr>
+        <w:t>Sections 4.4–4.5</w:t>
+      </w:r>
+      <w:r>
+        <w:rPr>
+          <w:b w:val="0"/>
+          <w:i w:val="0"/>
+        </w:rPr>
+        <w:t xml:space="preserve"> for acquisition, installation, configuration, inventory, scanning, and acceptance of the Spack toolchain. This applies to builder, signing, and managed-installation environments. Keep this assessment separate from the application package assessment and link both to the same release record.</w:t>
+      </w:r>
+    </w:p>
+    <w:tbl>
+      <w:tblPr>
+        <w:tblW w:type="auto" w:w="0"/>
+        <w:jc w:val="center"/>
+        <w:tblLayout w:type="fixed"/>
+        <w:tblLook w:firstColumn="1" w:firstRow="1" w:lastColumn="0" w:lastRow="0" w:noHBand="0" w:noVBand="1" w:val="04A0"/>
+        <w:tblBorders>
+          <w:top w:val="single" w:sz="4" w:color="D9D9D9"/>
+          <w:left w:val="single" w:sz="4" w:color="D9D9D9"/>
+          <w:bottom w:val="single" w:sz="4" w:color="D9D9D9"/>
+          <w:right w:val="single" w:sz="4" w:color="D9D9D9"/>
+          <w:insideH w:val="single" w:sz="4" w:color="D9D9D9"/>
+          <w:insideV w:val="single" w:sz="4" w:color="D9D9D9"/>
+        </w:tblBorders>
+        <w:tblCellMar>
+          <w:top w:w="95" w:type="dxa"/>
+          <w:bottom w:w="95" w:type="dxa"/>
+          <w:left w:w="115" w:type="dxa"/>
+          <w:right w:w="115" w:type="dxa"/>
+        </w:tblCellMar>
+      </w:tblPr>
+      <w:tblGrid>
+        <w:gridCol w:w="2385"/>
+        <w:gridCol w:w="7551"/>
+      </w:tblGrid>
+      <w:tr>
+        <w:trPr>
+          <w:cantSplit/>
+          <w:tblHeader/>
+        </w:trPr>
+        <w:tc>
+          <w:tcPr>
+            <w:tcW w:type="dxa" w:w="2385"/>
+            <w:vAlign w:val="center"/>
+            <w:shd w:fill="EDF2F6"/>
+          </w:tcPr>
+          <w:p>
+            <w:pPr>
+              <w:keepNext w:val="0"/>
+              <w:widowControl w:val="0"/>
+              <w:spacing w:after="0" w:before="0" w:line="250" w:lineRule="auto"/>
+            </w:pPr>
+            <w:r>
+              <w:rPr>
+                <w:b/>
+                <w:i w:val="0"/>
+                <w:sz w:val="20"/>
+              </w:rPr>
+              <w:t>Admission step</w:t>
+            </w:r>
+          </w:p>
+        </w:tc>
+        <w:tc>
+          <w:tcPr>
+            <w:tcW w:type="dxa" w:w="7551"/>
+            <w:vAlign w:val="center"/>
+            <w:shd w:fill="EDF2F6"/>
+          </w:tcPr>
+          <w:p>
+            <w:pPr>
+              <w:keepNext w:val="0"/>
+              <w:widowControl w:val="0"/>
+              <w:spacing w:after="0" w:before="0" w:line="250" w:lineRule="auto"/>
+            </w:pPr>
+            <w:r>
+              <w:rPr>
+                <w:b/>
+                <w:i w:val="0"/>
+                <w:sz w:val="20"/>
+              </w:rPr>
+              <w:t>CSE requirement and retained evidence</w:t>
+            </w:r>
+          </w:p>
+        </w:tc>
+      </w:tr>
+      <w:tr>
+        <w:trPr>
+          <w:cantSplit/>
+        </w:trPr>
+        <w:tc>
+          <w:tcPr>
+            <w:tcW w:type="dxa" w:w="2385"/>
+            <w:vAlign w:val="center"/>
+          </w:tcPr>
+          <w:p>
+            <w:pPr>
+              <w:keepNext w:val="0"/>
+              <w:widowControl w:val="0"/>
+              <w:spacing w:after="0" w:before="0" w:line="250" w:lineRule="auto"/>
+            </w:pPr>
+            <w:r>
+              <w:rPr>
+                <w:b w:val="0"/>
+                <w:i w:val="0"/>
+                <w:sz w:val="20"/>
+              </w:rPr>
+              <w:t>Acquire the pinned runtime</w:t>
+            </w:r>
+          </w:p>
+        </w:tc>
+        <w:tc>
+          <w:tcPr>
+            <w:tcW w:type="dxa" w:w="7551"/>
+            <w:vAlign w:val="center"/>
+          </w:tcPr>
+          <w:p>
+            <w:pPr>
+              <w:keepNext w:val="0"/>
+              <w:widowControl w:val="0"/>
+              <w:spacing w:after="0" w:before="0" w:line="250" w:lineRule="auto"/>
+            </w:pPr>
+            <w:r>
+              <w:rPr>
+                <w:b w:val="0"/>
+                <w:i w:val="0"/>
+                <w:sz w:val="20"/>
+              </w:rPr>
+              <w:t>Authorized intake with already approved tools; exact origin, tag/full commit or archive identity, authenticated digests, and received/deployed file checks. Stage and assess the checkout before sourcing or running it.</w:t>
+            </w:r>
+          </w:p>
+        </w:tc>
+      </w:tr>
+      <w:tr>
+        <w:trPr>
+          <w:cantSplit/>
+        </w:trPr>
+        <w:tc>
+          <w:tcPr>
+            <w:tcW w:type="dxa" w:w="2385"/>
+            <w:vAlign w:val="center"/>
+          </w:tcPr>
+          <w:p>
+            <w:pPr>
+              <w:keepNext w:val="0"/>
+              <w:widowControl w:val="0"/>
+              <w:spacing w:after="0" w:before="0" w:line="250" w:lineRule="auto"/>
+            </w:pPr>
+            <w:r>
+              <w:rPr>
+                <w:b w:val="0"/>
+                <w:i w:val="0"/>
+                <w:sz w:val="20"/>
+              </w:rPr>
+              <w:t>Assess runtime dependencies</w:t>
+            </w:r>
+          </w:p>
+        </w:tc>
+        <w:tc>
+          <w:tcPr>
+            <w:tcW w:type="dxa" w:w="7551"/>
+            <w:vAlign w:val="center"/>
+          </w:tcPr>
+          <w:p>
+            <w:pPr>
+              <w:keepNext w:val="0"/>
+              <w:widowControl w:val="0"/>
+              <w:spacing w:after="0" w:before="0" w:line="250" w:lineRule="auto"/>
+            </w:pPr>
+            <w:r>
+              <w:rPr>
+                <w:b w:val="0"/>
+                <w:i w:val="0"/>
+                <w:sz w:val="20"/>
+              </w:rPr>
+              <w:t xml:space="preserve">Include Spack's vendored Python libraries, the already-present Python interpreter, its relevant dependencies, and host prerequisites. A host </w:t>
+            </w:r>
+            <w:r>
+              <w:rPr>
+                <w:rFonts w:ascii="Courier New" w:hAnsi="Courier New"/>
+                <w:b w:val="0"/>
+                <w:i w:val="0"/>
+                <w:sz w:val="20"/>
+              </w:rPr>
+              <w:t>pip list</w:t>
+            </w:r>
+            <w:r>
+              <w:rPr>
+                <w:b w:val="0"/>
+                <w:i w:val="0"/>
+                <w:sz w:val="20"/>
+              </w:rPr>
+              <w:t xml:space="preserve"> or application SBOM alone does not cover this inventory.</w:t>
+            </w:r>
+          </w:p>
+        </w:tc>
+      </w:tr>
+      <w:tr>
+        <w:trPr>
+          <w:cantSplit/>
+        </w:trPr>
+        <w:tc>
+          <w:tcPr>
+            <w:tcW w:type="dxa" w:w="2385"/>
+            <w:vAlign w:val="center"/>
+          </w:tcPr>
+          <w:p>
+            <w:pPr>
+              <w:keepNext w:val="0"/>
+              <w:widowControl w:val="0"/>
+              <w:spacing w:after="0" w:before="0" w:line="250" w:lineRule="auto"/>
+            </w:pPr>
+            <w:r>
+              <w:rPr>
+                <w:b w:val="0"/>
+                <w:i w:val="0"/>
+                <w:sz w:val="20"/>
+              </w:rPr>
+              <w:t>Admit bootstrap inputs</w:t>
+            </w:r>
+          </w:p>
+        </w:tc>
+        <w:tc>
+          <w:tcPr>
+            <w:tcW w:type="dxa" w:w="7551"/>
+            <w:vAlign w:val="center"/>
+          </w:tcPr>
+          <w:p>
+            <w:pPr>
+              <w:keepNext w:val="0"/>
+              <w:widowControl w:val="0"/>
+              <w:spacing w:after="0" w:before="0" w:line="250" w:lineRule="auto"/>
+            </w:pPr>
+            <w:r>
+              <w:rPr>
+                <w:b w:val="0"/>
+                <w:i w:val="0"/>
+                <w:sz w:val="20"/>
+              </w:rPr>
+              <w:t>Use approved preinstalled tools with bootstrap disabled, or separately approve local bootstrap metadata, binary/source artifacts, dependencies, and compatibility. This covers Clingo, GnuPG and Linux patchelf where used. The starting Python is provisioned separately; Spack cannot start without it.</w:t>
+            </w:r>
+          </w:p>
+        </w:tc>
+      </w:tr>
+      <w:tr>
+        <w:trPr>
+          <w:cantSplit/>
+        </w:trPr>
+        <w:tc>
+          <w:tcPr>
+            <w:tcW w:type="dxa" w:w="2385"/>
+            <w:vAlign w:val="center"/>
+          </w:tcPr>
+          <w:p>
+            <w:pPr>
+              <w:keepNext w:val="0"/>
+              <w:widowControl w:val="0"/>
+              <w:spacing w:after="0" w:before="0" w:line="250" w:lineRule="auto"/>
+            </w:pPr>
+            <w:r>
+              <w:rPr>
+                <w:b w:val="0"/>
+                <w:i w:val="0"/>
+                <w:sz w:val="20"/>
+              </w:rPr>
+              <w:t>Control provisioning</w:t>
+            </w:r>
+          </w:p>
+        </w:tc>
+        <w:tc>
+          <w:tcPr>
+            <w:tcW w:type="dxa" w:w="7551"/>
+            <w:vAlign w:val="center"/>
+          </w:tcPr>
+          <w:p>
+            <w:pPr>
+              <w:keepNext w:val="0"/>
+              <w:widowControl w:val="0"/>
+              <w:spacing w:after="0" w:before="0" w:line="250" w:lineRule="auto"/>
+            </w:pPr>
+            <w:r>
+              <w:rPr>
+                <w:b w:val="0"/>
+                <w:i w:val="0"/>
+                <w:sz w:val="20"/>
+              </w:rPr>
+              <w:t>Record effective configuration; replace default public bootstrap sources; deny unapproved network fallback outside Spack. Restrict provisioning to the approved setup context. A private bootstrap directory is an access control, not source admission or a scan.</w:t>
+            </w:r>
+          </w:p>
+        </w:tc>
+      </w:tr>
+      <w:tr>
+        <w:trPr>
+          <w:cantSplit/>
+        </w:trPr>
+        <w:tc>
+          <w:tcPr>
+            <w:tcW w:type="dxa" w:w="2385"/>
+            <w:vAlign w:val="center"/>
+          </w:tcPr>
+          <w:p>
+            <w:pPr>
+              <w:keepNext w:val="0"/>
+              <w:widowControl w:val="0"/>
+              <w:spacing w:after="0" w:before="0" w:line="250" w:lineRule="auto"/>
+            </w:pPr>
+            <w:r>
+              <w:rPr>
+                <w:b w:val="0"/>
+                <w:i w:val="0"/>
+                <w:sz w:val="20"/>
+              </w:rPr>
+              <w:t>Accept the installed toolchain</w:t>
+            </w:r>
+          </w:p>
+        </w:tc>
+        <w:tc>
+          <w:tcPr>
+            <w:tcW w:type="dxa" w:w="7551"/>
+            <w:vAlign w:val="center"/>
+          </w:tcPr>
+          <w:p>
+            <w:pPr>
+              <w:keepNext w:val="0"/>
+              <w:widowControl w:val="0"/>
+              <w:spacing w:after="0" w:before="0" w:line="250" w:lineRule="auto"/>
+            </w:pPr>
+            <w:r>
+              <w:rPr>
+                <w:b w:val="0"/>
+                <w:i w:val="0"/>
+                <w:sz w:val="20"/>
+              </w:rPr>
+              <w:t>Record actual installed and external tools and dependencies, file identities, readiness, malware and vulnerability/SCA assessment coverage, findings, gaps, and independent acceptance before production solving, building, signing, or installation.</w:t>
+            </w:r>
+          </w:p>
+        </w:tc>
+      </w:tr>
+    </w:tbl>
+    <w:p>
+      <w:pPr>
+        <w:spacing w:after="60" w:before="0"/>
+      </w:pPr>
+      <w:r>
+        <w:rPr>
+          <w:sz w:val="4"/>
+        </w:rPr>
+      </w:r>
+    </w:p>
+    <w:p>
+      <w:r>
+        <w:rPr>
+          <w:b w:val="0"/>
+          <w:i w:val="0"/>
+        </w:rPr>
+        <w:t xml:space="preserve">The operating record must name approved scanners/advisory sources, their actual invocations or jobs, policies and intelligence dates, acceptance criteria, and the person responsible for updates. A scanner error, unrecognized component, or unsupported version is a gap requiring disposition. </w:t>
+      </w:r>
+      <w:r>
+        <w:rPr>
+          <w:rFonts w:ascii="Courier New" w:hAnsi="Courier New"/>
+          <w:b w:val="0"/>
+          <w:i w:val="0"/>
+          <w:sz w:val="19"/>
+        </w:rPr>
+        <w:t>spack audit</w:t>
+      </w:r>
+      <w:r>
+        <w:rPr>
+          <w:b w:val="0"/>
+          <w:i w:val="0"/>
+        </w:rPr>
+        <w:t>, bootstrap readiness checks, hashes, and malware results alone do not establish that the toolchain has no known vulnerabilities. Record authoritative upstream component mapping and targeted advisory review when a generic scanner cannot identify bundled or custom-versioned components.</w:t>
+      </w:r>
+    </w:p>
+    <w:p>
+      <w:r>
+        <w:rPr>
+          <w:b w:val="0"/>
+          <w:i w:val="0"/>
+        </w:rPr>
+        <w:t>Independent review under Section 2.1 may accept inputs for controlled provisioning/testing first; production acceptance must then identify the actual installed toolchain and completed assessment. Hold affected use for failed integrity checks, unapproved origins, unexplained components, or unresolved required findings/coverage. Apply Section 2.2 for authorized exceptions and security involvement. This draft defines required controls; a generated workspace or successful bootstrap does not demonstrate that they have been implemented.</w:t>
+      </w:r>
+    </w:p>
+    <w:p>
+      <w:r>
+        <w:rPr>
+          <w:b w:val="0"/>
+          <w:i w:val="0"/>
+        </w:rPr>
+        <w:t>The package-repository snapshot waiting rule in Section 8.1 does not approve Spack core or bootstrap inputs and does not establish their age. Reuse prior assessment only for matching identities, accepted target/use, and still-current evidence. Verify each builder's private installation; reassess changed Spack, Python, support tools, dependencies, or trust settings, and respond to new vulnerability intelligence under shared procedure Section 12. Record the monitoring owner and cadence. Preserve approved runtime versions and replace them through a new admitted revision, including when distributing to other systems.</w:t>
+      </w:r>
+    </w:p>
+    <w:p>
+      <w:bookmarkStart w:id="1010" w:name="s_a55bd82494fa78a39e4e017b"/>
       <w:pPr>
         <w:pStyle w:val="Heading1"/>
       </w:pPr>
@@ -3837,19 +4244,18 @@
         </w:rPr>
         <w:t>5. Preflight</w:t>
       </w:r>
+      <w:bookmarkEnd w:id="1010"/>
     </w:p>
     <w:p>
-      <w:pPr/>
       <w:r>
         <w:rPr>
           <w:b w:val="0"/>
           <w:i w:val="0"/>
         </w:rPr>
-        <w:t>With shared procedure Section 5 and the CSE operating record, both team members confirm that the system and catalog, deployment, package list, Spack, repositories, and configuration describe the same release. Check required node types and providers, shared paths and locks, and both accounts' working access.</w:t>
+        <w:t>With shared procedure Section 5 and the CSE operating record, both team members confirm that the system and catalog, deployment, package list, Spack, repositories, and configuration describe the same release. Check required node types and providers, shared paths and locks, and both accounts' working access. Confirm Section 4.1 admission covers the actual toolchain on each execution system, including separately operated signing and managed-installation tools.</w:t>
       </w:r>
     </w:p>
     <w:p>
-      <w:pPr/>
       <w:r>
         <w:rPr>
           <w:b w:val="0"/>
@@ -3859,6 +4265,7 @@
       </w:r>
     </w:p>
     <w:p>
+      <w:bookmarkStart w:id="1011" w:name="s_92969343aee19bf150a617b2"/>
       <w:pPr>
         <w:pStyle w:val="Heading1"/>
       </w:pPr>
@@ -3869,9 +4276,9 @@
         </w:rPr>
         <w:t>6. Select platform configuration</w:t>
       </w:r>
+      <w:bookmarkEnd w:id="1011"/>
     </w:p>
     <w:p>
-      <w:pPr/>
       <w:r>
         <w:rPr>
           <w:b w:val="0"/>
@@ -3881,7 +4288,6 @@
       </w:r>
     </w:p>
     <w:p>
-      <w:pPr/>
       <w:r>
         <w:rPr>
           <w:b w:val="0"/>
@@ -3894,7 +4300,7 @@
           <w:rFonts w:ascii="Courier New" w:hAnsi="Courier New"/>
           <w:b w:val="0"/>
           <w:i w:val="0"/>
-          <w:sz w:val="18"/>
+          <w:sz w:val="19"/>
         </w:rPr>
         <w:t>current</w:t>
       </w:r>
@@ -3907,7 +4313,6 @@
       </w:r>
     </w:p>
     <w:p>
-      <w:pPr/>
       <w:r>
         <w:rPr>
           <w:b w:val="0"/>
@@ -3917,7 +4322,6 @@
       </w:r>
     </w:p>
     <w:p>
-      <w:pPr/>
       <w:r>
         <w:rPr>
           <w:b w:val="0"/>
@@ -3941,6 +4345,7 @@
       </w:r>
     </w:p>
     <w:p>
+      <w:bookmarkStart w:id="1012" w:name="s_4f870398e391c024e6e953ee"/>
       <w:pPr>
         <w:pStyle w:val="Heading1"/>
       </w:pPr>
@@ -3951,9 +4356,9 @@
         </w:rPr>
         <w:t>7. Define the environment</w:t>
       </w:r>
+      <w:bookmarkEnd w:id="1012"/>
     </w:p>
     <w:p>
-      <w:pPr/>
       <w:r>
         <w:rPr>
           <w:b w:val="0"/>
@@ -3963,6 +4368,7 @@
       </w:r>
     </w:p>
     <w:p>
+      <w:bookmarkStart w:id="1013" w:name="s_a4498daf652fe36c0e375397"/>
       <w:pPr>
         <w:pStyle w:val="Heading2"/>
       </w:pPr>
@@ -3973,9 +4379,9 @@
         </w:rPr>
         <w:t>7.1 CSE environment layout</w:t>
       </w:r>
+      <w:bookmarkEnd w:id="1013"/>
     </w:p>
     <w:p>
-      <w:pPr/>
       <w:r>
         <w:rPr>
           <w:b w:val="0"/>
@@ -4264,7 +4670,7 @@
     </w:tbl>
     <w:p>
       <w:pPr>
-        <w:spacing w:after="0" w:before="0" w:line="80" w:lineRule="exact"/>
+        <w:spacing w:after="60" w:before="0"/>
       </w:pPr>
       <w:r>
         <w:rPr>
@@ -4273,7 +4679,6 @@
       </w:r>
     </w:p>
     <w:p>
-      <w:pPr/>
       <w:r>
         <w:rPr>
           <w:b w:val="0"/>
@@ -4297,7 +4702,6 @@
       </w:r>
     </w:p>
     <w:p>
-      <w:pPr/>
       <w:r>
         <w:rPr>
           <w:b w:val="0"/>
@@ -4335,6 +4739,7 @@
       </w:r>
     </w:p>
     <w:p>
+      <w:bookmarkStart w:id="1014" w:name="s_2109d994f9433fb08415c1ca"/>
       <w:pPr>
         <w:pStyle w:val="Heading2"/>
       </w:pPr>
@@ -4345,15 +4750,15 @@
         </w:rPr>
         <w:t>7.2 CSE package and dependency policy</w:t>
       </w:r>
+      <w:bookmarkEnd w:id="1014"/>
     </w:p>
     <w:p>
       <w:pPr>
         <w:pStyle w:val="ListParagraph"/>
         <w:numPr>
           <w:ilvl w:val="0"/>
-          <w:numId w:val="10"/>
+          <w:numId w:val="12"/>
         </w:numPr>
-        <w:ind w:left="360"/>
       </w:pPr>
       <w:r>
         <w:rPr>
@@ -4368,9 +4773,8 @@
         <w:pStyle w:val="ListParagraph"/>
         <w:numPr>
           <w:ilvl w:val="0"/>
-          <w:numId w:val="10"/>
+          <w:numId w:val="12"/>
         </w:numPr>
-        <w:ind w:left="360"/>
       </w:pPr>
       <w:r>
         <w:rPr>
@@ -4385,9 +4789,8 @@
         <w:pStyle w:val="ListParagraph"/>
         <w:numPr>
           <w:ilvl w:val="0"/>
-          <w:numId w:val="10"/>
+          <w:numId w:val="12"/>
         </w:numPr>
-        <w:ind w:left="360"/>
       </w:pPr>
       <w:r>
         <w:rPr>
@@ -4402,9 +4805,8 @@
         <w:pStyle w:val="ListParagraph"/>
         <w:numPr>
           <w:ilvl w:val="0"/>
-          <w:numId w:val="10"/>
+          <w:numId w:val="12"/>
         </w:numPr>
-        <w:ind w:left="360"/>
       </w:pPr>
       <w:r>
         <w:rPr>
@@ -4419,9 +4821,8 @@
         <w:pStyle w:val="ListParagraph"/>
         <w:numPr>
           <w:ilvl w:val="0"/>
-          <w:numId w:val="10"/>
+          <w:numId w:val="12"/>
         </w:numPr>
-        <w:ind w:left="360"/>
       </w:pPr>
       <w:r>
         <w:rPr>
@@ -4436,9 +4837,8 @@
         <w:pStyle w:val="ListParagraph"/>
         <w:numPr>
           <w:ilvl w:val="0"/>
-          <w:numId w:val="10"/>
+          <w:numId w:val="12"/>
         </w:numPr>
-        <w:ind w:left="360"/>
       </w:pPr>
       <w:r>
         <w:rPr>
@@ -4453,9 +4853,8 @@
         <w:pStyle w:val="ListParagraph"/>
         <w:numPr>
           <w:ilvl w:val="0"/>
-          <w:numId w:val="10"/>
+          <w:numId w:val="12"/>
         </w:numPr>
-        <w:ind w:left="360"/>
       </w:pPr>
       <w:r>
         <w:rPr>
@@ -4466,6 +4865,7 @@
       </w:r>
     </w:p>
     <w:p>
+      <w:bookmarkStart w:id="1015" w:name="s_f580e6a134163905b7d5bd61"/>
       <w:pPr>
         <w:pStyle w:val="Heading2"/>
       </w:pPr>
@@ -4476,9 +4876,9 @@
         </w:rPr>
         <w:t>7.3 CSE local package corrections</w:t>
       </w:r>
+      <w:bookmarkEnd w:id="1015"/>
     </w:p>
     <w:p>
-      <w:pPr/>
       <w:r>
         <w:rPr>
           <w:b w:val="0"/>
@@ -4486,13 +4886,12 @@
         </w:rPr>
         <w:t xml:space="preserve">When pinned upstream recipes do not correctly support an approved package and platform combination, CSE may keep a local recipe or source correction. Keep the upstream pin and version the local package repository separately, with an explicit namespace and search order. Follow the shared </w:t>
       </w:r>
-      <w:hyperlink r:id="rId10" w:history="1" w:anchor="procedure_local_corrections">
+      <w:hyperlink r:id="rId13">
         <w:r>
           <w:rPr>
             <w:b w:val="0"/>
             <w:i w:val="0"/>
-            <w:color w:val="245A81"/>
-            <w:u w:val="single"/>
+            <w:color w:val="1F4E79"/>
           </w:rPr>
           <w:t>local correction procedure</w:t>
         </w:r>
@@ -4506,7 +4905,6 @@
       </w:r>
     </w:p>
     <w:p>
-      <w:pPr/>
       <w:r>
         <w:rPr>
           <w:b w:val="0"/>
@@ -4516,7 +4914,6 @@
       </w:r>
     </w:p>
     <w:p>
-      <w:pPr/>
       <w:r>
         <w:rPr>
           <w:b w:val="0"/>
@@ -4526,7 +4923,6 @@
       </w:r>
     </w:p>
     <w:p>
-      <w:pPr/>
       <w:r>
         <w:rPr>
           <w:b w:val="0"/>
@@ -4536,6 +4932,7 @@
       </w:r>
     </w:p>
     <w:p>
+      <w:bookmarkStart w:id="1016" w:name="s_8addf344803b866cd22ad288"/>
       <w:pPr>
         <w:pStyle w:val="Heading1"/>
       </w:pPr>
@@ -4546,9 +4943,9 @@
         </w:rPr>
         <w:t>8. Concretize and review</w:t>
       </w:r>
+      <w:bookmarkEnd w:id="1016"/>
     </w:p>
     <w:p>
-      <w:pPr/>
       <w:r>
         <w:rPr>
           <w:b w:val="0"/>
@@ -4556,13 +4953,12 @@
         </w:rPr>
         <w:t xml:space="preserve">Use the shared </w:t>
       </w:r>
-      <w:hyperlink r:id="rId10" w:history="1" w:anchor="procedure_review">
+      <w:hyperlink r:id="rId14">
         <w:r>
           <w:rPr>
             <w:b w:val="0"/>
             <w:i w:val="0"/>
-            <w:color w:val="245A81"/>
-            <w:u w:val="single"/>
+            <w:color w:val="1F4E79"/>
           </w:rPr>
           <w:t>review procedure</w:t>
         </w:r>
@@ -4576,6 +4972,7 @@
       </w:r>
     </w:p>
     <w:p>
+      <w:bookmarkStart w:id="1017" w:name="s_cb545cf85bb83f1526cbd8f4"/>
       <w:pPr>
         <w:pStyle w:val="Heading2"/>
       </w:pPr>
@@ -4586,9 +4983,41 @@
         </w:rPr>
         <w:t>8.1 Review package changes</w:t>
       </w:r>
+      <w:bookmarkEnd w:id="1017"/>
     </w:p>
     <w:p>
-      <w:pPr/>
+      <w:r>
+        <w:rPr>
+          <w:b w:val="0"/>
+          <w:i w:val="0"/>
+        </w:rPr>
+        <w:t xml:space="preserve">Record the adopted repository-snapshot waiting rule before admitting the baseline. The proposed CSE default for routine updates is at least </w:t>
+      </w:r>
+      <w:r>
+        <w:rPr>
+          <w:b/>
+          <w:i w:val="0"/>
+        </w:rPr>
+        <w:t>90 elapsed days from verified upstream snapshot publication</w:t>
+      </w:r>
+      <w:r>
+        <w:rPr>
+          <w:b w:val="0"/>
+          <w:i w:val="0"/>
+        </w:rPr>
+        <w:t>. The newest snapshot may qualify if it is old enough; otherwise assess the preceding supported snapshot and verify its actual age. A release label or being one release behind does not establish eligibility. Retain the tag, resolved full commit, publication evidence/date, assessment date, calculated age, and current advisory findings. Keep the selected bytes fixed and review tag/content changes as new inputs.</w:t>
+      </w:r>
+    </w:p>
+    <w:p>
+      <w:r>
+        <w:rPr>
+          <w:b w:val="0"/>
+          <w:i w:val="0"/>
+        </w:rPr>
+        <w:t>Use a supported snapshot acceptable under current findings; age does not make known-vulnerable content acceptable. Supported means compatible with the approved Spack runtime/package APIs and within the local maintenance scope, including the ability to obtain required fixes. Newly changed overlays, patches, sources, bootstrap inputs, and externals require their own assessment and do not inherit the upstream snapshot's age. Record any exception for younger content, including urgent remediation, with scope, evidence, authority, expiration or follow-up, and retest conditions under Section 2.2. Do not delay a needed security fix to meet the waiting rule. This proposal needs local adoption and does not change existing trial pins automatically. It adds no automatic post-build waiting period; holds for suspect content or unresolved findings remain separate.</w:t>
+      </w:r>
+    </w:p>
+    <w:p>
       <w:r>
         <w:rPr>
           <w:b w:val="0"/>
@@ -4598,7 +5027,6 @@
       </w:r>
     </w:p>
     <w:p>
-      <w:pPr/>
       <w:r>
         <w:rPr>
           <w:b w:val="0"/>
@@ -4608,7 +5036,6 @@
       </w:r>
     </w:p>
     <w:p>
-      <w:pPr/>
       <w:r>
         <w:rPr>
           <w:b w:val="0"/>
@@ -4618,7 +5045,6 @@
       </w:r>
     </w:p>
     <w:p>
-      <w:pPr/>
       <w:r>
         <w:rPr>
           <w:b w:val="0"/>
@@ -4628,6 +5054,7 @@
       </w:r>
     </w:p>
     <w:p>
+      <w:bookmarkStart w:id="1018" w:name="s_e501ca623b329cbedd1ad523"/>
       <w:pPr>
         <w:pStyle w:val="Heading1"/>
       </w:pPr>
@@ -4638,8 +5065,10 @@
         </w:rPr>
         <w:t>9. Build and validate</w:t>
       </w:r>
+      <w:bookmarkEnd w:id="1018"/>
     </w:p>
     <w:p>
+      <w:bookmarkStart w:id="1019" w:name="s_c7353a463838e9bf20ff1d9b"/>
       <w:pPr>
         <w:pStyle w:val="Heading2"/>
       </w:pPr>
@@ -4650,9 +5079,9 @@
         </w:rPr>
         <w:t>9.1 CSE source and mirror preparation</w:t>
       </w:r>
+      <w:bookmarkEnd w:id="1019"/>
     </w:p>
     <w:p>
-      <w:pPr/>
       <w:r>
         <w:rPr>
           <w:b w:val="0"/>
@@ -4660,13 +5089,12 @@
         </w:rPr>
         <w:t xml:space="preserve">Use the shared </w:t>
       </w:r>
-      <w:hyperlink r:id="rId10" w:history="1" w:anchor="procedure_source_mirrors">
+      <w:hyperlink r:id="rId15">
         <w:r>
           <w:rPr>
             <w:b w:val="0"/>
             <w:i w:val="0"/>
-            <w:color w:val="245A81"/>
-            <w:u w:val="single"/>
+            <w:color w:val="1F4E79"/>
           </w:rPr>
           <w:t>source mirror procedure</w:t>
         </w:r>
@@ -4694,7 +5122,6 @@
       </w:r>
     </w:p>
     <w:p>
-      <w:pPr/>
       <w:r>
         <w:rPr>
           <w:b w:val="0"/>
@@ -4704,6 +5131,7 @@
       </w:r>
     </w:p>
     <w:p>
+      <w:bookmarkStart w:id="1020" w:name="s_7a9900a7f826166c6d32f0a2"/>
       <w:pPr>
         <w:pStyle w:val="Heading2"/>
       </w:pPr>
@@ -4714,9 +5142,9 @@
         </w:rPr>
         <w:t>9.2 Systems with limited or no external network access</w:t>
       </w:r>
+      <w:bookmarkEnd w:id="1020"/>
     </w:p>
     <w:p>
-      <w:pPr/>
       <w:r>
         <w:rPr>
           <w:b w:val="0"/>
@@ -4724,13 +5152,12 @@
         </w:rPr>
         <w:t xml:space="preserve">Use the shared </w:t>
       </w:r>
-      <w:hyperlink r:id="rId10" w:history="1" w:anchor="procedure_disconnected_transfer">
+      <w:hyperlink r:id="rId16">
         <w:r>
           <w:rPr>
             <w:b w:val="0"/>
             <w:i w:val="0"/>
-            <w:color w:val="245A81"/>
-            <w:u w:val="single"/>
+            <w:color w:val="1F4E79"/>
           </w:rPr>
           <w:t>transfer procedure</w:t>
         </w:r>
@@ -4744,7 +5171,6 @@
       </w:r>
     </w:p>
     <w:p>
-      <w:pPr/>
       <w:r>
         <w:rPr>
           <w:b w:val="0"/>
@@ -4754,7 +5180,6 @@
       </w:r>
     </w:p>
     <w:p>
-      <w:pPr/>
       <w:r>
         <w:rPr>
           <w:b w:val="0"/>
@@ -4935,7 +5360,7 @@
     </w:tbl>
     <w:p>
       <w:pPr>
-        <w:spacing w:after="0" w:before="0" w:line="80" w:lineRule="exact"/>
+        <w:spacing w:after="60" w:before="0"/>
       </w:pPr>
       <w:r>
         <w:rPr>
@@ -4944,7 +5369,6 @@
       </w:r>
     </w:p>
     <w:p>
-      <w:pPr/>
       <w:r>
         <w:rPr>
           <w:b w:val="0"/>
@@ -4954,7 +5378,6 @@
       </w:r>
     </w:p>
     <w:p>
-      <w:pPr/>
       <w:r>
         <w:rPr>
           <w:b w:val="0"/>
@@ -4964,7 +5387,6 @@
       </w:r>
     </w:p>
     <w:p>
-      <w:pPr/>
       <w:r>
         <w:rPr>
           <w:b w:val="0"/>
@@ -4974,6 +5396,7 @@
       </w:r>
     </w:p>
     <w:p>
+      <w:bookmarkStart w:id="1021" w:name="s_c4bd09aaa0491ac4509e6def"/>
       <w:pPr>
         <w:pStyle w:val="Heading2"/>
       </w:pPr>
@@ -4984,9 +5407,9 @@
         </w:rPr>
         <w:t>9.3 Restricted build and acceptance</w:t>
       </w:r>
+      <w:bookmarkEnd w:id="1021"/>
     </w:p>
     <w:p>
-      <w:pPr/>
       <w:r>
         <w:rPr>
           <w:b w:val="0"/>
@@ -4994,13 +5417,12 @@
         </w:rPr>
         <w:t xml:space="preserve">Use the shared </w:t>
       </w:r>
-      <w:hyperlink r:id="rId10" w:history="1" w:anchor="procedure_build_validation">
+      <w:hyperlink r:id="rId17">
         <w:r>
           <w:rPr>
             <w:b w:val="0"/>
             <w:i w:val="0"/>
-            <w:color w:val="245A81"/>
-            <w:u w:val="single"/>
+            <w:color w:val="1F4E79"/>
           </w:rPr>
           <w:t>build and validation procedure</w:t>
         </w:r>
@@ -5014,7 +5436,6 @@
       </w:r>
     </w:p>
     <w:p>
-      <w:pPr/>
       <w:r>
         <w:rPr>
           <w:b w:val="0"/>
@@ -5024,7 +5445,6 @@
       </w:r>
     </w:p>
     <w:p>
-      <w:pPr/>
       <w:r>
         <w:rPr>
           <w:b w:val="0"/>
@@ -5034,7 +5454,6 @@
       </w:r>
     </w:p>
     <w:p>
-      <w:pPr/>
       <w:r>
         <w:rPr>
           <w:b w:val="0"/>
@@ -5058,7 +5477,6 @@
       </w:r>
     </w:p>
     <w:p>
-      <w:pPr/>
       <w:r>
         <w:rPr>
           <w:b w:val="0"/>
@@ -5071,7 +5489,7 @@
           <w:rFonts w:ascii="Courier New" w:hAnsi="Courier New"/>
           <w:b w:val="0"/>
           <w:i w:val="0"/>
-          <w:sz w:val="18"/>
+          <w:sz w:val="19"/>
         </w:rPr>
         <w:t>built</w:t>
       </w:r>
@@ -5087,7 +5505,7 @@
           <w:rFonts w:ascii="Courier New" w:hAnsi="Courier New"/>
           <w:b w:val="0"/>
           <w:i w:val="0"/>
-          <w:sz w:val="18"/>
+          <w:sz w:val="19"/>
         </w:rPr>
         <w:t>runtime-passed</w:t>
       </w:r>
@@ -5103,7 +5521,7 @@
           <w:rFonts w:ascii="Courier New" w:hAnsi="Courier New"/>
           <w:b w:val="0"/>
           <w:i w:val="0"/>
-          <w:sz w:val="18"/>
+          <w:sz w:val="19"/>
         </w:rPr>
         <w:t>held</w:t>
       </w:r>
@@ -5119,7 +5537,7 @@
           <w:rFonts w:ascii="Courier New" w:hAnsi="Courier New"/>
           <w:b w:val="0"/>
           <w:i w:val="0"/>
-          <w:sz w:val="18"/>
+          <w:sz w:val="19"/>
         </w:rPr>
         <w:t>runtime-passed</w:t>
       </w:r>
@@ -5132,7 +5550,6 @@
       </w:r>
     </w:p>
     <w:p>
-      <w:pPr/>
       <w:r>
         <w:rPr>
           <w:b w:val="0"/>
@@ -5142,6 +5559,7 @@
       </w:r>
     </w:p>
     <w:p>
+      <w:bookmarkStart w:id="1022" w:name="s_7a2548deecbf451d2d8b1942"/>
       <w:pPr>
         <w:pStyle w:val="Heading1"/>
       </w:pPr>
@@ -5152,8 +5570,10 @@
         </w:rPr>
         <w:t>10. Publish</w:t>
       </w:r>
+      <w:bookmarkEnd w:id="1022"/>
     </w:p>
     <w:p>
+      <w:bookmarkStart w:id="1023" w:name="s_f9ba84a894b19e5a121facd2"/>
       <w:pPr>
         <w:pStyle w:val="Heading2"/>
       </w:pPr>
@@ -5164,9 +5584,9 @@
         </w:rPr>
         <w:t>10.1 CSE signing and release decision</w:t>
       </w:r>
+      <w:bookmarkEnd w:id="1023"/>
     </w:p>
     <w:p>
-      <w:pPr/>
       <w:r>
         <w:rPr>
           <w:b w:val="0"/>
@@ -5174,13 +5594,12 @@
         </w:rPr>
         <w:t xml:space="preserve">Use the shared </w:t>
       </w:r>
-      <w:hyperlink r:id="rId10" w:history="1" w:anchor="procedure_signing">
+      <w:hyperlink r:id="rId18">
         <w:r>
           <w:rPr>
             <w:b w:val="0"/>
             <w:i w:val="0"/>
-            <w:color w:val="245A81"/>
-            <w:u w:val="single"/>
+            <w:color w:val="1F4E79"/>
           </w:rPr>
           <w:t>signing procedure</w:t>
         </w:r>
@@ -5194,7 +5613,6 @@
       </w:r>
     </w:p>
     <w:p>
-      <w:pPr/>
       <w:r>
         <w:rPr>
           <w:b w:val="0"/>
@@ -5204,7 +5622,6 @@
       </w:r>
     </w:p>
     <w:p>
-      <w:pPr/>
       <w:r>
         <w:rPr>
           <w:b w:val="0"/>
@@ -5214,6 +5631,7 @@
       </w:r>
     </w:p>
     <w:p>
+      <w:bookmarkStart w:id="1024" w:name="s_39fb69126f51c1db7718b28f"/>
       <w:pPr>
         <w:pStyle w:val="Heading2"/>
       </w:pPr>
@@ -5224,9 +5642,9 @@
         </w:rPr>
         <w:t>10.2 CSE static catalog publication</w:t>
       </w:r>
+      <w:bookmarkEnd w:id="1024"/>
     </w:p>
     <w:p>
-      <w:pPr/>
       <w:r>
         <w:rPr>
           <w:b w:val="0"/>
@@ -5234,13 +5652,12 @@
         </w:rPr>
         <w:t xml:space="preserve">Use the shared </w:t>
       </w:r>
-      <w:hyperlink r:id="rId10" w:history="1" w:anchor="procedure_catalog_publication">
+      <w:hyperlink r:id="rId19">
         <w:r>
           <w:rPr>
             <w:b w:val="0"/>
             <w:i w:val="0"/>
-            <w:color w:val="245A81"/>
-            <w:u w:val="single"/>
+            <w:color w:val="1F4E79"/>
           </w:rPr>
           <w:t>catalog publication procedure</w:t>
         </w:r>
@@ -5254,7 +5671,6 @@
       </w:r>
     </w:p>
     <w:p>
-      <w:pPr/>
       <w:r>
         <w:rPr>
           <w:b w:val="0"/>
@@ -5264,6 +5680,7 @@
       </w:r>
     </w:p>
     <w:p>
+      <w:bookmarkStart w:id="1025" w:name="s_3b19c7671606ac7665039883"/>
       <w:pPr>
         <w:pStyle w:val="Heading2"/>
       </w:pPr>
@@ -5274,9 +5691,9 @@
         </w:rPr>
         <w:t>10.3 CSE stack publication</w:t>
       </w:r>
+      <w:bookmarkEnd w:id="1025"/>
     </w:p>
     <w:p>
-      <w:pPr/>
       <w:r>
         <w:rPr>
           <w:b w:val="0"/>
@@ -5284,13 +5701,12 @@
         </w:rPr>
         <w:t xml:space="preserve">Use the shared </w:t>
       </w:r>
-      <w:hyperlink r:id="rId10" w:history="1" w:anchor="procedure_cache_publication">
+      <w:hyperlink r:id="rId20">
         <w:r>
           <w:rPr>
             <w:b w:val="0"/>
             <w:i w:val="0"/>
-            <w:color w:val="245A81"/>
-            <w:u w:val="single"/>
+            <w:color w:val="1F4E79"/>
           </w:rPr>
           <w:t>cache publication procedure</w:t>
         </w:r>
@@ -5304,7 +5720,6 @@
       </w:r>
     </w:p>
     <w:p>
-      <w:pPr/>
       <w:r>
         <w:rPr>
           <w:b w:val="0"/>
@@ -5317,7 +5732,7 @@
           <w:rFonts w:ascii="Courier New" w:hAnsi="Courier New"/>
           <w:b w:val="0"/>
           <w:i w:val="0"/>
-          <w:sz w:val="18"/>
+          <w:sz w:val="19"/>
         </w:rPr>
         <w:t>read: world</w:t>
       </w:r>
@@ -5333,7 +5748,7 @@
           <w:rFonts w:ascii="Courier New" w:hAnsi="Courier New"/>
           <w:b w:val="0"/>
           <w:i w:val="0"/>
-          <w:sz w:val="18"/>
+          <w:sz w:val="19"/>
         </w:rPr>
         <w:t>write: group</w:t>
       </w:r>
@@ -5346,7 +5761,6 @@
       </w:r>
     </w:p>
     <w:p>
-      <w:pPr/>
       <w:r>
         <w:rPr>
           <w:b w:val="0"/>
@@ -5356,7 +5770,6 @@
       </w:r>
     </w:p>
     <w:p>
-      <w:pPr/>
       <w:r>
         <w:rPr>
           <w:b w:val="0"/>
@@ -5366,6 +5779,7 @@
       </w:r>
     </w:p>
     <w:p>
+      <w:bookmarkStart w:id="1026" w:name="s_8ce64a9b62362a383cd1237c"/>
       <w:pPr>
         <w:pStyle w:val="Heading2"/>
       </w:pPr>
@@ -5376,9 +5790,9 @@
         </w:rPr>
         <w:t>10.4 CSE inventory</w:t>
       </w:r>
+      <w:bookmarkEnd w:id="1026"/>
     </w:p>
     <w:p>
-      <w:pPr/>
       <w:r>
         <w:rPr>
           <w:b w:val="0"/>
@@ -5388,6 +5802,7 @@
       </w:r>
     </w:p>
     <w:p>
+      <w:bookmarkStart w:id="1027" w:name="s_50a93d0947a80b47ed02bf5d"/>
       <w:pPr>
         <w:pStyle w:val="Heading1"/>
       </w:pPr>
@@ -5398,9 +5813,9 @@
         </w:rPr>
         <w:t>11. User access</w:t>
       </w:r>
+      <w:bookmarkEnd w:id="1027"/>
     </w:p>
     <w:p>
-      <w:pPr/>
       <w:r>
         <w:rPr>
           <w:b w:val="0"/>
@@ -5411,16 +5826,13 @@
     </w:p>
     <w:p>
       <w:pPr>
-        <w:keepLines/>
-        <w:widowControl/>
+        <w:keepLines w:val="0"/>
         <w:spacing w:before="40" w:after="160" w:line="245" w:lineRule="auto"/>
         <w:ind w:left="115" w:right="43"/>
       </w:pPr>
       <w:r>
         <w:rPr>
           <w:rFonts w:ascii="Courier New" w:hAnsi="Courier New"/>
-          <w:b w:val="0"/>
-          <w:i w:val="0"/>
           <w:sz w:val="18"/>
         </w:rPr>
         <w:t>module load cse/&lt;compiler-surface&gt;</w:t>
@@ -5433,15 +5845,13 @@
     <w:p>
       <w:pPr>
         <w:keepNext/>
-        <w:keepLines/>
-        <w:spacing w:before="140" w:after="0"/>
         <w:jc w:val="center"/>
       </w:pPr>
       <w:r>
         <w:drawing>
           <wp:inline xmlns:a="http://schemas.openxmlformats.org/drawingml/2006/main" xmlns:pic="http://schemas.openxmlformats.org/drawingml/2006/picture">
             <wp:extent cx="6309360" cy="2782252"/>
-            <wp:docPr id="2" name="Picture 2" descr="Users select a compiler, choose Serial or MPI, and load a package. Foundation libraries are available automatically; Core tools are loaded through modules." title="cse-user-module-flow"/>
+            <wp:docPr id="2" name="Picture 2" descr="Users select a compiler, choose Serial or MPI, and load a package. Foundation libraries are available automatically; Core tools are loaded through modules."/>
             <wp:cNvGraphicFramePr>
               <a:graphicFrameLocks noChangeAspect="1"/>
             </wp:cNvGraphicFramePr>
@@ -5449,7 +5859,7 @@
               <a:graphicData uri="http://schemas.openxmlformats.org/drawingml/2006/picture">
                 <pic:pic>
                   <pic:nvPicPr>
-                    <pic:cNvPr id="0" name="cse-user-module-flow.png"/>
+                    <pic:cNvPr id="0" name="image.png"/>
                     <pic:cNvPicPr/>
                   </pic:nvPicPr>
                   <pic:blipFill>
@@ -5485,7 +5895,6 @@
       </w:r>
     </w:p>
     <w:p>
-      <w:pPr/>
       <w:r>
         <w:rPr>
           <w:b w:val="0"/>
@@ -5512,7 +5921,7 @@
           <w:rFonts w:ascii="Courier New" w:hAnsi="Courier New"/>
           <w:b w:val="0"/>
           <w:i w:val="0"/>
-          <w:sz w:val="18"/>
+          <w:sz w:val="19"/>
         </w:rPr>
         <w:t>module use</w:t>
       </w:r>
@@ -5525,7 +5934,6 @@
       </w:r>
     </w:p>
     <w:p>
-      <w:pPr/>
       <w:r>
         <w:rPr>
           <w:b w:val="0"/>
@@ -5538,7 +5946,7 @@
           <w:rFonts w:ascii="Courier New" w:hAnsi="Courier New"/>
           <w:b w:val="0"/>
           <w:i w:val="0"/>
-          <w:sz w:val="18"/>
+          <w:sz w:val="19"/>
         </w:rPr>
         <w:t>CSE_CC</w:t>
       </w:r>
@@ -5554,7 +5962,7 @@
           <w:rFonts w:ascii="Courier New" w:hAnsi="Courier New"/>
           <w:b w:val="0"/>
           <w:i w:val="0"/>
-          <w:sz w:val="18"/>
+          <w:sz w:val="19"/>
         </w:rPr>
         <w:t>CSE_CXX</w:t>
       </w:r>
@@ -5570,7 +5978,7 @@
           <w:rFonts w:ascii="Courier New" w:hAnsi="Courier New"/>
           <w:b w:val="0"/>
           <w:i w:val="0"/>
-          <w:sz w:val="18"/>
+          <w:sz w:val="19"/>
         </w:rPr>
         <w:t>CSE_FC</w:t>
       </w:r>
@@ -5586,7 +5994,7 @@
           <w:rFonts w:ascii="Courier New" w:hAnsi="Courier New"/>
           <w:b w:val="0"/>
           <w:i w:val="0"/>
-          <w:sz w:val="18"/>
+          <w:sz w:val="19"/>
         </w:rPr>
         <w:t>CSE_MPI_PROVIDER</w:t>
       </w:r>
@@ -5602,7 +6010,7 @@
           <w:rFonts w:ascii="Courier New" w:hAnsi="Courier New"/>
           <w:b w:val="0"/>
           <w:i w:val="0"/>
-          <w:sz w:val="18"/>
+          <w:sz w:val="19"/>
         </w:rPr>
         <w:t>CSE_MPI_VERSION</w:t>
       </w:r>
@@ -5618,7 +6026,7 @@
           <w:rFonts w:ascii="Courier New" w:hAnsi="Courier New"/>
           <w:b w:val="0"/>
           <w:i w:val="0"/>
-          <w:sz w:val="18"/>
+          <w:sz w:val="19"/>
         </w:rPr>
         <w:t>CSE_MPICC</w:t>
       </w:r>
@@ -5634,7 +6042,7 @@
           <w:rFonts w:ascii="Courier New" w:hAnsi="Courier New"/>
           <w:b w:val="0"/>
           <w:i w:val="0"/>
-          <w:sz w:val="18"/>
+          <w:sz w:val="19"/>
         </w:rPr>
         <w:t>CSE_MPICXX</w:t>
       </w:r>
@@ -5650,7 +6058,7 @@
           <w:rFonts w:ascii="Courier New" w:hAnsi="Courier New"/>
           <w:b w:val="0"/>
           <w:i w:val="0"/>
-          <w:sz w:val="18"/>
+          <w:sz w:val="19"/>
         </w:rPr>
         <w:t>CSE_MPIFC</w:t>
       </w:r>
@@ -5666,7 +6074,7 @@
           <w:rFonts w:ascii="Courier New" w:hAnsi="Courier New"/>
           <w:b w:val="0"/>
           <w:i w:val="0"/>
-          <w:sz w:val="18"/>
+          <w:sz w:val="19"/>
         </w:rPr>
         <w:t>PrgEnv</w:t>
       </w:r>
@@ -5679,7 +6087,6 @@
       </w:r>
     </w:p>
     <w:p>
-      <w:pPr/>
       <w:r>
         <w:rPr>
           <w:b w:val="0"/>
@@ -5692,7 +6099,7 @@
           <w:rFonts w:ascii="Courier New" w:hAnsi="Courier New"/>
           <w:b w:val="0"/>
           <w:i w:val="0"/>
-          <w:sz w:val="18"/>
+          <w:sz w:val="19"/>
         </w:rPr>
         <w:t>mpicc</w:t>
       </w:r>
@@ -5708,7 +6115,7 @@
           <w:rFonts w:ascii="Courier New" w:hAnsi="Courier New"/>
           <w:b w:val="0"/>
           <w:i w:val="0"/>
-          <w:sz w:val="18"/>
+          <w:sz w:val="19"/>
         </w:rPr>
         <w:t>mpicxx</w:t>
       </w:r>
@@ -5724,7 +6131,7 @@
           <w:rFonts w:ascii="Courier New" w:hAnsi="Courier New"/>
           <w:b w:val="0"/>
           <w:i w:val="0"/>
-          <w:sz w:val="18"/>
+          <w:sz w:val="19"/>
         </w:rPr>
         <w:t>mpifort</w:t>
       </w:r>
@@ -5740,7 +6147,7 @@
           <w:rFonts w:ascii="Courier New" w:hAnsi="Courier New"/>
           <w:b w:val="0"/>
           <w:i w:val="0"/>
-          <w:sz w:val="18"/>
+          <w:sz w:val="19"/>
         </w:rPr>
         <w:t>mpif90</w:t>
       </w:r>
@@ -5756,7 +6163,7 @@
           <w:rFonts w:ascii="Courier New" w:hAnsi="Courier New"/>
           <w:b w:val="0"/>
           <w:i w:val="0"/>
-          <w:sz w:val="18"/>
+          <w:sz w:val="19"/>
         </w:rPr>
         <w:t>mpif77</w:t>
       </w:r>
@@ -5772,7 +6179,7 @@
           <w:rFonts w:ascii="Courier New" w:hAnsi="Courier New"/>
           <w:b w:val="0"/>
           <w:i w:val="0"/>
-          <w:sz w:val="18"/>
+          <w:sz w:val="19"/>
         </w:rPr>
         <w:t>MPICH_*</w:t>
       </w:r>
@@ -5788,7 +6195,7 @@
           <w:rFonts w:ascii="Courier New" w:hAnsi="Courier New"/>
           <w:b w:val="0"/>
           <w:i w:val="0"/>
-          <w:sz w:val="18"/>
+          <w:sz w:val="19"/>
         </w:rPr>
         <w:t>PrgEnv-*</w:t>
       </w:r>
@@ -5801,7 +6208,6 @@
       </w:r>
     </w:p>
     <w:p>
-      <w:pPr/>
       <w:r>
         <w:rPr>
           <w:b w:val="0"/>
@@ -5811,7 +6217,6 @@
       </w:r>
     </w:p>
     <w:p>
-      <w:pPr/>
       <w:r>
         <w:rPr>
           <w:b w:val="0"/>
@@ -5821,6 +6226,7 @@
       </w:r>
     </w:p>
     <w:p>
+      <w:bookmarkStart w:id="1028" w:name="s_8db41299230418129b73207d"/>
       <w:pPr>
         <w:pStyle w:val="Heading2"/>
       </w:pPr>
@@ -5831,9 +6237,9 @@
         </w:rPr>
         <w:t>11.1 Fully qualified module aliases</w:t>
       </w:r>
+      <w:bookmarkEnd w:id="1028"/>
     </w:p>
     <w:p>
-      <w:pPr/>
       <w:r>
         <w:rPr>
           <w:b w:val="0"/>
@@ -5843,7 +6249,6 @@
       </w:r>
     </w:p>
     <w:p>
-      <w:pPr/>
       <w:r>
         <w:rPr>
           <w:b w:val="0"/>
@@ -5853,6 +6258,7 @@
       </w:r>
     </w:p>
     <w:p>
+      <w:bookmarkStart w:id="1029" w:name="s_2825bdc9c462f3a0bcc042fe"/>
       <w:pPr>
         <w:pStyle w:val="Heading1"/>
       </w:pPr>
@@ -5863,9 +6269,9 @@
         </w:rPr>
         <w:t>12. Changes, security events, and platform updates</w:t>
       </w:r>
+      <w:bookmarkEnd w:id="1029"/>
     </w:p>
     <w:p>
-      <w:pPr/>
       <w:r>
         <w:rPr>
           <w:b w:val="0"/>
@@ -5875,7 +6281,6 @@
       </w:r>
     </w:p>
     <w:p>
-      <w:pPr/>
       <w:r>
         <w:rPr>
           <w:b w:val="0"/>
@@ -5885,7 +6290,6 @@
       </w:r>
     </w:p>
     <w:p>
-      <w:pPr/>
       <w:r>
         <w:rPr>
           <w:b w:val="0"/>
@@ -6199,7 +6603,7 @@
     </w:tbl>
     <w:p>
       <w:pPr>
-        <w:spacing w:after="0" w:before="0" w:line="80" w:lineRule="exact"/>
+        <w:spacing w:after="60" w:before="0"/>
       </w:pPr>
       <w:r>
         <w:rPr>
@@ -6208,7 +6612,6 @@
       </w:r>
     </w:p>
     <w:p>
-      <w:pPr/>
       <w:r>
         <w:rPr>
           <w:b w:val="0"/>
@@ -6218,7 +6621,6 @@
       </w:r>
     </w:p>
     <w:p>
-      <w:pPr/>
       <w:r>
         <w:rPr>
           <w:b w:val="0"/>
@@ -6228,6 +6630,7 @@
       </w:r>
     </w:p>
     <w:p>
+      <w:bookmarkStart w:id="1030" w:name="s_ca5ee6ad1411b47adf344c93"/>
       <w:pPr>
         <w:pStyle w:val="Heading1"/>
       </w:pPr>
@@ -6238,9 +6641,9 @@
         </w:rPr>
         <w:t>13. Retention, recovery, and rollback</w:t>
       </w:r>
+      <w:bookmarkEnd w:id="1030"/>
     </w:p>
     <w:p>
-      <w:pPr/>
       <w:r>
         <w:rPr>
           <w:b w:val="0"/>
@@ -6254,9 +6657,8 @@
         <w:pStyle w:val="ListParagraph"/>
         <w:numPr>
           <w:ilvl w:val="0"/>
-          <w:numId w:val="11"/>
+          <w:numId w:val="13"/>
         </w:numPr>
-        <w:ind w:left="360"/>
       </w:pPr>
       <w:r>
         <w:rPr>
@@ -6271,9 +6673,8 @@
         <w:pStyle w:val="ListParagraph"/>
         <w:numPr>
           <w:ilvl w:val="0"/>
-          <w:numId w:val="11"/>
+          <w:numId w:val="13"/>
         </w:numPr>
-        <w:ind w:left="360"/>
       </w:pPr>
       <w:r>
         <w:rPr>
@@ -6288,9 +6689,8 @@
         <w:pStyle w:val="ListParagraph"/>
         <w:numPr>
           <w:ilvl w:val="0"/>
-          <w:numId w:val="11"/>
+          <w:numId w:val="13"/>
         </w:numPr>
-        <w:ind w:left="360"/>
       </w:pPr>
       <w:r>
         <w:rPr>
@@ -6305,9 +6705,8 @@
         <w:pStyle w:val="ListParagraph"/>
         <w:numPr>
           <w:ilvl w:val="0"/>
-          <w:numId w:val="11"/>
+          <w:numId w:val="13"/>
         </w:numPr>
-        <w:ind w:left="360"/>
       </w:pPr>
       <w:r>
         <w:rPr>
@@ -6322,9 +6721,8 @@
         <w:pStyle w:val="ListParagraph"/>
         <w:numPr>
           <w:ilvl w:val="0"/>
-          <w:numId w:val="11"/>
+          <w:numId w:val="13"/>
         </w:numPr>
-        <w:ind w:left="360"/>
       </w:pPr>
       <w:r>
         <w:rPr>
@@ -6335,7 +6733,6 @@
       </w:r>
     </w:p>
     <w:p>
-      <w:pPr/>
       <w:r>
         <w:rPr>
           <w:b w:val="0"/>
@@ -6345,7 +6742,6 @@
       </w:r>
     </w:p>
     <w:p>
-      <w:pPr/>
       <w:r>
         <w:rPr>
           <w:b w:val="0"/>
@@ -6355,6 +6751,7 @@
       </w:r>
     </w:p>
     <w:p>
+      <w:bookmarkStart w:id="1031" w:name="s_8dcb18bafdfaece84b33e23b"/>
       <w:pPr>
         <w:pStyle w:val="Heading1"/>
       </w:pPr>
@@ -6365,9 +6762,9 @@
         </w:rPr>
         <w:t>14. Required release record</w:t>
       </w:r>
+      <w:bookmarkEnd w:id="1031"/>
     </w:p>
     <w:p>
-      <w:pPr/>
       <w:r>
         <w:rPr>
           <w:b w:val="0"/>
@@ -6377,7 +6774,6 @@
       </w:r>
     </w:p>
     <w:p>
-      <w:pPr/>
       <w:r>
         <w:rPr>
           <w:b w:val="0"/>
@@ -6387,6 +6783,7 @@
       </w:r>
     </w:p>
     <w:p>
+      <w:bookmarkStart w:id="1032" w:name="s_5ab3f0339992adc33b000b1c"/>
       <w:pPr>
         <w:pStyle w:val="Heading1"/>
       </w:pPr>
@@ -6397,9 +6794,9 @@
         </w:rPr>
         <w:t>Appendix A. Terms</w:t>
       </w:r>
+      <w:bookmarkEnd w:id="1032"/>
     </w:p>
     <w:p>
-      <w:pPr/>
       <w:r>
         <w:rPr>
           <w:b w:val="0"/>
@@ -6409,7 +6806,6 @@
       </w:r>
     </w:p>
     <w:p>
-      <w:pPr/>
       <w:r>
         <w:rPr>
           <w:b/>
@@ -6440,7 +6836,6 @@
       </w:r>
     </w:p>
     <w:p>
-      <w:pPr/>
       <w:r>
         <w:rPr>
           <w:b/>
@@ -6457,7 +6852,6 @@
       </w:r>
     </w:p>
     <w:p>
-      <w:pPr/>
       <w:r>
         <w:rPr>
           <w:b/>
@@ -6502,7 +6896,6 @@
       </w:r>
     </w:p>
     <w:p>
-      <w:pPr/>
       <w:r>
         <w:rPr>
           <w:b/>
@@ -6547,7 +6940,6 @@
       </w:r>
     </w:p>
     <w:p>
-      <w:pPr/>
       <w:r>
         <w:rPr>
           <w:b/>
@@ -6831,6 +7223,34 @@
   </w:abstractNum>
   <w:num w:numId="11">
     <w:abstractNumId w:val="10"/>
+  </w:num>
+  <w:abstractNum w:abstractNumId="11">
+    <w:lvl w:ilvl="0">
+      <w:start w:val="1"/>
+      <w:numFmt w:val="bullet"/>
+      <w:lvlText w:val="•"/>
+      <w:lvlJc w:val="left"/>
+      <w:pPr>
+        <w:ind w:left="360" w:hanging="260"/>
+      </w:pPr>
+    </w:lvl>
+  </w:abstractNum>
+  <w:num w:numId="12">
+    <w:abstractNumId w:val="11"/>
+  </w:num>
+  <w:abstractNum w:abstractNumId="12">
+    <w:lvl w:ilvl="0">
+      <w:start w:val="1"/>
+      <w:numFmt w:val="bullet"/>
+      <w:lvlText w:val="•"/>
+      <w:lvlJc w:val="left"/>
+      <w:pPr>
+        <w:ind w:left="360" w:hanging="260"/>
+      </w:pPr>
+    </w:lvl>
+  </w:abstractNum>
+  <w:num w:numId="13">
+    <w:abstractNumId w:val="12"/>
   </w:num>
 </w:numbering>
 </file>
@@ -7141,7 +7561,7 @@
       <w:bCs/>
       <w:i/>
       <w:iCs/>
-      <w:color w:val="4F81BD" w:themeColor="accent1"/>
+      <w:color w:val="000000"/>
     </w:rPr>
   </w:style>
   <w:style w:type="paragraph" w:styleId="Heading5">
@@ -7394,7 +7814,7 @@
       <w:rFonts w:asciiTheme="majorHAnsi" w:eastAsiaTheme="majorEastAsia" w:hAnsiTheme="majorHAnsi" w:cstheme="majorBidi"/>
       <w:i/>
       <w:iCs/>
-      <w:color w:val="4F81BD" w:themeColor="accent1"/>
+      <w:color w:val="000000"/>
       <w:spacing w:val="15"/>
       <w:sz w:val="24"/>
       <w:szCs w:val="24"/>

</xml_diff>